<commit_message>
Spec v0.3: 8-bit, voltage-mode (500mVpp diff, VCM 350mV), DNL +-0.3 LSB incl VCO error
</commit_message>
<xml_diff>
--- a/doc/HYP_Gen1_CDR_DAC_Spec.docx
+++ b/doc/HYP_Gen1_CDR_DAC_Spec.docx
@@ -54,7 +54,7 @@
           <w:color w:val="505050"/>
           <w:sz w:val="28"/>
         </w:rPr>
-        <w:t>9-Bit Fully Thermometric Differential Current-Steering DAC</w:t>
+        <w:t>8-Bit Fully Thermometric Differential Current-Steering DAC</w:t>
       </w:r>
     </w:p>
     <w:p/>
@@ -129,7 +129,7 @@
                 <w:b w:val="0"/>
                 <w:sz w:val="22"/>
               </w:rPr>
-              <w:t>0.1 (Draft)</w:t>
+              <w:t>0.3 (Draft)</w:t>
             </w:r>
           </w:p>
         </w:tc>
@@ -161,7 +161,7 @@
                 <w:b w:val="0"/>
                 <w:sz w:val="22"/>
               </w:rPr>
-              <w:t>2026-07-12</w:t>
+              <w:t>2026-10-18</w:t>
             </w:r>
           </w:p>
         </w:tc>
@@ -412,7 +412,7 @@
                 <w:b w:val="0"/>
                 <w:sz w:val="20"/>
               </w:rPr>
-              <w:t>2026-07-12</w:t>
+              <w:t>2026-07-20</w:t>
             </w:r>
           </w:p>
         </w:tc>
@@ -443,6 +443,68 @@
                 <w:sz w:val="20"/>
               </w:rPr>
               <w:t>Updated to 9-bit (511 codes); added INL/DNL formulas (sec 4.2)</w:t>
+            </w:r>
+          </w:p>
+        </w:tc>
+      </w:tr>
+      <w:tr>
+        <w:tc>
+          <w:tcPr>
+            <w:tcW w:type="dxa" w:w="2268"/>
+          </w:tcPr>
+          <w:p>
+            <w:r/>
+            <w:r>
+              <w:rPr>
+                <w:b w:val="0"/>
+                <w:sz w:val="20"/>
+              </w:rPr>
+              <w:t>0.3</w:t>
+            </w:r>
+          </w:p>
+        </w:tc>
+        <w:tc>
+          <w:tcPr>
+            <w:tcW w:type="dxa" w:w="2268"/>
+          </w:tcPr>
+          <w:p>
+            <w:r/>
+            <w:r>
+              <w:rPr>
+                <w:b w:val="0"/>
+                <w:sz w:val="20"/>
+              </w:rPr>
+              <w:t>2026-10-18</w:t>
+            </w:r>
+          </w:p>
+        </w:tc>
+        <w:tc>
+          <w:tcPr>
+            <w:tcW w:type="dxa" w:w="2268"/>
+          </w:tcPr>
+          <w:p>
+            <w:r/>
+            <w:r>
+              <w:rPr>
+                <w:b w:val="0"/>
+                <w:sz w:val="20"/>
+              </w:rPr>
+              <w:t>[Author]</w:t>
+            </w:r>
+          </w:p>
+        </w:tc>
+        <w:tc>
+          <w:tcPr>
+            <w:tcW w:type="dxa" w:w="2268"/>
+          </w:tcPr>
+          <w:p>
+            <w:r/>
+            <w:r>
+              <w:rPr>
+                <w:b w:val="0"/>
+                <w:sz w:val="20"/>
+              </w:rPr>
+              <w:t>8-bit (255 units); spec in voltages: 500 mVpp diff FS, VCM 350 mV; DNL ±0.3 LSB incl. VCO error; sigma targets filled</w:t>
             </w:r>
           </w:p>
         </w:tc>
@@ -1145,9 +1207,11 @@
     </w:p>
     <w:p>
       <w:r>
-        <w:t>Topology: 9-bit fully thermometric, differential current-steering DAC.</w:t>
+        <w:t>Topology: 8-bit fully thermometric, differential current-steering DAC.</w:t>
         <w:br/>
-        <w:t>Number of unit elements: N = 2^9 - 1 = 511 unit current sources.</w:t>
+        <w:t>Number of unit elements: N = 2^8 - 1 = 255 unit current sources.</w:t>
+        <w:br/>
+        <w:t>Number of codes: 256 (0 … 255).</w:t>
       </w:r>
     </w:p>
     <w:p>
@@ -1380,7 +1444,7 @@
                 <w:b w:val="0"/>
                 <w:sz w:val="20"/>
               </w:rPr>
-              <w:t>N</w:t>
+              <w:t>B</w:t>
             </w:r>
           </w:p>
         </w:tc>
@@ -1410,7 +1474,7 @@
                 <w:b w:val="0"/>
                 <w:sz w:val="20"/>
               </w:rPr>
-              <w:t>9</w:t>
+              <w:t>8</w:t>
             </w:r>
           </w:p>
         </w:tc>
@@ -1455,7 +1519,7 @@
                 <w:b w:val="0"/>
                 <w:sz w:val="20"/>
               </w:rPr>
-              <w:t>Thermometric</w:t>
+              <w:t>Fully thermometric</w:t>
             </w:r>
           </w:p>
         </w:tc>
@@ -1517,7 +1581,7 @@
                 <w:b w:val="0"/>
                 <w:sz w:val="20"/>
               </w:rPr>
-              <w:t>511</w:t>
+              <w:t>256</w:t>
             </w:r>
           </w:p>
         </w:tc>
@@ -1562,7 +1626,7 @@
                 <w:b w:val="0"/>
                 <w:sz w:val="20"/>
               </w:rPr>
-              <w:t>2^N - 1</w:t>
+              <w:t>0 … 255 (255 unit steps)</w:t>
             </w:r>
           </w:p>
         </w:tc>
@@ -1579,7 +1643,7 @@
                 <w:b w:val="0"/>
                 <w:sz w:val="20"/>
               </w:rPr>
-              <w:t>Full-scale current</w:t>
+              <w:t>Full-scale output (diff)</w:t>
             </w:r>
           </w:p>
         </w:tc>
@@ -1594,7 +1658,7 @@
                 <w:b w:val="0"/>
                 <w:sz w:val="20"/>
               </w:rPr>
-              <w:t>I_FS</w:t>
+              <w:t>V_FS</w:t>
             </w:r>
           </w:p>
         </w:tc>
@@ -1623,7 +1687,7 @@
                 <w:b w:val="0"/>
                 <w:sz w:val="20"/>
               </w:rPr>
-              <w:t>10.02</w:t>
+              <w:t>500</w:t>
             </w:r>
           </w:p>
         </w:tc>
@@ -1652,7 +1716,7 @@
                 <w:b w:val="0"/>
                 <w:sz w:val="20"/>
               </w:rPr>
-              <w:t>mA</w:t>
+              <w:t>mVpp</w:t>
             </w:r>
           </w:p>
         </w:tc>
@@ -1667,7 +1731,7 @@
                 <w:b w:val="0"/>
                 <w:sz w:val="20"/>
               </w:rPr>
-              <w:t>511 × 19.6 µA</w:t>
+              <w:t>Differential peak-to-peak (±250 mV)</w:t>
             </w:r>
           </w:p>
         </w:tc>
@@ -1684,7 +1748,7 @@
                 <w:b w:val="0"/>
                 <w:sz w:val="20"/>
               </w:rPr>
-              <w:t>LSB current</w:t>
+              <w:t>LSB voltage (diff)</w:t>
             </w:r>
           </w:p>
         </w:tc>
@@ -1699,7 +1763,7 @@
                 <w:b w:val="0"/>
                 <w:sz w:val="20"/>
               </w:rPr>
-              <w:t>I_LSB</w:t>
+              <w:t>V_LSB</w:t>
             </w:r>
           </w:p>
         </w:tc>
@@ -1728,7 +1792,7 @@
                 <w:b w:val="0"/>
                 <w:sz w:val="20"/>
               </w:rPr>
-              <w:t>19.6</w:t>
+              <w:t>1.961</w:t>
             </w:r>
           </w:p>
         </w:tc>
@@ -1757,7 +1821,7 @@
                 <w:b w:val="0"/>
                 <w:sz w:val="20"/>
               </w:rPr>
-              <w:t>µA</w:t>
+              <w:t>mV</w:t>
             </w:r>
           </w:p>
         </w:tc>
@@ -1772,7 +1836,7 @@
                 <w:b w:val="0"/>
                 <w:sz w:val="20"/>
               </w:rPr>
-              <w:t>I_FS / 511</w:t>
+              <w:t>V_FS / 255</w:t>
             </w:r>
           </w:p>
         </w:tc>
@@ -1789,7 +1853,7 @@
                 <w:b w:val="0"/>
                 <w:sz w:val="20"/>
               </w:rPr>
-              <w:t>DNL</w:t>
+              <w:t>Output common-mode</w:t>
             </w:r>
           </w:p>
         </w:tc>
@@ -1804,7 +1868,7 @@
                 <w:b w:val="0"/>
                 <w:sz w:val="20"/>
               </w:rPr>
-              <w:t>DNL</w:t>
+              <w:t>V_CM</w:t>
             </w:r>
           </w:p>
         </w:tc>
@@ -1833,6 +1897,7 @@
                 <w:b w:val="0"/>
                 <w:sz w:val="20"/>
               </w:rPr>
+              <w:t>350</w:t>
             </w:r>
           </w:p>
         </w:tc>
@@ -1847,7 +1912,6 @@
                 <w:b w:val="0"/>
                 <w:sz w:val="20"/>
               </w:rPr>
-              <w:t>±0.5</w:t>
             </w:r>
           </w:p>
         </w:tc>
@@ -1862,7 +1926,7 @@
                 <w:b w:val="0"/>
                 <w:sz w:val="20"/>
               </w:rPr>
-              <w:t>LSB</w:t>
+              <w:t>mV</w:t>
             </w:r>
           </w:p>
         </w:tc>
@@ -1877,7 +1941,6 @@
                 <w:b w:val="0"/>
                 <w:sz w:val="20"/>
               </w:rPr>
-              <w:t>Target yield TBD</w:t>
             </w:r>
           </w:p>
         </w:tc>
@@ -1894,7 +1957,7 @@
                 <w:b w:val="0"/>
                 <w:sz w:val="20"/>
               </w:rPr>
-              <w:t>INL</w:t>
+              <w:t>DNL</w:t>
             </w:r>
           </w:p>
         </w:tc>
@@ -1909,7 +1972,7 @@
                 <w:b w:val="0"/>
                 <w:sz w:val="20"/>
               </w:rPr>
-              <w:t>INL</w:t>
+              <w:t>DNL</w:t>
             </w:r>
           </w:p>
         </w:tc>
@@ -1924,6 +1987,7 @@
                 <w:b w:val="0"/>
                 <w:sz w:val="20"/>
               </w:rPr>
+              <w:t>-0.3</w:t>
             </w:r>
           </w:p>
         </w:tc>
@@ -1952,6 +2016,7 @@
                 <w:b w:val="0"/>
                 <w:sz w:val="20"/>
               </w:rPr>
+              <w:t>+0.3</w:t>
             </w:r>
           </w:p>
         </w:tc>
@@ -1981,6 +2046,7 @@
                 <w:b w:val="0"/>
                 <w:sz w:val="20"/>
               </w:rPr>
+              <w:t>Including VCO error</w:t>
             </w:r>
           </w:p>
         </w:tc>
@@ -1997,7 +2063,7 @@
                 <w:b w:val="0"/>
                 <w:sz w:val="20"/>
               </w:rPr>
-              <w:t>Current source mismatch</w:t>
+              <w:t>INL</w:t>
             </w:r>
           </w:p>
         </w:tc>
@@ -2012,7 +2078,7 @@
                 <w:b w:val="0"/>
                 <w:sz w:val="20"/>
               </w:rPr>
-              <w:t>σ(Iu)/Iu</w:t>
+              <w:t>INL</w:t>
             </w:r>
           </w:p>
         </w:tc>
@@ -2069,7 +2135,7 @@
                 <w:b w:val="0"/>
                 <w:sz w:val="20"/>
               </w:rPr>
-              <w:t>%</w:t>
+              <w:t>LSB</w:t>
             </w:r>
           </w:p>
         </w:tc>
@@ -2084,7 +2150,6 @@
                 <w:b w:val="0"/>
                 <w:sz w:val="20"/>
               </w:rPr>
-              <w:t>See matching analysis</w:t>
             </w:r>
           </w:p>
         </w:tc>
@@ -2101,7 +2166,7 @@
                 <w:b w:val="0"/>
                 <w:sz w:val="20"/>
               </w:rPr>
-              <w:t>Output compliance</w:t>
+              <w:t>Unit mismatch</w:t>
             </w:r>
           </w:p>
         </w:tc>
@@ -2116,7 +2181,7 @@
                 <w:b w:val="0"/>
                 <w:sz w:val="20"/>
               </w:rPr>
-              <w:t>V_comp</w:t>
+              <w:t>σ(ΔV_u)/ΔV_u</w:t>
             </w:r>
           </w:p>
         </w:tc>
@@ -2159,6 +2224,7 @@
                 <w:b w:val="0"/>
                 <w:sz w:val="20"/>
               </w:rPr>
+              <w:t>7.3</w:t>
             </w:r>
           </w:p>
         </w:tc>
@@ -2173,7 +2239,7 @@
                 <w:b w:val="0"/>
                 <w:sz w:val="20"/>
               </w:rPr>
-              <w:t>V</w:t>
+              <w:t>%</w:t>
             </w:r>
           </w:p>
         </w:tc>
@@ -2188,6 +2254,7 @@
                 <w:b w:val="0"/>
                 <w:sz w:val="20"/>
               </w:rPr>
+              <w:t>99% yield @ |DNL|&lt;0.3 (sec 4.2.4)</w:t>
             </w:r>
           </w:p>
         </w:tc>
@@ -2617,7 +2684,7 @@
                 <w:b w:val="0"/>
                 <w:sz w:val="20"/>
               </w:rPr>
-              <w:t>Output noise (integrated)</w:t>
+              <w:t>Output noise (integrated, diff)</w:t>
             </w:r>
           </w:p>
         </w:tc>
@@ -2632,7 +2699,7 @@
                 <w:b w:val="0"/>
                 <w:sz w:val="20"/>
               </w:rPr>
-              <w:t>I_n</w:t>
+              <w:t>V_n</w:t>
             </w:r>
           </w:p>
         </w:tc>
@@ -2689,7 +2756,7 @@
                 <w:b w:val="0"/>
                 <w:sz w:val="20"/>
               </w:rPr>
-              <w:t>pA_rms</w:t>
+              <w:t>µV_rms</w:t>
             </w:r>
           </w:p>
         </w:tc>
@@ -2928,7 +2995,7 @@
     </w:p>
     <w:p>
       <w:r>
-        <w:t>For a fully thermometric differential current-steering DAC with N = 2^B - 1 unit current sources (B = 9, N = 511):</w:t>
+        <w:t>For a fully thermometric differential current-steering DAC with N = 2^B - 1 unit elements (B = 8, N = 255). All quantities are differential output voltages: V_diff = V_outp - V_outn, V_FS = 500 mVpp, V_LSB = V_FS / 255 ≈ 1.961 mV.</w:t>
       </w:r>
     </w:p>
     <w:p>
@@ -2947,24 +3014,24 @@
         <w:t>Definition (endpoint-fitted):</w:t>
         <w:br/>
         <w:br/>
-        <w:t xml:space="preserve">    DNL(k) = [V_out(k+1) - V_out(k)] / LSB_actual  -  1</w:t>
+        <w:t xml:space="preserve">    DNL(k) = [V_diff(k+1) - V_diff(k)] / V_LSB_actual  -  1</w:t>
         <w:br/>
         <w:br/>
         <w:t>where:</w:t>
         <w:br/>
-        <w:t xml:space="preserve">    LSB_actual = [V_out(N) - V_out(0)] / N</w:t>
+        <w:t xml:space="preserve">    V_LSB_actual = [V_diff(N) - V_diff(0)] / N</w:t>
         <w:br/>
         <w:br/>
-        <w:t>For a fully thermometric DAC, each code transition activates exactly one unit current source. Therefore:</w:t>
+        <w:t>For a fully thermometric DAC, each code transition activates exactly one unit element. Therefore:</w:t>
         <w:br/>
         <w:br/>
-        <w:t xml:space="preserve">    DNL(k) = [I_unit(k) - I_avg] / I_avg</w:t>
+        <w:t xml:space="preserve">    DNL(k) = [ΔV_u(k) - ΔV_avg] / ΔV_avg</w:t>
         <w:br/>
         <w:br/>
-        <w:t>where I_unit(k) is the current of the k-th unit source and I_avg is the mean of all N unit sources.</w:t>
+        <w:t>where ΔV_u(k) is the differential output step of the k-th unit element and ΔV_avg is the mean step of all N units.</w:t>
         <w:br/>
         <w:br/>
-        <w:t>Specification: |DNL| &lt; 0.5 LSB (guarantees monotonicity)</w:t>
+        <w:t>Specification: |DNL| &lt; 0.3 LSB, including VCO error (guarantees monotonicity)</w:t>
       </w:r>
     </w:p>
     <w:p>
@@ -2983,21 +3050,13 @@
         <w:t>Definition (endpoint-fitted):</w:t>
         <w:br/>
         <w:br/>
-        <w:t xml:space="preserve">    INL(k) = [V_out(k) - V_out(0)] / LSB_actual  -  k</w:t>
+        <w:t xml:space="preserve">    INL(k) = [V_diff(k) - V_diff(0)] / V_LSB_actual  -  k</w:t>
         <w:br/>
         <w:br/>
         <w:t>Equivalently, INL is the cumulative sum of DNL:</w:t>
         <w:br/>
         <w:br/>
         <w:t xml:space="preserve">    INL(k) = Σ_{i=0}^{k-1} DNL(i)</w:t>
-        <w:br/>
-        <w:br/>
-        <w:t>For a differential DAC with output V_diff = I_diff × R_L:</w:t>
-        <w:br/>
-        <w:br/>
-        <w:t xml:space="preserve">    INL(k) = [V_diff(k) - V_diff(0)] / LSB_actual  -  k</w:t>
-        <w:br/>
-        <w:t xml:space="preserve">    LSB_actual = [V_diff(N) - V_diff(0)] / N</w:t>
       </w:r>
     </w:p>
     <w:p>
@@ -3050,15 +3109,18 @@
         <w:t xml:space="preserve">    σ_rel = DNL_target / Φ⁻¹[(1 + Y^(1/N)) / 2]</w:t>
         <w:br/>
         <w:br/>
-        <w:t>For N = 511, |DNL| &lt; 0.5 LSB:</w:t>
+        <w:t>For N = 255, |DNL| &lt; 0.3 LSB:</w:t>
         <w:br/>
-        <w:t xml:space="preserve">  • 90% yield → σ_rel ≤ TBD %</w:t>
+        <w:t xml:space="preserve">  • 90% yield → σ_rel ≤ 8.50 %</w:t>
         <w:br/>
-        <w:t xml:space="preserve">  • 95% yield → σ_rel ≤ TBD %</w:t>
+        <w:t xml:space="preserve">  • 95% yield → σ_rel ≤ 8.07 %</w:t>
         <w:br/>
-        <w:t xml:space="preserve">  • 99% yield → σ_rel ≤ TBD %</w:t>
+        <w:t xml:space="preserve">  • 99% yield → σ_rel ≤ 7.30 %</w:t>
         <w:br/>
-        <w:t xml:space="preserve">  • 3σ (99.7%) yield → σ_rel ≤ TBD %</w:t>
+        <w:t xml:space="preserve">  • 3σ (99.7%) yield → σ_rel ≤ 6.85 %</w:t>
+        <w:br/>
+        <w:br/>
+        <w:t>Note: these assume the whole 0.3 LSB budget goes to DAC mismatch. The VCO error share must be subtracted once known.</w:t>
       </w:r>
     </w:p>
     <w:p>
@@ -3074,15 +3136,15 @@
         <w:t>Based on Monte Carlo analysis (see dac_sigma_vs_dnl.py):</w:t>
         <w:br/>
         <w:br/>
-        <w:t>For |DNL| &lt; 0.5 LSB with 511 unit elements:</w:t>
+        <w:t>For |DNL| &lt; 0.3 LSB with 255 unit elements:</w:t>
         <w:br/>
-        <w:t xml:space="preserve">  • 90% yield → σ_rel ≤ TBD %</w:t>
+        <w:t xml:space="preserve">  • 90% yield → σ_rel ≤ 8.50 %</w:t>
         <w:br/>
-        <w:t xml:space="preserve">  • 95% yield → σ_rel ≤ TBD %</w:t>
+        <w:t xml:space="preserve">  • 95% yield → σ_rel ≤ 8.07 %</w:t>
         <w:br/>
-        <w:t xml:space="preserve">  • 99% yield → σ_rel ≤ TBD %</w:t>
+        <w:t xml:space="preserve">  • 99% yield → σ_rel ≤ 7.30 %</w:t>
         <w:br/>
-        <w:t xml:space="preserve">  • 99.7% yield → σ_rel ≤ TBD %</w:t>
+        <w:t xml:space="preserve">  • 99.7% yield → σ_rel ≤ 6.85 %</w:t>
       </w:r>
     </w:p>
     <w:p>
@@ -3090,7 +3152,7 @@
         <w:pStyle w:val="Heading2"/>
       </w:pPr>
       <w:r>
-        <w:t>4.3 Noise Budget</w:t>
+        <w:t>4.4 Noise Budget</w:t>
       </w:r>
     </w:p>
     <w:p>
@@ -3103,7 +3165,7 @@
         <w:pStyle w:val="Heading2"/>
       </w:pPr>
       <w:r>
-        <w:t>4.4 Power Budget</w:t>
+        <w:t>4.5 Power Budget</w:t>
       </w:r>
     </w:p>
     <w:p>
@@ -3139,7 +3201,7 @@
         <w:t>Reference system_questions.md Q1–Q9 for open decisions.]</w:t>
         <w:br/>
         <w:br/>
-        <w:t>CODE[8:0]: 9-bit thermometer state (511 codes)</w:t>
+        <w:t>CODE[7:0]: 8-bit code (256 codes, 0 … 255)</w:t>
       </w:r>
     </w:p>
     <w:p>
@@ -3427,7 +3489,7 @@
                 <w:b w:val="0"/>
                 <w:sz w:val="20"/>
               </w:rPr>
-              <w:t>CODE[8:0]</w:t>
+              <w:t>CODE[7:0]</w:t>
             </w:r>
           </w:p>
         </w:tc>
@@ -3457,7 +3519,7 @@
                 <w:b w:val="0"/>
                 <w:sz w:val="20"/>
               </w:rPr>
-              <w:t>9</w:t>
+              <w:t>8</w:t>
             </w:r>
           </w:p>
         </w:tc>
@@ -3472,7 +3534,7 @@
                 <w:b w:val="0"/>
                 <w:sz w:val="20"/>
               </w:rPr>
-              <w:t>Current DAC thermometer code (optional readback)</w:t>
+              <w:t>Current DAC code (optional readback)</w:t>
             </w:r>
           </w:p>
         </w:tc>
@@ -3635,7 +3697,7 @@
     </w:p>
     <w:p>
       <w:r>
-        <w:t>[Define initial DAC code after reset: mid-code (64), min (0), or programmable.</w:t>
+        <w:t>[Define initial DAC code after reset: mid-code (128), min (0), or programmable.</w:t>
         <w:br/>
         <w:t>Reference system_questions.md Q4.]</w:t>
       </w:r>
@@ -3650,7 +3712,7 @@
     </w:p>
     <w:p>
       <w:r>
-        <w:t>[Define behavior at code 0 and 127: clip, flag, or both.</w:t>
+        <w:t>[Define behavior at code 0 and 255: clip, flag, or both.</w:t>
         <w:br/>
         <w:t>Reference system_questions.md Q5.]</w:t>
       </w:r>
@@ -3782,7 +3844,7 @@
                 <w:b w:val="0"/>
                 <w:sz w:val="20"/>
               </w:rPr>
-              <w:t>UP/DN pulse to current change</w:t>
+              <w:t>UP/DN pulse to output voltage change</w:t>
             </w:r>
           </w:p>
         </w:tc>
@@ -3963,7 +4025,7 @@
                 <w:b w:val="0"/>
                 <w:sz w:val="20"/>
               </w:rPr>
-              <w:t>Full-scale settling (0 → 127)</w:t>
+              <w:t>Full-scale settling (0 → 255)</w:t>
             </w:r>
           </w:p>
         </w:tc>
@@ -4246,7 +4308,7 @@
                 <w:b w:val="0"/>
                 <w:sz w:val="20"/>
               </w:rPr>
-              <w:t>&lt; 0.5 LSB</w:t>
+              <w:t>&lt; ±0.3 LSB</w:t>
             </w:r>
           </w:p>
         </w:tc>
@@ -4261,6 +4323,7 @@
                 <w:b w:val="0"/>
                 <w:sz w:val="20"/>
               </w:rPr>
+              <w:t>Including VCO error</w:t>
             </w:r>
           </w:p>
         </w:tc>
@@ -4338,7 +4401,7 @@
                 <w:b w:val="0"/>
                 <w:sz w:val="20"/>
               </w:rPr>
-              <w:t>Full-scale current</w:t>
+              <w:t>Full-scale voltage</w:t>
             </w:r>
           </w:p>
         </w:tc>
@@ -4353,7 +4416,7 @@
                 <w:b w:val="0"/>
                 <w:sz w:val="20"/>
               </w:rPr>
-              <w:t>Force code 511, measure I_out</w:t>
+              <w:t>Codes 0 and 255, measure V_diff</w:t>
             </w:r>
           </w:p>
         </w:tc>
@@ -4368,7 +4431,68 @@
                 <w:b w:val="0"/>
                 <w:sz w:val="20"/>
               </w:rPr>
-              <w:t>TBD</w:t>
+              <w:t>500 mVpp diff</w:t>
+            </w:r>
+          </w:p>
+        </w:tc>
+        <w:tc>
+          <w:tcPr>
+            <w:tcW w:type="dxa" w:w="2268"/>
+          </w:tcPr>
+          <w:p>
+            <w:r/>
+            <w:r>
+              <w:rPr>
+                <w:b w:val="0"/>
+                <w:sz w:val="20"/>
+              </w:rPr>
+            </w:r>
+          </w:p>
+        </w:tc>
+      </w:tr>
+      <w:tr>
+        <w:tc>
+          <w:tcPr>
+            <w:tcW w:type="dxa" w:w="2268"/>
+          </w:tcPr>
+          <w:p>
+            <w:r/>
+            <w:r>
+              <w:rPr>
+                <w:b w:val="0"/>
+                <w:sz w:val="20"/>
+              </w:rPr>
+              <w:t>Common-mode voltage</w:t>
+            </w:r>
+          </w:p>
+        </w:tc>
+        <w:tc>
+          <w:tcPr>
+            <w:tcW w:type="dxa" w:w="2268"/>
+          </w:tcPr>
+          <w:p>
+            <w:r/>
+            <w:r>
+              <w:rPr>
+                <w:b w:val="0"/>
+                <w:sz w:val="20"/>
+              </w:rPr>
+              <w:t>Mid-code, measure V_CM</w:t>
+            </w:r>
+          </w:p>
+        </w:tc>
+        <w:tc>
+          <w:tcPr>
+            <w:tcW w:type="dxa" w:w="2268"/>
+          </w:tcPr>
+          <w:p>
+            <w:r/>
+            <w:r>
+              <w:rPr>
+                <w:b w:val="0"/>
+                <w:sz w:val="20"/>
+              </w:rPr>
+              <w:t>350 mV</w:t>
             </w:r>
           </w:p>
         </w:tc>

</xml_diff>

<commit_message>
Spec v0.4: R_L, CM/gain tol, 2 supplies, power split, settling 2tau, update rate, glitch, temp, C_L, VCO DNL share; remove mismatch targets
</commit_message>
<xml_diff>
--- a/doc/HYP_Gen1_CDR_DAC_Spec.docx
+++ b/doc/HYP_Gen1_CDR_DAC_Spec.docx
@@ -129,7 +129,7 @@
                 <w:b w:val="0"/>
                 <w:sz w:val="22"/>
               </w:rPr>
-              <w:t>0.3 (Draft)</w:t>
+              <w:t>0.4 (Draft)</w:t>
             </w:r>
           </w:p>
         </w:tc>
@@ -505,6 +505,68 @@
                 <w:sz w:val="20"/>
               </w:rPr>
               <w:t>8-bit (255 units); spec in voltages: 500 mVpp diff FS, VCM 350 mV; DNL ±0.3 LSB incl. VCO error; sigma targets filled</w:t>
+            </w:r>
+          </w:p>
+        </w:tc>
+      </w:tr>
+      <w:tr>
+        <w:tc>
+          <w:tcPr>
+            <w:tcW w:type="dxa" w:w="2268"/>
+          </w:tcPr>
+          <w:p>
+            <w:r/>
+            <w:r>
+              <w:rPr>
+                <w:b w:val="0"/>
+                <w:sz w:val="20"/>
+              </w:rPr>
+              <w:t>0.4</w:t>
+            </w:r>
+          </w:p>
+        </w:tc>
+        <w:tc>
+          <w:tcPr>
+            <w:tcW w:type="dxa" w:w="2268"/>
+          </w:tcPr>
+          <w:p>
+            <w:r/>
+            <w:r>
+              <w:rPr>
+                <w:b w:val="0"/>
+                <w:sz w:val="20"/>
+              </w:rPr>
+              <w:t>2026-10-18</w:t>
+            </w:r>
+          </w:p>
+        </w:tc>
+        <w:tc>
+          <w:tcPr>
+            <w:tcW w:type="dxa" w:w="2268"/>
+          </w:tcPr>
+          <w:p>
+            <w:r/>
+            <w:r>
+              <w:rPr>
+                <w:b w:val="0"/>
+                <w:sz w:val="20"/>
+              </w:rPr>
+              <w:t>[Author]</w:t>
+            </w:r>
+          </w:p>
+        </w:tc>
+        <w:tc>
+          <w:tcPr>
+            <w:tcW w:type="dxa" w:w="2268"/>
+          </w:tcPr>
+          <w:p>
+            <w:r/>
+            <w:r>
+              <w:rPr>
+                <w:b w:val="0"/>
+                <w:sz w:val="20"/>
+              </w:rPr>
+              <w:t>Removed mismatch targets; added R_L, CM tol, gain error, 2 supplies, power split, settling (2τ), update rate, glitch, temp, C_L, VCO DNL share</w:t>
             </w:r>
           </w:p>
         </w:tc>
@@ -1883,6 +1945,7 @@
                 <w:b w:val="0"/>
                 <w:sz w:val="20"/>
               </w:rPr>
+              <w:t>332.5</w:t>
             </w:r>
           </w:p>
         </w:tc>
@@ -1912,6 +1975,7 @@
                 <w:b w:val="0"/>
                 <w:sz w:val="20"/>
               </w:rPr>
+              <w:t>367.5</w:t>
             </w:r>
           </w:p>
         </w:tc>
@@ -1941,6 +2005,7 @@
                 <w:b w:val="0"/>
                 <w:sz w:val="20"/>
               </w:rPr>
+              <w:t>±5% – self spec</w:t>
             </w:r>
           </w:p>
         </w:tc>
@@ -1957,7 +2022,7 @@
                 <w:b w:val="0"/>
                 <w:sz w:val="20"/>
               </w:rPr>
-              <w:t>DNL</w:t>
+              <w:t>Load resistance</w:t>
             </w:r>
           </w:p>
         </w:tc>
@@ -1972,7 +2037,7 @@
                 <w:b w:val="0"/>
                 <w:sz w:val="20"/>
               </w:rPr>
-              <w:t>DNL</w:t>
+              <w:t>R_L</w:t>
             </w:r>
           </w:p>
         </w:tc>
@@ -1987,7 +2052,6 @@
                 <w:b w:val="0"/>
                 <w:sz w:val="20"/>
               </w:rPr>
-              <w:t>-0.3</w:t>
             </w:r>
           </w:p>
         </w:tc>
@@ -2002,6 +2066,7 @@
                 <w:b w:val="0"/>
                 <w:sz w:val="20"/>
               </w:rPr>
+              <w:t>50</w:t>
             </w:r>
           </w:p>
         </w:tc>
@@ -2016,7 +2081,6 @@
                 <w:b w:val="0"/>
                 <w:sz w:val="20"/>
               </w:rPr>
-              <w:t>+0.3</w:t>
             </w:r>
           </w:p>
         </w:tc>
@@ -2031,7 +2095,7 @@
                 <w:b w:val="0"/>
                 <w:sz w:val="20"/>
               </w:rPr>
-              <w:t>LSB</w:t>
+              <w:t>Ω</w:t>
             </w:r>
           </w:p>
         </w:tc>
@@ -2046,7 +2110,7 @@
                 <w:b w:val="0"/>
                 <w:sz w:val="20"/>
               </w:rPr>
-              <w:t>Including VCO error</w:t>
+              <w:t>Per side → I_FS = V_FS/(2·R_L) = 5 mA, I_LSB ≈ 19.6 µA</w:t>
             </w:r>
           </w:p>
         </w:tc>
@@ -2063,7 +2127,7 @@
                 <w:b w:val="0"/>
                 <w:sz w:val="20"/>
               </w:rPr>
-              <w:t>INL</w:t>
+              <w:t>Full-scale (gain) error</w:t>
             </w:r>
           </w:p>
         </w:tc>
@@ -2078,7 +2142,7 @@
                 <w:b w:val="0"/>
                 <w:sz w:val="20"/>
               </w:rPr>
-              <w:t>INL</w:t>
+              <w:t>GE</w:t>
             </w:r>
           </w:p>
         </w:tc>
@@ -2093,6 +2157,7 @@
                 <w:b w:val="0"/>
                 <w:sz w:val="20"/>
               </w:rPr>
+              <w:t>-5</w:t>
             </w:r>
           </w:p>
         </w:tc>
@@ -2121,6 +2186,7 @@
                 <w:b w:val="0"/>
                 <w:sz w:val="20"/>
               </w:rPr>
+              <w:t>+5</w:t>
             </w:r>
           </w:p>
         </w:tc>
@@ -2135,7 +2201,7 @@
                 <w:b w:val="0"/>
                 <w:sz w:val="20"/>
               </w:rPr>
-              <w:t>LSB</w:t>
+              <w:t>%</w:t>
             </w:r>
           </w:p>
         </w:tc>
@@ -2150,6 +2216,7 @@
                 <w:b w:val="0"/>
                 <w:sz w:val="20"/>
               </w:rPr>
+              <w:t>Self spec</w:t>
             </w:r>
           </w:p>
         </w:tc>
@@ -2166,7 +2233,7 @@
                 <w:b w:val="0"/>
                 <w:sz w:val="20"/>
               </w:rPr>
-              <w:t>Unit mismatch</w:t>
+              <w:t>DNL</w:t>
             </w:r>
           </w:p>
         </w:tc>
@@ -2181,7 +2248,7 @@
                 <w:b w:val="0"/>
                 <w:sz w:val="20"/>
               </w:rPr>
-              <w:t>σ(ΔV_u)/ΔV_u</w:t>
+              <w:t>DNL</w:t>
             </w:r>
           </w:p>
         </w:tc>
@@ -2196,6 +2263,7 @@
                 <w:b w:val="0"/>
                 <w:sz w:val="20"/>
               </w:rPr>
+              <w:t>-0.3</w:t>
             </w:r>
           </w:p>
         </w:tc>
@@ -2224,7 +2292,7 @@
                 <w:b w:val="0"/>
                 <w:sz w:val="20"/>
               </w:rPr>
-              <w:t>7.3</w:t>
+              <w:t>+0.3</w:t>
             </w:r>
           </w:p>
         </w:tc>
@@ -2239,7 +2307,7 @@
                 <w:b w:val="0"/>
                 <w:sz w:val="20"/>
               </w:rPr>
-              <w:t>%</w:t>
+              <w:t>LSB</w:t>
             </w:r>
           </w:p>
         </w:tc>
@@ -2254,7 +2322,7 @@
                 <w:b w:val="0"/>
                 <w:sz w:val="20"/>
               </w:rPr>
-              <w:t>99% yield @ |DNL|&lt;0.3 (sec 4.2.4)</w:t>
+              <w:t>Including VCO error</w:t>
             </w:r>
           </w:p>
         </w:tc>
@@ -2271,7 +2339,7 @@
                 <w:b w:val="0"/>
                 <w:sz w:val="20"/>
               </w:rPr>
-              <w:t>Supply voltage</w:t>
+              <w:t>DNL budget – VCO share</w:t>
             </w:r>
           </w:p>
         </w:tc>
@@ -2286,7 +2354,7 @@
                 <w:b w:val="0"/>
                 <w:sz w:val="20"/>
               </w:rPr>
-              <w:t>VDD</w:t>
+              <w:t>DNL_VCO</w:t>
             </w:r>
           </w:p>
         </w:tc>
@@ -2315,6 +2383,7 @@
                 <w:b w:val="0"/>
                 <w:sz w:val="20"/>
               </w:rPr>
+              <w:t>TBD</w:t>
             </w:r>
           </w:p>
         </w:tc>
@@ -2343,7 +2412,7 @@
                 <w:b w:val="0"/>
                 <w:sz w:val="20"/>
               </w:rPr>
-              <w:t>V</w:t>
+              <w:t>LSB</w:t>
             </w:r>
           </w:p>
         </w:tc>
@@ -2358,6 +2427,7 @@
                 <w:b w:val="0"/>
                 <w:sz w:val="20"/>
               </w:rPr>
+              <w:t>OPEN – part of the ±0.3 LSB, not known yet</w:t>
             </w:r>
           </w:p>
         </w:tc>
@@ -2374,7 +2444,7 @@
                 <w:b w:val="0"/>
                 <w:sz w:val="20"/>
               </w:rPr>
-              <w:t>Power consumption</w:t>
+              <w:t>INL</w:t>
             </w:r>
           </w:p>
         </w:tc>
@@ -2389,7 +2459,7 @@
                 <w:b w:val="0"/>
                 <w:sz w:val="20"/>
               </w:rPr>
-              <w:t>P_DAC</w:t>
+              <w:t>INL</w:t>
             </w:r>
           </w:p>
         </w:tc>
@@ -2418,6 +2488,7 @@
                 <w:b w:val="0"/>
                 <w:sz w:val="20"/>
               </w:rPr>
+              <w:t>TBD</w:t>
             </w:r>
           </w:p>
         </w:tc>
@@ -2446,7 +2517,7 @@
                 <w:b w:val="0"/>
                 <w:sz w:val="20"/>
               </w:rPr>
-              <w:t>mW</w:t>
+              <w:t>LSB</w:t>
             </w:r>
           </w:p>
         </w:tc>
@@ -2461,6 +2532,7 @@
                 <w:b w:val="0"/>
                 <w:sz w:val="20"/>
               </w:rPr>
+              <w:t>Report only</w:t>
             </w:r>
           </w:p>
         </w:tc>
@@ -2477,7 +2549,7 @@
                 <w:b w:val="0"/>
                 <w:sz w:val="20"/>
               </w:rPr>
-              <w:t>Settling time</w:t>
+              <w:t>Supply voltage (high)</w:t>
             </w:r>
           </w:p>
         </w:tc>
@@ -2492,7 +2564,7 @@
                 <w:b w:val="0"/>
                 <w:sz w:val="20"/>
               </w:rPr>
-              <w:t>t_settle</w:t>
+              <w:t>VDD_1V2</w:t>
             </w:r>
           </w:p>
         </w:tc>
@@ -2507,6 +2579,7 @@
                 <w:b w:val="0"/>
                 <w:sz w:val="20"/>
               </w:rPr>
+              <w:t>1.14</w:t>
             </w:r>
           </w:p>
         </w:tc>
@@ -2521,6 +2594,7 @@
                 <w:b w:val="0"/>
                 <w:sz w:val="20"/>
               </w:rPr>
+              <w:t>1.20</w:t>
             </w:r>
           </w:p>
         </w:tc>
@@ -2535,6 +2609,7 @@
                 <w:b w:val="0"/>
                 <w:sz w:val="20"/>
               </w:rPr>
+              <w:t>1.26</w:t>
             </w:r>
           </w:p>
         </w:tc>
@@ -2549,7 +2624,7 @@
                 <w:b w:val="0"/>
                 <w:sz w:val="20"/>
               </w:rPr>
-              <w:t>ps</w:t>
+              <w:t>V</w:t>
             </w:r>
           </w:p>
         </w:tc>
@@ -2564,7 +2639,6 @@
                 <w:b w:val="0"/>
                 <w:sz w:val="20"/>
               </w:rPr>
-              <w:t>To 0.5 LSB</w:t>
             </w:r>
           </w:p>
         </w:tc>
@@ -2581,7 +2655,7 @@
                 <w:b w:val="0"/>
                 <w:sz w:val="20"/>
               </w:rPr>
-              <w:t>Update rate</w:t>
+              <w:t>Supply voltage (low)</w:t>
             </w:r>
           </w:p>
         </w:tc>
@@ -2596,7 +2670,7 @@
                 <w:b w:val="0"/>
                 <w:sz w:val="20"/>
               </w:rPr>
-              <w:t>f_update</w:t>
+              <w:t>VDD_0V9</w:t>
             </w:r>
           </w:p>
         </w:tc>
@@ -2611,6 +2685,7 @@
                 <w:b w:val="0"/>
                 <w:sz w:val="20"/>
               </w:rPr>
+              <w:t>0.85</w:t>
             </w:r>
           </w:p>
         </w:tc>
@@ -2625,6 +2700,7 @@
                 <w:b w:val="0"/>
                 <w:sz w:val="20"/>
               </w:rPr>
+              <w:t>0.90</w:t>
             </w:r>
           </w:p>
         </w:tc>
@@ -2639,6 +2715,7 @@
                 <w:b w:val="0"/>
                 <w:sz w:val="20"/>
               </w:rPr>
+              <w:t>0.95</w:t>
             </w:r>
           </w:p>
         </w:tc>
@@ -2653,7 +2730,7 @@
                 <w:b w:val="0"/>
                 <w:sz w:val="20"/>
               </w:rPr>
-              <w:t>GHz</w:t>
+              <w:t>V</w:t>
             </w:r>
           </w:p>
         </w:tc>
@@ -2684,7 +2761,7 @@
                 <w:b w:val="0"/>
                 <w:sz w:val="20"/>
               </w:rPr>
-              <w:t>Output noise (integrated, diff)</w:t>
+              <w:t>Power – 1.2 V supply</w:t>
             </w:r>
           </w:p>
         </w:tc>
@@ -2699,7 +2776,7 @@
                 <w:b w:val="0"/>
                 <w:sz w:val="20"/>
               </w:rPr>
-              <w:t>V_n</w:t>
+              <w:t>P_1V2</w:t>
             </w:r>
           </w:p>
         </w:tc>
@@ -2728,6 +2805,7 @@
                 <w:b w:val="0"/>
                 <w:sz w:val="20"/>
               </w:rPr>
+              <w:t>TBD</w:t>
             </w:r>
           </w:p>
         </w:tc>
@@ -2756,7 +2834,7 @@
                 <w:b w:val="0"/>
                 <w:sz w:val="20"/>
               </w:rPr>
-              <w:t>µV_rms</w:t>
+              <w:t>mW</w:t>
             </w:r>
           </w:p>
         </w:tc>
@@ -2771,7 +2849,6 @@
                 <w:b w:val="0"/>
                 <w:sz w:val="20"/>
               </w:rPr>
-              <w:t>BW TBD</w:t>
             </w:r>
           </w:p>
         </w:tc>
@@ -2788,7 +2865,7 @@
                 <w:b w:val="0"/>
                 <w:sz w:val="20"/>
               </w:rPr>
-              <w:t>PSRR</w:t>
+              <w:t>Power – 0.9 V supply</w:t>
             </w:r>
           </w:p>
         </w:tc>
@@ -2803,7 +2880,7 @@
                 <w:b w:val="0"/>
                 <w:sz w:val="20"/>
               </w:rPr>
-              <w:t>PSRR</w:t>
+              <w:t>P_0V9</w:t>
             </w:r>
           </w:p>
         </w:tc>
@@ -2832,6 +2909,7 @@
                 <w:b w:val="0"/>
                 <w:sz w:val="20"/>
               </w:rPr>
+              <w:t>TBD</w:t>
             </w:r>
           </w:p>
         </w:tc>
@@ -2860,7 +2938,7 @@
                 <w:b w:val="0"/>
                 <w:sz w:val="20"/>
               </w:rPr>
-              <w:t>dB</w:t>
+              <w:t>mW</w:t>
             </w:r>
           </w:p>
         </w:tc>
@@ -2875,7 +2953,6 @@
                 <w:b w:val="0"/>
                 <w:sz w:val="20"/>
               </w:rPr>
-              <w:t>At freq TBD</w:t>
             </w:r>
           </w:p>
         </w:tc>
@@ -2892,7 +2969,7 @@
                 <w:b w:val="0"/>
                 <w:sz w:val="20"/>
               </w:rPr>
-              <w:t>Temperature range</w:t>
+              <w:t>Settling time (1 LSB)</w:t>
             </w:r>
           </w:p>
         </w:tc>
@@ -2907,6 +2984,741 @@
                 <w:b w:val="0"/>
                 <w:sz w:val="20"/>
               </w:rPr>
+              <w:t>t_set_LSB</w:t>
+            </w:r>
+          </w:p>
+        </w:tc>
+        <w:tc>
+          <w:tcPr>
+            <w:tcW w:type="dxa" w:w="1296"/>
+          </w:tcPr>
+          <w:p>
+            <w:r/>
+            <w:r>
+              <w:rPr>
+                <w:b w:val="0"/>
+                <w:sz w:val="20"/>
+              </w:rPr>
+            </w:r>
+          </w:p>
+        </w:tc>
+        <w:tc>
+          <w:tcPr>
+            <w:tcW w:type="dxa" w:w="1296"/>
+          </w:tcPr>
+          <w:p>
+            <w:r/>
+            <w:r>
+              <w:rPr>
+                <w:b w:val="0"/>
+                <w:sz w:val="20"/>
+              </w:rPr>
+              <w:t>TBD</w:t>
+            </w:r>
+          </w:p>
+        </w:tc>
+        <w:tc>
+          <w:tcPr>
+            <w:tcW w:type="dxa" w:w="1296"/>
+          </w:tcPr>
+          <w:p>
+            <w:r/>
+            <w:r>
+              <w:rPr>
+                <w:b w:val="0"/>
+                <w:sz w:val="20"/>
+              </w:rPr>
+            </w:r>
+          </w:p>
+        </w:tc>
+        <w:tc>
+          <w:tcPr>
+            <w:tcW w:type="dxa" w:w="1296"/>
+          </w:tcPr>
+          <w:p>
+            <w:r/>
+            <w:r>
+              <w:rPr>
+                <w:b w:val="0"/>
+                <w:sz w:val="20"/>
+              </w:rPr>
+              <w:t>ps</w:t>
+            </w:r>
+          </w:p>
+        </w:tc>
+        <w:tc>
+          <w:tcPr>
+            <w:tcW w:type="dxa" w:w="1296"/>
+          </w:tcPr>
+          <w:p>
+            <w:r/>
+            <w:r>
+              <w:rPr>
+                <w:b w:val="0"/>
+                <w:sz w:val="20"/>
+              </w:rPr>
+              <w:t>To 2τ = 86.5% of final value</w:t>
+            </w:r>
+          </w:p>
+        </w:tc>
+      </w:tr>
+      <w:tr>
+        <w:tc>
+          <w:tcPr>
+            <w:tcW w:type="dxa" w:w="1296"/>
+          </w:tcPr>
+          <w:p>
+            <w:r/>
+            <w:r>
+              <w:rPr>
+                <w:b w:val="0"/>
+                <w:sz w:val="20"/>
+              </w:rPr>
+              <w:t>Settling time (full scale)</w:t>
+            </w:r>
+          </w:p>
+        </w:tc>
+        <w:tc>
+          <w:tcPr>
+            <w:tcW w:type="dxa" w:w="1296"/>
+          </w:tcPr>
+          <w:p>
+            <w:r/>
+            <w:r>
+              <w:rPr>
+                <w:b w:val="0"/>
+                <w:sz w:val="20"/>
+              </w:rPr>
+              <w:t>t_set_FS</w:t>
+            </w:r>
+          </w:p>
+        </w:tc>
+        <w:tc>
+          <w:tcPr>
+            <w:tcW w:type="dxa" w:w="1296"/>
+          </w:tcPr>
+          <w:p>
+            <w:r/>
+            <w:r>
+              <w:rPr>
+                <w:b w:val="0"/>
+                <w:sz w:val="20"/>
+              </w:rPr>
+            </w:r>
+          </w:p>
+        </w:tc>
+        <w:tc>
+          <w:tcPr>
+            <w:tcW w:type="dxa" w:w="1296"/>
+          </w:tcPr>
+          <w:p>
+            <w:r/>
+            <w:r>
+              <w:rPr>
+                <w:b w:val="0"/>
+                <w:sz w:val="20"/>
+              </w:rPr>
+              <w:t>TBD</w:t>
+            </w:r>
+          </w:p>
+        </w:tc>
+        <w:tc>
+          <w:tcPr>
+            <w:tcW w:type="dxa" w:w="1296"/>
+          </w:tcPr>
+          <w:p>
+            <w:r/>
+            <w:r>
+              <w:rPr>
+                <w:b w:val="0"/>
+                <w:sz w:val="20"/>
+              </w:rPr>
+            </w:r>
+          </w:p>
+        </w:tc>
+        <w:tc>
+          <w:tcPr>
+            <w:tcW w:type="dxa" w:w="1296"/>
+          </w:tcPr>
+          <w:p>
+            <w:r/>
+            <w:r>
+              <w:rPr>
+                <w:b w:val="0"/>
+                <w:sz w:val="20"/>
+              </w:rPr>
+              <w:t>ns</w:t>
+            </w:r>
+          </w:p>
+        </w:tc>
+        <w:tc>
+          <w:tcPr>
+            <w:tcW w:type="dxa" w:w="1296"/>
+          </w:tcPr>
+          <w:p>
+            <w:r/>
+            <w:r>
+              <w:rPr>
+                <w:b w:val="0"/>
+                <w:sz w:val="20"/>
+              </w:rPr>
+              <w:t>To 2τ = 86.5% of final value</w:t>
+            </w:r>
+          </w:p>
+        </w:tc>
+      </w:tr>
+      <w:tr>
+        <w:tc>
+          <w:tcPr>
+            <w:tcW w:type="dxa" w:w="1296"/>
+          </w:tcPr>
+          <w:p>
+            <w:r/>
+            <w:r>
+              <w:rPr>
+                <w:b w:val="0"/>
+                <w:sz w:val="20"/>
+              </w:rPr>
+              <w:t>Update rate (UP/DN)</w:t>
+            </w:r>
+          </w:p>
+        </w:tc>
+        <w:tc>
+          <w:tcPr>
+            <w:tcW w:type="dxa" w:w="1296"/>
+          </w:tcPr>
+          <w:p>
+            <w:r/>
+            <w:r>
+              <w:rPr>
+                <w:b w:val="0"/>
+                <w:sz w:val="20"/>
+              </w:rPr>
+              <w:t>f_update</w:t>
+            </w:r>
+          </w:p>
+        </w:tc>
+        <w:tc>
+          <w:tcPr>
+            <w:tcW w:type="dxa" w:w="1296"/>
+          </w:tcPr>
+          <w:p>
+            <w:r/>
+            <w:r>
+              <w:rPr>
+                <w:b w:val="0"/>
+                <w:sz w:val="20"/>
+              </w:rPr>
+            </w:r>
+          </w:p>
+        </w:tc>
+        <w:tc>
+          <w:tcPr>
+            <w:tcW w:type="dxa" w:w="1296"/>
+          </w:tcPr>
+          <w:p>
+            <w:r/>
+            <w:r>
+              <w:rPr>
+                <w:b w:val="0"/>
+                <w:sz w:val="20"/>
+              </w:rPr>
+              <w:t>TBD</w:t>
+            </w:r>
+          </w:p>
+        </w:tc>
+        <w:tc>
+          <w:tcPr>
+            <w:tcW w:type="dxa" w:w="1296"/>
+          </w:tcPr>
+          <w:p>
+            <w:r/>
+            <w:r>
+              <w:rPr>
+                <w:b w:val="0"/>
+                <w:sz w:val="20"/>
+              </w:rPr>
+            </w:r>
+          </w:p>
+        </w:tc>
+        <w:tc>
+          <w:tcPr>
+            <w:tcW w:type="dxa" w:w="1296"/>
+          </w:tcPr>
+          <w:p>
+            <w:r/>
+            <w:r>
+              <w:rPr>
+                <w:b w:val="0"/>
+                <w:sz w:val="20"/>
+              </w:rPr>
+              <w:t>GHz</w:t>
+            </w:r>
+          </w:p>
+        </w:tc>
+        <w:tc>
+          <w:tcPr>
+            <w:tcW w:type="dxa" w:w="1296"/>
+          </w:tcPr>
+          <w:p>
+            <w:r/>
+            <w:r>
+              <w:rPr>
+                <w:b w:val="0"/>
+                <w:sz w:val="20"/>
+              </w:rPr>
+              <w:t>Fully thermometric: each UP/DN moves 1 unit = 1 LSB; no decoder. Max rate = 1 / (switch delay + 1-LSB settling). See 6.2</w:t>
+            </w:r>
+          </w:p>
+        </w:tc>
+      </w:tr>
+      <w:tr>
+        <w:tc>
+          <w:tcPr>
+            <w:tcW w:type="dxa" w:w="1296"/>
+          </w:tcPr>
+          <w:p>
+            <w:r/>
+            <w:r>
+              <w:rPr>
+                <w:b w:val="0"/>
+                <w:sz w:val="20"/>
+              </w:rPr>
+              <w:t>Glitch (1-LSB step)</w:t>
+            </w:r>
+          </w:p>
+        </w:tc>
+        <w:tc>
+          <w:tcPr>
+            <w:tcW w:type="dxa" w:w="1296"/>
+          </w:tcPr>
+          <w:p>
+            <w:r/>
+            <w:r>
+              <w:rPr>
+                <w:b w:val="0"/>
+                <w:sz w:val="20"/>
+              </w:rPr>
+              <w:t>G</w:t>
+            </w:r>
+          </w:p>
+        </w:tc>
+        <w:tc>
+          <w:tcPr>
+            <w:tcW w:type="dxa" w:w="1296"/>
+          </w:tcPr>
+          <w:p>
+            <w:r/>
+            <w:r>
+              <w:rPr>
+                <w:b w:val="0"/>
+                <w:sz w:val="20"/>
+              </w:rPr>
+            </w:r>
+          </w:p>
+        </w:tc>
+        <w:tc>
+          <w:tcPr>
+            <w:tcW w:type="dxa" w:w="1296"/>
+          </w:tcPr>
+          <w:p>
+            <w:r/>
+            <w:r>
+              <w:rPr>
+                <w:b w:val="0"/>
+                <w:sz w:val="20"/>
+              </w:rPr>
+              <w:t>TBD</w:t>
+            </w:r>
+          </w:p>
+        </w:tc>
+        <w:tc>
+          <w:tcPr>
+            <w:tcW w:type="dxa" w:w="1296"/>
+          </w:tcPr>
+          <w:p>
+            <w:r/>
+            <w:r>
+              <w:rPr>
+                <w:b w:val="0"/>
+                <w:sz w:val="20"/>
+              </w:rPr>
+            </w:r>
+          </w:p>
+        </w:tc>
+        <w:tc>
+          <w:tcPr>
+            <w:tcW w:type="dxa" w:w="1296"/>
+          </w:tcPr>
+          <w:p>
+            <w:r/>
+            <w:r>
+              <w:rPr>
+                <w:b w:val="0"/>
+                <w:sz w:val="20"/>
+              </w:rPr>
+              <w:t>mV·ps</w:t>
+            </w:r>
+          </w:p>
+        </w:tc>
+        <w:tc>
+          <w:tcPr>
+            <w:tcW w:type="dxa" w:w="1296"/>
+          </w:tcPr>
+          <w:p>
+            <w:r/>
+            <w:r>
+              <w:rPr>
+                <w:b w:val="0"/>
+                <w:sz w:val="20"/>
+              </w:rPr>
+              <w:t>Area of output error during a code step; 1 unit switches, so glitch is small and same for all codes. See 6.3</w:t>
+            </w:r>
+          </w:p>
+        </w:tc>
+      </w:tr>
+      <w:tr>
+        <w:tc>
+          <w:tcPr>
+            <w:tcW w:type="dxa" w:w="1296"/>
+          </w:tcPr>
+          <w:p>
+            <w:r/>
+            <w:r>
+              <w:rPr>
+                <w:b w:val="0"/>
+                <w:sz w:val="20"/>
+              </w:rPr>
+              <w:t>Output noise (integrated, diff)</w:t>
+            </w:r>
+          </w:p>
+        </w:tc>
+        <w:tc>
+          <w:tcPr>
+            <w:tcW w:type="dxa" w:w="1296"/>
+          </w:tcPr>
+          <w:p>
+            <w:r/>
+            <w:r>
+              <w:rPr>
+                <w:b w:val="0"/>
+                <w:sz w:val="20"/>
+              </w:rPr>
+              <w:t>V_n</w:t>
+            </w:r>
+          </w:p>
+        </w:tc>
+        <w:tc>
+          <w:tcPr>
+            <w:tcW w:type="dxa" w:w="1296"/>
+          </w:tcPr>
+          <w:p>
+            <w:r/>
+            <w:r>
+              <w:rPr>
+                <w:b w:val="0"/>
+                <w:sz w:val="20"/>
+              </w:rPr>
+            </w:r>
+          </w:p>
+        </w:tc>
+        <w:tc>
+          <w:tcPr>
+            <w:tcW w:type="dxa" w:w="1296"/>
+          </w:tcPr>
+          <w:p>
+            <w:r/>
+            <w:r>
+              <w:rPr>
+                <w:b w:val="0"/>
+                <w:sz w:val="20"/>
+              </w:rPr>
+              <w:t>TBD</w:t>
+            </w:r>
+          </w:p>
+        </w:tc>
+        <w:tc>
+          <w:tcPr>
+            <w:tcW w:type="dxa" w:w="1296"/>
+          </w:tcPr>
+          <w:p>
+            <w:r/>
+            <w:r>
+              <w:rPr>
+                <w:b w:val="0"/>
+                <w:sz w:val="20"/>
+              </w:rPr>
+            </w:r>
+          </w:p>
+        </w:tc>
+        <w:tc>
+          <w:tcPr>
+            <w:tcW w:type="dxa" w:w="1296"/>
+          </w:tcPr>
+          <w:p>
+            <w:r/>
+            <w:r>
+              <w:rPr>
+                <w:b w:val="0"/>
+                <w:sz w:val="20"/>
+              </w:rPr>
+              <w:t>µV_rms</w:t>
+            </w:r>
+          </w:p>
+        </w:tc>
+        <w:tc>
+          <w:tcPr>
+            <w:tcW w:type="dxa" w:w="1296"/>
+          </w:tcPr>
+          <w:p>
+            <w:r/>
+            <w:r>
+              <w:rPr>
+                <w:b w:val="0"/>
+                <w:sz w:val="20"/>
+              </w:rPr>
+              <w:t>Table to be provided</w:t>
+            </w:r>
+          </w:p>
+        </w:tc>
+      </w:tr>
+      <w:tr>
+        <w:tc>
+          <w:tcPr>
+            <w:tcW w:type="dxa" w:w="1296"/>
+          </w:tcPr>
+          <w:p>
+            <w:r/>
+            <w:r>
+              <w:rPr>
+                <w:b w:val="0"/>
+                <w:sz w:val="20"/>
+              </w:rPr>
+              <w:t>PSRR</w:t>
+            </w:r>
+          </w:p>
+        </w:tc>
+        <w:tc>
+          <w:tcPr>
+            <w:tcW w:type="dxa" w:w="1296"/>
+          </w:tcPr>
+          <w:p>
+            <w:r/>
+            <w:r>
+              <w:rPr>
+                <w:b w:val="0"/>
+                <w:sz w:val="20"/>
+              </w:rPr>
+              <w:t>PSRR</w:t>
+            </w:r>
+          </w:p>
+        </w:tc>
+        <w:tc>
+          <w:tcPr>
+            <w:tcW w:type="dxa" w:w="1296"/>
+          </w:tcPr>
+          <w:p>
+            <w:r/>
+            <w:r>
+              <w:rPr>
+                <w:b w:val="0"/>
+                <w:sz w:val="20"/>
+              </w:rPr>
+            </w:r>
+          </w:p>
+        </w:tc>
+        <w:tc>
+          <w:tcPr>
+            <w:tcW w:type="dxa" w:w="1296"/>
+          </w:tcPr>
+          <w:p>
+            <w:r/>
+            <w:r>
+              <w:rPr>
+                <w:b w:val="0"/>
+                <w:sz w:val="20"/>
+              </w:rPr>
+              <w:t>TBD</w:t>
+            </w:r>
+          </w:p>
+        </w:tc>
+        <w:tc>
+          <w:tcPr>
+            <w:tcW w:type="dxa" w:w="1296"/>
+          </w:tcPr>
+          <w:p>
+            <w:r/>
+            <w:r>
+              <w:rPr>
+                <w:b w:val="0"/>
+                <w:sz w:val="20"/>
+              </w:rPr>
+            </w:r>
+          </w:p>
+        </w:tc>
+        <w:tc>
+          <w:tcPr>
+            <w:tcW w:type="dxa" w:w="1296"/>
+          </w:tcPr>
+          <w:p>
+            <w:r/>
+            <w:r>
+              <w:rPr>
+                <w:b w:val="0"/>
+                <w:sz w:val="20"/>
+              </w:rPr>
+              <w:t>dB</w:t>
+            </w:r>
+          </w:p>
+        </w:tc>
+        <w:tc>
+          <w:tcPr>
+            <w:tcW w:type="dxa" w:w="1296"/>
+          </w:tcPr>
+          <w:p>
+            <w:r/>
+            <w:r>
+              <w:rPr>
+                <w:b w:val="0"/>
+                <w:sz w:val="20"/>
+              </w:rPr>
+              <w:t>Report only</w:t>
+            </w:r>
+          </w:p>
+        </w:tc>
+      </w:tr>
+      <w:tr>
+        <w:tc>
+          <w:tcPr>
+            <w:tcW w:type="dxa" w:w="1296"/>
+          </w:tcPr>
+          <w:p>
+            <w:r/>
+            <w:r>
+              <w:rPr>
+                <w:b w:val="0"/>
+                <w:sz w:val="20"/>
+              </w:rPr>
+              <w:t>Load capacitance</w:t>
+            </w:r>
+          </w:p>
+        </w:tc>
+        <w:tc>
+          <w:tcPr>
+            <w:tcW w:type="dxa" w:w="1296"/>
+          </w:tcPr>
+          <w:p>
+            <w:r/>
+            <w:r>
+              <w:rPr>
+                <w:b w:val="0"/>
+                <w:sz w:val="20"/>
+              </w:rPr>
+              <w:t>C_L</w:t>
+            </w:r>
+          </w:p>
+        </w:tc>
+        <w:tc>
+          <w:tcPr>
+            <w:tcW w:type="dxa" w:w="1296"/>
+          </w:tcPr>
+          <w:p>
+            <w:r/>
+            <w:r>
+              <w:rPr>
+                <w:b w:val="0"/>
+                <w:sz w:val="20"/>
+              </w:rPr>
+            </w:r>
+          </w:p>
+        </w:tc>
+        <w:tc>
+          <w:tcPr>
+            <w:tcW w:type="dxa" w:w="1296"/>
+          </w:tcPr>
+          <w:p>
+            <w:r/>
+            <w:r>
+              <w:rPr>
+                <w:b w:val="0"/>
+                <w:sz w:val="20"/>
+              </w:rPr>
+              <w:t>TBD</w:t>
+            </w:r>
+          </w:p>
+        </w:tc>
+        <w:tc>
+          <w:tcPr>
+            <w:tcW w:type="dxa" w:w="1296"/>
+          </w:tcPr>
+          <w:p>
+            <w:r/>
+            <w:r>
+              <w:rPr>
+                <w:b w:val="0"/>
+                <w:sz w:val="20"/>
+              </w:rPr>
+            </w:r>
+          </w:p>
+        </w:tc>
+        <w:tc>
+          <w:tcPr>
+            <w:tcW w:type="dxa" w:w="1296"/>
+          </w:tcPr>
+          <w:p>
+            <w:r/>
+            <w:r>
+              <w:rPr>
+                <w:b w:val="0"/>
+                <w:sz w:val="20"/>
+              </w:rPr>
+              <w:t>fF</w:t>
+            </w:r>
+          </w:p>
+        </w:tc>
+        <w:tc>
+          <w:tcPr>
+            <w:tcW w:type="dxa" w:w="1296"/>
+          </w:tcPr>
+          <w:p>
+            <w:r/>
+            <w:r>
+              <w:rPr>
+                <w:b w:val="0"/>
+                <w:sz w:val="20"/>
+              </w:rPr>
+              <w:t>VCO input – to be completed</w:t>
+            </w:r>
+          </w:p>
+        </w:tc>
+      </w:tr>
+      <w:tr>
+        <w:tc>
+          <w:tcPr>
+            <w:tcW w:type="dxa" w:w="1296"/>
+          </w:tcPr>
+          <w:p>
+            <w:r/>
+            <w:r>
+              <w:rPr>
+                <w:b w:val="0"/>
+                <w:sz w:val="20"/>
+              </w:rPr>
+              <w:t>Temperature</w:t>
+            </w:r>
+          </w:p>
+        </w:tc>
+        <w:tc>
+          <w:tcPr>
+            <w:tcW w:type="dxa" w:w="1296"/>
+          </w:tcPr>
+          <w:p>
+            <w:r/>
+            <w:r>
+              <w:rPr>
+                <w:b w:val="0"/>
+                <w:sz w:val="20"/>
+              </w:rPr>
               <w:t>T</w:t>
             </w:r>
           </w:p>
@@ -2922,6 +3734,7 @@
                 <w:b w:val="0"/>
                 <w:sz w:val="20"/>
               </w:rPr>
+              <w:t>-10</w:t>
             </w:r>
           </w:p>
         </w:tc>
@@ -2936,6 +3749,7 @@
                 <w:b w:val="0"/>
                 <w:sz w:val="20"/>
               </w:rPr>
+              <w:t>50 / 85</w:t>
             </w:r>
           </w:p>
         </w:tc>
@@ -2950,6 +3764,7 @@
                 <w:b w:val="0"/>
                 <w:sz w:val="20"/>
               </w:rPr>
+              <w:t>110</w:t>
             </w:r>
           </w:p>
         </w:tc>
@@ -2979,6 +3794,7 @@
                 <w:b w:val="0"/>
                 <w:sz w:val="20"/>
               </w:rPr>
+              <w:t>Typ: 50 and 85 (most likely both)</w:t>
             </w:r>
           </w:p>
         </w:tc>
@@ -3107,20 +3923,6 @@
         <w:br/>
         <w:br/>
         <w:t xml:space="preserve">    σ_rel = DNL_target / Φ⁻¹[(1 + Y^(1/N)) / 2]</w:t>
-        <w:br/>
-        <w:br/>
-        <w:t>For N = 255, |DNL| &lt; 0.3 LSB:</w:t>
-        <w:br/>
-        <w:t xml:space="preserve">  • 90% yield → σ_rel ≤ 8.50 %</w:t>
-        <w:br/>
-        <w:t xml:space="preserve">  • 95% yield → σ_rel ≤ 8.07 %</w:t>
-        <w:br/>
-        <w:t xml:space="preserve">  • 99% yield → σ_rel ≤ 7.30 %</w:t>
-        <w:br/>
-        <w:t xml:space="preserve">  • 3σ (99.7%) yield → σ_rel ≤ 6.85 %</w:t>
-        <w:br/>
-        <w:br/>
-        <w:t>Note: these assume the whole 0.3 LSB budget goes to DAC mismatch. The VCO error share must be subtracted once known.</w:t>
       </w:r>
     </w:p>
     <w:p>
@@ -3128,31 +3930,7 @@
         <w:pStyle w:val="Heading2"/>
       </w:pPr>
       <w:r>
-        <w:t>4.3 Matching Requirements</w:t>
-      </w:r>
-    </w:p>
-    <w:p>
-      <w:r>
-        <w:t>Based on Monte Carlo analysis (see dac_sigma_vs_dnl.py):</w:t>
-        <w:br/>
-        <w:br/>
-        <w:t>For |DNL| &lt; 0.3 LSB with 255 unit elements:</w:t>
-        <w:br/>
-        <w:t xml:space="preserve">  • 90% yield → σ_rel ≤ 8.50 %</w:t>
-        <w:br/>
-        <w:t xml:space="preserve">  • 95% yield → σ_rel ≤ 8.07 %</w:t>
-        <w:br/>
-        <w:t xml:space="preserve">  • 99% yield → σ_rel ≤ 7.30 %</w:t>
-        <w:br/>
-        <w:t xml:space="preserve">  • 99.7% yield → σ_rel ≤ 6.85 %</w:t>
-      </w:r>
-    </w:p>
-    <w:p>
-      <w:pPr>
-        <w:pStyle w:val="Heading2"/>
-      </w:pPr>
-      <w:r>
-        <w:t>4.4 Noise Budget</w:t>
+        <w:t>4.3 Noise Budget</w:t>
       </w:r>
     </w:p>
     <w:p>
@@ -3165,12 +3943,12 @@
         <w:pStyle w:val="Heading2"/>
       </w:pPr>
       <w:r>
-        <w:t>4.5 Power Budget</w:t>
+        <w:t>4.4 Power Budget</w:t>
       </w:r>
     </w:p>
     <w:p>
       <w:r>
-        <w:t>[Breakdown of power by sub-block.]</w:t>
+        <w:t>[Breakdown of power per supply (1.2 V / 0.9 V) and per sub-block.]</w:t>
       </w:r>
     </w:p>
     <w:p>
@@ -4009,6 +4787,7 @@
                 <w:b w:val="0"/>
                 <w:sz w:val="20"/>
               </w:rPr>
+              <w:t>To 2τ (86.5%)</w:t>
             </w:r>
           </w:p>
         </w:tc>
@@ -4069,6 +4848,7 @@
                 <w:b w:val="0"/>
                 <w:sz w:val="20"/>
               </w:rPr>
+              <w:t>To 2τ (86.5%)</w:t>
             </w:r>
           </w:p>
         </w:tc>
@@ -4085,7 +4865,12 @@
     </w:p>
     <w:p>
       <w:r>
-        <w:t>[Maximum pulse rate / clock frequency for code updates.]</w:t>
+        <w:t>The DAC is fully thermometric: every UP/DN pulse turns exactly one unit element on or off, so the output always moves by exactly 1 LSB. There is no binary-to-thermometer decoder, so no decode delay and no multi-bit switching.</w:t>
+        <w:br/>
+        <w:br/>
+        <w:t>Max update rate = 1 / (UP/DN-to-switch delay + 1-LSB settling to 2τ).</w:t>
+        <w:br/>
+        <w:t>Value: TBD.</w:t>
       </w:r>
     </w:p>
     <w:p>
@@ -4098,7 +4883,12 @@
     </w:p>
     <w:p>
       <w:r>
-        <w:t>[Max allowable glitch at code transitions, in LSB·ps or pV·s.]</w:t>
+        <w:t>Glitch energy = area (mV·ps) of the output error spike during a code step, caused by switch timing skew and clock/charge feed-through.</w:t>
+        <w:br/>
+        <w:br/>
+        <w:t>In a binary DAC the worst glitch is at mid-code (many bits switch at once). In this fully thermometric DAC only one unit switches per step, so the glitch is small and the same for every code.</w:t>
+        <w:br/>
+        <w:t>Value: TBD (1-LSB step, differential).</w:t>
       </w:r>
     </w:p>
     <w:p>
@@ -4370,7 +5160,7 @@
                 <w:b w:val="0"/>
                 <w:sz w:val="20"/>
               </w:rPr>
-              <w:t>TBD</w:t>
+              <w:t>Report only</w:t>
             </w:r>
           </w:p>
         </w:tc>
@@ -4431,7 +5221,7 @@
                 <w:b w:val="0"/>
                 <w:sz w:val="20"/>
               </w:rPr>
-              <w:t>500 mVpp diff</w:t>
+              <w:t>500 mVpp diff ±5%</w:t>
             </w:r>
           </w:p>
         </w:tc>
@@ -4446,6 +5236,7 @@
                 <w:b w:val="0"/>
                 <w:sz w:val="20"/>
               </w:rPr>
+              <w:t>Self spec</w:t>
             </w:r>
           </w:p>
         </w:tc>
@@ -4492,7 +5283,7 @@
                 <w:b w:val="0"/>
                 <w:sz w:val="20"/>
               </w:rPr>
-              <w:t>350 mV</w:t>
+              <w:t>350 mV ±5%</w:t>
             </w:r>
           </w:p>
         </w:tc>
@@ -4507,6 +5298,7 @@
                 <w:b w:val="0"/>
                 <w:sz w:val="20"/>
               </w:rPr>
+              <w:t>Self spec</w:t>
             </w:r>
           </w:p>
         </w:tc>
@@ -4732,7 +5524,7 @@
                 <w:b w:val="0"/>
                 <w:sz w:val="20"/>
               </w:rPr>
-              <w:t>–40°C to 125°C</w:t>
+              <w:t>–10°C to 110°C</w:t>
             </w:r>
           </w:p>
         </w:tc>
@@ -4779,7 +5571,7 @@
                 <w:b w:val="0"/>
                 <w:sz w:val="20"/>
               </w:rPr>
-              <w:t>VDD ± 10%</w:t>
+              <w:t>1.14–1.26 V and 0.85–0.95 V</w:t>
             </w:r>
           </w:p>
         </w:tc>
@@ -4794,7 +5586,7 @@
                 <w:b w:val="0"/>
                 <w:sz w:val="20"/>
               </w:rPr>
-              <w:t>PSRR impact on linearity</w:t>
+              <w:t>Supply impact on linearity</w:t>
             </w:r>
           </w:p>
         </w:tc>
@@ -5568,6 +6360,189 @@
                 <w:sz w:val="20"/>
               </w:rPr>
               <w:t>Supply / IO voltage levels?</w:t>
+            </w:r>
+          </w:p>
+        </w:tc>
+        <w:tc>
+          <w:tcPr>
+            <w:tcW w:type="dxa" w:w="2268"/>
+          </w:tcPr>
+          <w:p>
+            <w:r/>
+            <w:r>
+              <w:rPr>
+                <w:b w:val="0"/>
+                <w:sz w:val="20"/>
+              </w:rPr>
+            </w:r>
+          </w:p>
+        </w:tc>
+        <w:tc>
+          <w:tcPr>
+            <w:tcW w:type="dxa" w:w="2268"/>
+          </w:tcPr>
+          <w:p>
+            <w:r/>
+            <w:r>
+              <w:rPr>
+                <w:b w:val="0"/>
+                <w:sz w:val="20"/>
+              </w:rPr>
+              <w:t>Closed – 1.2 V and 0.9 V</w:t>
+            </w:r>
+          </w:p>
+        </w:tc>
+      </w:tr>
+      <w:tr>
+        <w:tc>
+          <w:tcPr>
+            <w:tcW w:type="dxa" w:w="2268"/>
+          </w:tcPr>
+          <w:p>
+            <w:r/>
+            <w:r>
+              <w:rPr>
+                <w:b w:val="0"/>
+                <w:sz w:val="20"/>
+              </w:rPr>
+              <w:t>10</w:t>
+            </w:r>
+          </w:p>
+        </w:tc>
+        <w:tc>
+          <w:tcPr>
+            <w:tcW w:type="dxa" w:w="2268"/>
+          </w:tcPr>
+          <w:p>
+            <w:r/>
+            <w:r>
+              <w:rPr>
+                <w:b w:val="0"/>
+                <w:sz w:val="20"/>
+              </w:rPr>
+              <w:t>VCO share of the ±0.3 LSB DNL budget?</w:t>
+            </w:r>
+          </w:p>
+        </w:tc>
+        <w:tc>
+          <w:tcPr>
+            <w:tcW w:type="dxa" w:w="2268"/>
+          </w:tcPr>
+          <w:p>
+            <w:r/>
+            <w:r>
+              <w:rPr>
+                <w:b w:val="0"/>
+                <w:sz w:val="20"/>
+              </w:rPr>
+            </w:r>
+          </w:p>
+        </w:tc>
+        <w:tc>
+          <w:tcPr>
+            <w:tcW w:type="dxa" w:w="2268"/>
+          </w:tcPr>
+          <w:p>
+            <w:r/>
+            <w:r>
+              <w:rPr>
+                <w:b w:val="0"/>
+                <w:sz w:val="20"/>
+              </w:rPr>
+              <w:t>Open</w:t>
+            </w:r>
+          </w:p>
+        </w:tc>
+      </w:tr>
+      <w:tr>
+        <w:tc>
+          <w:tcPr>
+            <w:tcW w:type="dxa" w:w="2268"/>
+          </w:tcPr>
+          <w:p>
+            <w:r/>
+            <w:r>
+              <w:rPr>
+                <w:b w:val="0"/>
+                <w:sz w:val="20"/>
+              </w:rPr>
+              <w:t>11</w:t>
+            </w:r>
+          </w:p>
+        </w:tc>
+        <w:tc>
+          <w:tcPr>
+            <w:tcW w:type="dxa" w:w="2268"/>
+          </w:tcPr>
+          <w:p>
+            <w:r/>
+            <w:r>
+              <w:rPr>
+                <w:b w:val="0"/>
+                <w:sz w:val="20"/>
+              </w:rPr>
+              <w:t>VCO input load capacitance (C_L)?</w:t>
+            </w:r>
+          </w:p>
+        </w:tc>
+        <w:tc>
+          <w:tcPr>
+            <w:tcW w:type="dxa" w:w="2268"/>
+          </w:tcPr>
+          <w:p>
+            <w:r/>
+            <w:r>
+              <w:rPr>
+                <w:b w:val="0"/>
+                <w:sz w:val="20"/>
+              </w:rPr>
+            </w:r>
+          </w:p>
+        </w:tc>
+        <w:tc>
+          <w:tcPr>
+            <w:tcW w:type="dxa" w:w="2268"/>
+          </w:tcPr>
+          <w:p>
+            <w:r/>
+            <w:r>
+              <w:rPr>
+                <w:b w:val="0"/>
+                <w:sz w:val="20"/>
+              </w:rPr>
+              <w:t>Open</w:t>
+            </w:r>
+          </w:p>
+        </w:tc>
+      </w:tr>
+      <w:tr>
+        <w:tc>
+          <w:tcPr>
+            <w:tcW w:type="dxa" w:w="2268"/>
+          </w:tcPr>
+          <w:p>
+            <w:r/>
+            <w:r>
+              <w:rPr>
+                <w:b w:val="0"/>
+                <w:sz w:val="20"/>
+              </w:rPr>
+              <w:t>12</w:t>
+            </w:r>
+          </w:p>
+        </w:tc>
+        <w:tc>
+          <w:tcPr>
+            <w:tcW w:type="dxa" w:w="2268"/>
+          </w:tcPr>
+          <w:p>
+            <w:r/>
+            <w:r>
+              <w:rPr>
+                <w:b w:val="0"/>
+                <w:sz w:val="20"/>
+              </w:rPr>
+              <w:t>Output noise table</w:t>
             </w:r>
           </w:p>
         </w:tc>

</xml_diff>

<commit_message>
Spec v0.5: FS 1Vpp diff, internal I_FS 10mA / I_LSB 39.2uA, update-rate and glitch notes
</commit_message>
<xml_diff>
--- a/doc/HYP_Gen1_CDR_DAC_Spec.docx
+++ b/doc/HYP_Gen1_CDR_DAC_Spec.docx
@@ -129,7 +129,7 @@
                 <w:b w:val="0"/>
                 <w:sz w:val="22"/>
               </w:rPr>
-              <w:t>0.4 (Draft)</w:t>
+              <w:t>0.5 (Draft)</w:t>
             </w:r>
           </w:p>
         </w:tc>
@@ -567,6 +567,68 @@
                 <w:sz w:val="20"/>
               </w:rPr>
               <w:t>Removed mismatch targets; added R_L, CM tol, gain error, 2 supplies, power split, settling (2τ), update rate, glitch, temp, C_L, VCO DNL share</w:t>
+            </w:r>
+          </w:p>
+        </w:tc>
+      </w:tr>
+      <w:tr>
+        <w:tc>
+          <w:tcPr>
+            <w:tcW w:type="dxa" w:w="2268"/>
+          </w:tcPr>
+          <w:p>
+            <w:r/>
+            <w:r>
+              <w:rPr>
+                <w:b w:val="0"/>
+                <w:sz w:val="20"/>
+              </w:rPr>
+              <w:t>0.5</w:t>
+            </w:r>
+          </w:p>
+        </w:tc>
+        <w:tc>
+          <w:tcPr>
+            <w:tcW w:type="dxa" w:w="2268"/>
+          </w:tcPr>
+          <w:p>
+            <w:r/>
+            <w:r>
+              <w:rPr>
+                <w:b w:val="0"/>
+                <w:sz w:val="20"/>
+              </w:rPr>
+              <w:t>2026-10-18</w:t>
+            </w:r>
+          </w:p>
+        </w:tc>
+        <w:tc>
+          <w:tcPr>
+            <w:tcW w:type="dxa" w:w="2268"/>
+          </w:tcPr>
+          <w:p>
+            <w:r/>
+            <w:r>
+              <w:rPr>
+                <w:b w:val="0"/>
+                <w:sz w:val="20"/>
+              </w:rPr>
+              <w:t>[Author]</w:t>
+            </w:r>
+          </w:p>
+        </w:tc>
+        <w:tc>
+          <w:tcPr>
+            <w:tcW w:type="dxa" w:w="2268"/>
+          </w:tcPr>
+          <w:p>
+            <w:r/>
+            <w:r>
+              <w:rPr>
+                <w:b w:val="0"/>
+                <w:sz w:val="20"/>
+              </w:rPr>
+              <w:t>FS = 1 Vpp diff (LSB 3.922 mV); internal currents I_FS 10 mA / I_LSB 39.2 µA; update-rate and glitch explanations in notes</w:t>
             </w:r>
           </w:p>
         </w:tc>
@@ -1749,7 +1811,7 @@
                 <w:b w:val="0"/>
                 <w:sz w:val="20"/>
               </w:rPr>
-              <w:t>500</w:t>
+              <w:t>1000</w:t>
             </w:r>
           </w:p>
         </w:tc>
@@ -1793,7 +1855,7 @@
                 <w:b w:val="0"/>
                 <w:sz w:val="20"/>
               </w:rPr>
-              <w:t>Differential peak-to-peak (±250 mV)</w:t>
+              <w:t>Differential peak-to-peak (±500 mV)</w:t>
             </w:r>
           </w:p>
         </w:tc>
@@ -1854,7 +1916,7 @@
                 <w:b w:val="0"/>
                 <w:sz w:val="20"/>
               </w:rPr>
-              <w:t>1.961</w:t>
+              <w:t>3.922</w:t>
             </w:r>
           </w:p>
         </w:tc>
@@ -2110,7 +2172,7 @@
                 <w:b w:val="0"/>
                 <w:sz w:val="20"/>
               </w:rPr>
-              <w:t>Per side → I_FS = V_FS/(2·R_L) = 5 mA, I_LSB ≈ 19.6 µA</w:t>
+              <w:t>Per side</w:t>
             </w:r>
           </w:p>
         </w:tc>
@@ -2127,7 +2189,7 @@
                 <w:b w:val="0"/>
                 <w:sz w:val="20"/>
               </w:rPr>
-              <w:t>Full-scale (gain) error</w:t>
+              <w:t>Full-scale current</w:t>
             </w:r>
           </w:p>
         </w:tc>
@@ -2142,7 +2204,7 @@
                 <w:b w:val="0"/>
                 <w:sz w:val="20"/>
               </w:rPr>
-              <w:t>GE</w:t>
+              <w:t>I_FS</w:t>
             </w:r>
           </w:p>
         </w:tc>
@@ -2157,7 +2219,6 @@
                 <w:b w:val="0"/>
                 <w:sz w:val="20"/>
               </w:rPr>
-              <w:t>-5</w:t>
             </w:r>
           </w:p>
         </w:tc>
@@ -2172,6 +2233,7 @@
                 <w:b w:val="0"/>
                 <w:sz w:val="20"/>
               </w:rPr>
+              <w:t>10</w:t>
             </w:r>
           </w:p>
         </w:tc>
@@ -2186,7 +2248,6 @@
                 <w:b w:val="0"/>
                 <w:sz w:val="20"/>
               </w:rPr>
-              <w:t>+5</w:t>
             </w:r>
           </w:p>
         </w:tc>
@@ -2201,7 +2262,7 @@
                 <w:b w:val="0"/>
                 <w:sz w:val="20"/>
               </w:rPr>
-              <w:t>%</w:t>
+              <w:t>mA</w:t>
             </w:r>
           </w:p>
         </w:tc>
@@ -2216,7 +2277,7 @@
                 <w:b w:val="0"/>
                 <w:sz w:val="20"/>
               </w:rPr>
-              <w:t>Self spec</w:t>
+              <w:t>Internal spec; V_FS = 2·I_FS·R_L</w:t>
             </w:r>
           </w:p>
         </w:tc>
@@ -2233,7 +2294,7 @@
                 <w:b w:val="0"/>
                 <w:sz w:val="20"/>
               </w:rPr>
-              <w:t>DNL</w:t>
+              <w:t>LSB (unit) current</w:t>
             </w:r>
           </w:p>
         </w:tc>
@@ -2248,7 +2309,7 @@
                 <w:b w:val="0"/>
                 <w:sz w:val="20"/>
               </w:rPr>
-              <w:t>DNL</w:t>
+              <w:t>I_LSB</w:t>
             </w:r>
           </w:p>
         </w:tc>
@@ -2263,7 +2324,6 @@
                 <w:b w:val="0"/>
                 <w:sz w:val="20"/>
               </w:rPr>
-              <w:t>-0.3</w:t>
             </w:r>
           </w:p>
         </w:tc>
@@ -2278,6 +2338,7 @@
                 <w:b w:val="0"/>
                 <w:sz w:val="20"/>
               </w:rPr>
+              <w:t>39.2</w:t>
             </w:r>
           </w:p>
         </w:tc>
@@ -2292,7 +2353,6 @@
                 <w:b w:val="0"/>
                 <w:sz w:val="20"/>
               </w:rPr>
-              <w:t>+0.3</w:t>
             </w:r>
           </w:p>
         </w:tc>
@@ -2307,7 +2367,7 @@
                 <w:b w:val="0"/>
                 <w:sz w:val="20"/>
               </w:rPr>
-              <w:t>LSB</w:t>
+              <w:t>µA</w:t>
             </w:r>
           </w:p>
         </w:tc>
@@ -2322,7 +2382,7 @@
                 <w:b w:val="0"/>
                 <w:sz w:val="20"/>
               </w:rPr>
-              <w:t>Including VCO error</w:t>
+              <w:t>Internal spec; I_FS / 255</w:t>
             </w:r>
           </w:p>
         </w:tc>
@@ -2339,7 +2399,7 @@
                 <w:b w:val="0"/>
                 <w:sz w:val="20"/>
               </w:rPr>
-              <w:t>DNL budget – VCO share</w:t>
+              <w:t>Full-scale (gain) error</w:t>
             </w:r>
           </w:p>
         </w:tc>
@@ -2354,7 +2414,7 @@
                 <w:b w:val="0"/>
                 <w:sz w:val="20"/>
               </w:rPr>
-              <w:t>DNL_VCO</w:t>
+              <w:t>GE</w:t>
             </w:r>
           </w:p>
         </w:tc>
@@ -2369,6 +2429,7 @@
                 <w:b w:val="0"/>
                 <w:sz w:val="20"/>
               </w:rPr>
+              <w:t>-5</w:t>
             </w:r>
           </w:p>
         </w:tc>
@@ -2383,7 +2444,6 @@
                 <w:b w:val="0"/>
                 <w:sz w:val="20"/>
               </w:rPr>
-              <w:t>TBD</w:t>
             </w:r>
           </w:p>
         </w:tc>
@@ -2398,6 +2458,7 @@
                 <w:b w:val="0"/>
                 <w:sz w:val="20"/>
               </w:rPr>
+              <w:t>+5</w:t>
             </w:r>
           </w:p>
         </w:tc>
@@ -2412,7 +2473,7 @@
                 <w:b w:val="0"/>
                 <w:sz w:val="20"/>
               </w:rPr>
-              <w:t>LSB</w:t>
+              <w:t>%</w:t>
             </w:r>
           </w:p>
         </w:tc>
@@ -2427,7 +2488,7 @@
                 <w:b w:val="0"/>
                 <w:sz w:val="20"/>
               </w:rPr>
-              <w:t>OPEN – part of the ±0.3 LSB, not known yet</w:t>
+              <w:t>Self spec</w:t>
             </w:r>
           </w:p>
         </w:tc>
@@ -2444,7 +2505,7 @@
                 <w:b w:val="0"/>
                 <w:sz w:val="20"/>
               </w:rPr>
-              <w:t>INL</w:t>
+              <w:t>DNL</w:t>
             </w:r>
           </w:p>
         </w:tc>
@@ -2459,7 +2520,7 @@
                 <w:b w:val="0"/>
                 <w:sz w:val="20"/>
               </w:rPr>
-              <w:t>INL</w:t>
+              <w:t>DNL</w:t>
             </w:r>
           </w:p>
         </w:tc>
@@ -2474,6 +2535,7 @@
                 <w:b w:val="0"/>
                 <w:sz w:val="20"/>
               </w:rPr>
+              <w:t>-0.3</w:t>
             </w:r>
           </w:p>
         </w:tc>
@@ -2488,7 +2550,6 @@
                 <w:b w:val="0"/>
                 <w:sz w:val="20"/>
               </w:rPr>
-              <w:t>TBD</w:t>
             </w:r>
           </w:p>
         </w:tc>
@@ -2503,6 +2564,7 @@
                 <w:b w:val="0"/>
                 <w:sz w:val="20"/>
               </w:rPr>
+              <w:t>+0.3</w:t>
             </w:r>
           </w:p>
         </w:tc>
@@ -2532,7 +2594,7 @@
                 <w:b w:val="0"/>
                 <w:sz w:val="20"/>
               </w:rPr>
-              <w:t>Report only</w:t>
+              <w:t>Including VCO error</w:t>
             </w:r>
           </w:p>
         </w:tc>
@@ -2549,7 +2611,7 @@
                 <w:b w:val="0"/>
                 <w:sz w:val="20"/>
               </w:rPr>
-              <w:t>Supply voltage (high)</w:t>
+              <w:t>DNL budget – VCO share</w:t>
             </w:r>
           </w:p>
         </w:tc>
@@ -2564,7 +2626,7 @@
                 <w:b w:val="0"/>
                 <w:sz w:val="20"/>
               </w:rPr>
-              <w:t>VDD_1V2</w:t>
+              <w:t>DNL_VCO</w:t>
             </w:r>
           </w:p>
         </w:tc>
@@ -2579,7 +2641,6 @@
                 <w:b w:val="0"/>
                 <w:sz w:val="20"/>
               </w:rPr>
-              <w:t>1.14</w:t>
             </w:r>
           </w:p>
         </w:tc>
@@ -2594,7 +2655,7 @@
                 <w:b w:val="0"/>
                 <w:sz w:val="20"/>
               </w:rPr>
-              <w:t>1.20</w:t>
+              <w:t>TBD</w:t>
             </w:r>
           </w:p>
         </w:tc>
@@ -2609,7 +2670,6 @@
                 <w:b w:val="0"/>
                 <w:sz w:val="20"/>
               </w:rPr>
-              <w:t>1.26</w:t>
             </w:r>
           </w:p>
         </w:tc>
@@ -2624,7 +2684,7 @@
                 <w:b w:val="0"/>
                 <w:sz w:val="20"/>
               </w:rPr>
-              <w:t>V</w:t>
+              <w:t>LSB</w:t>
             </w:r>
           </w:p>
         </w:tc>
@@ -2639,6 +2699,7 @@
                 <w:b w:val="0"/>
                 <w:sz w:val="20"/>
               </w:rPr>
+              <w:t>OPEN – part of the ±0.3 LSB, not known yet</w:t>
             </w:r>
           </w:p>
         </w:tc>
@@ -2655,7 +2716,7 @@
                 <w:b w:val="0"/>
                 <w:sz w:val="20"/>
               </w:rPr>
-              <w:t>Supply voltage (low)</w:t>
+              <w:t>INL</w:t>
             </w:r>
           </w:p>
         </w:tc>
@@ -2670,7 +2731,7 @@
                 <w:b w:val="0"/>
                 <w:sz w:val="20"/>
               </w:rPr>
-              <w:t>VDD_0V9</w:t>
+              <w:t>INL</w:t>
             </w:r>
           </w:p>
         </w:tc>
@@ -2685,7 +2746,6 @@
                 <w:b w:val="0"/>
                 <w:sz w:val="20"/>
               </w:rPr>
-              <w:t>0.85</w:t>
             </w:r>
           </w:p>
         </w:tc>
@@ -2700,7 +2760,7 @@
                 <w:b w:val="0"/>
                 <w:sz w:val="20"/>
               </w:rPr>
-              <w:t>0.90</w:t>
+              <w:t>TBD</w:t>
             </w:r>
           </w:p>
         </w:tc>
@@ -2715,7 +2775,6 @@
                 <w:b w:val="0"/>
                 <w:sz w:val="20"/>
               </w:rPr>
-              <w:t>0.95</w:t>
             </w:r>
           </w:p>
         </w:tc>
@@ -2730,7 +2789,7 @@
                 <w:b w:val="0"/>
                 <w:sz w:val="20"/>
               </w:rPr>
-              <w:t>V</w:t>
+              <w:t>LSB</w:t>
             </w:r>
           </w:p>
         </w:tc>
@@ -2745,6 +2804,7 @@
                 <w:b w:val="0"/>
                 <w:sz w:val="20"/>
               </w:rPr>
+              <w:t>Report only</w:t>
             </w:r>
           </w:p>
         </w:tc>
@@ -2761,7 +2821,7 @@
                 <w:b w:val="0"/>
                 <w:sz w:val="20"/>
               </w:rPr>
-              <w:t>Power – 1.2 V supply</w:t>
+              <w:t>Supply voltage (high)</w:t>
             </w:r>
           </w:p>
         </w:tc>
@@ -2776,7 +2836,7 @@
                 <w:b w:val="0"/>
                 <w:sz w:val="20"/>
               </w:rPr>
-              <w:t>P_1V2</w:t>
+              <w:t>VDD_1V2</w:t>
             </w:r>
           </w:p>
         </w:tc>
@@ -2791,6 +2851,7 @@
                 <w:b w:val="0"/>
                 <w:sz w:val="20"/>
               </w:rPr>
+              <w:t>1.14</w:t>
             </w:r>
           </w:p>
         </w:tc>
@@ -2805,7 +2866,7 @@
                 <w:b w:val="0"/>
                 <w:sz w:val="20"/>
               </w:rPr>
-              <w:t>TBD</w:t>
+              <w:t>1.20</w:t>
             </w:r>
           </w:p>
         </w:tc>
@@ -2820,6 +2881,7 @@
                 <w:b w:val="0"/>
                 <w:sz w:val="20"/>
               </w:rPr>
+              <w:t>1.26</w:t>
             </w:r>
           </w:p>
         </w:tc>
@@ -2834,7 +2896,7 @@
                 <w:b w:val="0"/>
                 <w:sz w:val="20"/>
               </w:rPr>
-              <w:t>mW</w:t>
+              <w:t>V</w:t>
             </w:r>
           </w:p>
         </w:tc>
@@ -2865,7 +2927,7 @@
                 <w:b w:val="0"/>
                 <w:sz w:val="20"/>
               </w:rPr>
-              <w:t>Power – 0.9 V supply</w:t>
+              <w:t>Supply voltage (low)</w:t>
             </w:r>
           </w:p>
         </w:tc>
@@ -2880,7 +2942,7 @@
                 <w:b w:val="0"/>
                 <w:sz w:val="20"/>
               </w:rPr>
-              <w:t>P_0V9</w:t>
+              <w:t>VDD_0V9</w:t>
             </w:r>
           </w:p>
         </w:tc>
@@ -2895,6 +2957,7 @@
                 <w:b w:val="0"/>
                 <w:sz w:val="20"/>
               </w:rPr>
+              <w:t>0.85</w:t>
             </w:r>
           </w:p>
         </w:tc>
@@ -2909,7 +2972,7 @@
                 <w:b w:val="0"/>
                 <w:sz w:val="20"/>
               </w:rPr>
-              <w:t>TBD</w:t>
+              <w:t>0.90</w:t>
             </w:r>
           </w:p>
         </w:tc>
@@ -2924,6 +2987,7 @@
                 <w:b w:val="0"/>
                 <w:sz w:val="20"/>
               </w:rPr>
+              <w:t>0.95</w:t>
             </w:r>
           </w:p>
         </w:tc>
@@ -2938,7 +3002,7 @@
                 <w:b w:val="0"/>
                 <w:sz w:val="20"/>
               </w:rPr>
-              <w:t>mW</w:t>
+              <w:t>V</w:t>
             </w:r>
           </w:p>
         </w:tc>
@@ -2969,7 +3033,7 @@
                 <w:b w:val="0"/>
                 <w:sz w:val="20"/>
               </w:rPr>
-              <w:t>Settling time (1 LSB)</w:t>
+              <w:t>Power – 1.2 V supply</w:t>
             </w:r>
           </w:p>
         </w:tc>
@@ -2984,7 +3048,7 @@
                 <w:b w:val="0"/>
                 <w:sz w:val="20"/>
               </w:rPr>
-              <w:t>t_set_LSB</w:t>
+              <w:t>P_1V2</w:t>
             </w:r>
           </w:p>
         </w:tc>
@@ -3042,7 +3106,7 @@
                 <w:b w:val="0"/>
                 <w:sz w:val="20"/>
               </w:rPr>
-              <w:t>ps</w:t>
+              <w:t>mW</w:t>
             </w:r>
           </w:p>
         </w:tc>
@@ -3057,7 +3121,6 @@
                 <w:b w:val="0"/>
                 <w:sz w:val="20"/>
               </w:rPr>
-              <w:t>To 2τ = 86.5% of final value</w:t>
             </w:r>
           </w:p>
         </w:tc>
@@ -3074,7 +3137,7 @@
                 <w:b w:val="0"/>
                 <w:sz w:val="20"/>
               </w:rPr>
-              <w:t>Settling time (full scale)</w:t>
+              <w:t>Power – 0.9 V supply</w:t>
             </w:r>
           </w:p>
         </w:tc>
@@ -3089,7 +3152,7 @@
                 <w:b w:val="0"/>
                 <w:sz w:val="20"/>
               </w:rPr>
-              <w:t>t_set_FS</w:t>
+              <w:t>P_0V9</w:t>
             </w:r>
           </w:p>
         </w:tc>
@@ -3147,7 +3210,7 @@
                 <w:b w:val="0"/>
                 <w:sz w:val="20"/>
               </w:rPr>
-              <w:t>ns</w:t>
+              <w:t>mW</w:t>
             </w:r>
           </w:p>
         </w:tc>
@@ -3162,7 +3225,6 @@
                 <w:b w:val="0"/>
                 <w:sz w:val="20"/>
               </w:rPr>
-              <w:t>To 2τ = 86.5% of final value</w:t>
             </w:r>
           </w:p>
         </w:tc>
@@ -3179,7 +3241,7 @@
                 <w:b w:val="0"/>
                 <w:sz w:val="20"/>
               </w:rPr>
-              <w:t>Update rate (UP/DN)</w:t>
+              <w:t>Settling time (1 LSB)</w:t>
             </w:r>
           </w:p>
         </w:tc>
@@ -3194,7 +3256,7 @@
                 <w:b w:val="0"/>
                 <w:sz w:val="20"/>
               </w:rPr>
-              <w:t>f_update</w:t>
+              <w:t>t_set_LSB</w:t>
             </w:r>
           </w:p>
         </w:tc>
@@ -3252,7 +3314,7 @@
                 <w:b w:val="0"/>
                 <w:sz w:val="20"/>
               </w:rPr>
-              <w:t>GHz</w:t>
+              <w:t>ps</w:t>
             </w:r>
           </w:p>
         </w:tc>
@@ -3267,7 +3329,7 @@
                 <w:b w:val="0"/>
                 <w:sz w:val="20"/>
               </w:rPr>
-              <w:t>Fully thermometric: each UP/DN moves 1 unit = 1 LSB; no decoder. Max rate = 1 / (switch delay + 1-LSB settling). See 6.2</w:t>
+              <w:t>To 2τ = 86.5% of final value</w:t>
             </w:r>
           </w:p>
         </w:tc>
@@ -3284,6 +3346,216 @@
                 <w:b w:val="0"/>
                 <w:sz w:val="20"/>
               </w:rPr>
+              <w:t>Settling time (full scale)</w:t>
+            </w:r>
+          </w:p>
+        </w:tc>
+        <w:tc>
+          <w:tcPr>
+            <w:tcW w:type="dxa" w:w="1296"/>
+          </w:tcPr>
+          <w:p>
+            <w:r/>
+            <w:r>
+              <w:rPr>
+                <w:b w:val="0"/>
+                <w:sz w:val="20"/>
+              </w:rPr>
+              <w:t>t_set_FS</w:t>
+            </w:r>
+          </w:p>
+        </w:tc>
+        <w:tc>
+          <w:tcPr>
+            <w:tcW w:type="dxa" w:w="1296"/>
+          </w:tcPr>
+          <w:p>
+            <w:r/>
+            <w:r>
+              <w:rPr>
+                <w:b w:val="0"/>
+                <w:sz w:val="20"/>
+              </w:rPr>
+            </w:r>
+          </w:p>
+        </w:tc>
+        <w:tc>
+          <w:tcPr>
+            <w:tcW w:type="dxa" w:w="1296"/>
+          </w:tcPr>
+          <w:p>
+            <w:r/>
+            <w:r>
+              <w:rPr>
+                <w:b w:val="0"/>
+                <w:sz w:val="20"/>
+              </w:rPr>
+              <w:t>TBD</w:t>
+            </w:r>
+          </w:p>
+        </w:tc>
+        <w:tc>
+          <w:tcPr>
+            <w:tcW w:type="dxa" w:w="1296"/>
+          </w:tcPr>
+          <w:p>
+            <w:r/>
+            <w:r>
+              <w:rPr>
+                <w:b w:val="0"/>
+                <w:sz w:val="20"/>
+              </w:rPr>
+            </w:r>
+          </w:p>
+        </w:tc>
+        <w:tc>
+          <w:tcPr>
+            <w:tcW w:type="dxa" w:w="1296"/>
+          </w:tcPr>
+          <w:p>
+            <w:r/>
+            <w:r>
+              <w:rPr>
+                <w:b w:val="0"/>
+                <w:sz w:val="20"/>
+              </w:rPr>
+              <w:t>ns</w:t>
+            </w:r>
+          </w:p>
+        </w:tc>
+        <w:tc>
+          <w:tcPr>
+            <w:tcW w:type="dxa" w:w="1296"/>
+          </w:tcPr>
+          <w:p>
+            <w:r/>
+            <w:r>
+              <w:rPr>
+                <w:b w:val="0"/>
+                <w:sz w:val="20"/>
+              </w:rPr>
+              <w:t>To 2τ = 86.5% of final value</w:t>
+            </w:r>
+          </w:p>
+        </w:tc>
+      </w:tr>
+      <w:tr>
+        <w:tc>
+          <w:tcPr>
+            <w:tcW w:type="dxa" w:w="1296"/>
+          </w:tcPr>
+          <w:p>
+            <w:r/>
+            <w:r>
+              <w:rPr>
+                <w:b w:val="0"/>
+                <w:sz w:val="20"/>
+              </w:rPr>
+              <w:t>Update rate (UP/DN)</w:t>
+            </w:r>
+          </w:p>
+        </w:tc>
+        <w:tc>
+          <w:tcPr>
+            <w:tcW w:type="dxa" w:w="1296"/>
+          </w:tcPr>
+          <w:p>
+            <w:r/>
+            <w:r>
+              <w:rPr>
+                <w:b w:val="0"/>
+                <w:sz w:val="20"/>
+              </w:rPr>
+              <w:t>f_update</w:t>
+            </w:r>
+          </w:p>
+        </w:tc>
+        <w:tc>
+          <w:tcPr>
+            <w:tcW w:type="dxa" w:w="1296"/>
+          </w:tcPr>
+          <w:p>
+            <w:r/>
+            <w:r>
+              <w:rPr>
+                <w:b w:val="0"/>
+                <w:sz w:val="20"/>
+              </w:rPr>
+            </w:r>
+          </w:p>
+        </w:tc>
+        <w:tc>
+          <w:tcPr>
+            <w:tcW w:type="dxa" w:w="1296"/>
+          </w:tcPr>
+          <w:p>
+            <w:r/>
+            <w:r>
+              <w:rPr>
+                <w:b w:val="0"/>
+                <w:sz w:val="20"/>
+              </w:rPr>
+              <w:t>TBD</w:t>
+            </w:r>
+          </w:p>
+        </w:tc>
+        <w:tc>
+          <w:tcPr>
+            <w:tcW w:type="dxa" w:w="1296"/>
+          </w:tcPr>
+          <w:p>
+            <w:r/>
+            <w:r>
+              <w:rPr>
+                <w:b w:val="0"/>
+                <w:sz w:val="20"/>
+              </w:rPr>
+            </w:r>
+          </w:p>
+        </w:tc>
+        <w:tc>
+          <w:tcPr>
+            <w:tcW w:type="dxa" w:w="1296"/>
+          </w:tcPr>
+          <w:p>
+            <w:r/>
+            <w:r>
+              <w:rPr>
+                <w:b w:val="0"/>
+                <w:sz w:val="20"/>
+              </w:rPr>
+              <w:t>GHz</w:t>
+            </w:r>
+          </w:p>
+        </w:tc>
+        <w:tc>
+          <w:tcPr>
+            <w:tcW w:type="dxa" w:w="1296"/>
+          </w:tcPr>
+          <w:p>
+            <w:r/>
+            <w:r>
+              <w:rPr>
+                <w:b w:val="0"/>
+                <w:sz w:val="20"/>
+              </w:rPr>
+              <w:t>How often the code can change. The DAC is fully thermometric: every UP/DN pulse turns exactly one unit on or off, so the output always moves by exactly 1 LSB. There is no binary-to-thermometer decoder, so no decode delay and no multi-bit switching. Max rate = 1 / (UP/DN-to-switch delay + 1-LSB settling to 2τ). A faster pulse arrives before the previous step has settled.</w:t>
+            </w:r>
+          </w:p>
+        </w:tc>
+      </w:tr>
+      <w:tr>
+        <w:tc>
+          <w:tcPr>
+            <w:tcW w:type="dxa" w:w="1296"/>
+          </w:tcPr>
+          <w:p>
+            <w:r/>
+            <w:r>
+              <w:rPr>
+                <w:b w:val="0"/>
+                <w:sz w:val="20"/>
+              </w:rPr>
               <w:t>Glitch (1-LSB step)</w:t>
             </w:r>
           </w:p>
@@ -3372,7 +3644,7 @@
                 <w:b w:val="0"/>
                 <w:sz w:val="20"/>
               </w:rPr>
-              <w:t>Area of output error during a code step; 1 unit switches, so glitch is small and same for all codes. See 6.3</w:t>
+              <w:t>Glitch energy = area (mV × ps) of the output error spike during a code step, caused by switch timing skew and clock/charge feed-through. In a binary DAC the worst glitch is at mid-code (many bits switch at once). Here only one unit switches per step, so the glitch is small and the same for every code. Measured on V_diff.</w:t>
             </w:r>
           </w:p>
         </w:tc>
@@ -3811,7 +4083,7 @@
     </w:p>
     <w:p>
       <w:r>
-        <w:t>For a fully thermometric differential current-steering DAC with N = 2^B - 1 unit elements (B = 8, N = 255). All quantities are differential output voltages: V_diff = V_outp - V_outn, V_FS = 500 mVpp, V_LSB = V_FS / 255 ≈ 1.961 mV.</w:t>
+        <w:t>For a fully thermometric differential current-steering DAC with N = 2^B - 1 unit elements (B = 8, N = 255). All quantities are differential output voltages: V_diff = V_outp - V_outn, V_FS = 1000 mVpp, V_LSB = V_FS / 255 ≈ 3.922 mV.</w:t>
       </w:r>
     </w:p>
     <w:p>
@@ -5221,7 +5493,7 @@
                 <w:b w:val="0"/>
                 <w:sz w:val="20"/>
               </w:rPr>
-              <w:t>500 mVpp diff ±5%</w:t>
+              <w:t>1000 mVpp diff ±5%</w:t>
             </w:r>
           </w:p>
         </w:tc>

</xml_diff>

<commit_message>
Spec v0.6: split table into Definitions and Results; R_L +-20%
</commit_message>
<xml_diff>
--- a/doc/HYP_Gen1_CDR_DAC_Spec.docx
+++ b/doc/HYP_Gen1_CDR_DAC_Spec.docx
@@ -129,7 +129,7 @@
                 <w:b w:val="0"/>
                 <w:sz w:val="22"/>
               </w:rPr>
-              <w:t>0.5 (Draft)</w:t>
+              <w:t>0.6 (Draft)</w:t>
             </w:r>
           </w:p>
         </w:tc>
@@ -161,7 +161,7 @@
                 <w:b w:val="0"/>
                 <w:sz w:val="22"/>
               </w:rPr>
-              <w:t>2026-10-18</w:t>
+              <w:t>2026-10-19</w:t>
             </w:r>
           </w:p>
         </w:tc>
@@ -629,6 +629,68 @@
                 <w:sz w:val="20"/>
               </w:rPr>
               <w:t>FS = 1 Vpp diff (LSB 3.922 mV); internal currents I_FS 10 mA / I_LSB 39.2 µA; update-rate and glitch explanations in notes</w:t>
+            </w:r>
+          </w:p>
+        </w:tc>
+      </w:tr>
+      <w:tr>
+        <w:tc>
+          <w:tcPr>
+            <w:tcW w:type="dxa" w:w="2268"/>
+          </w:tcPr>
+          <w:p>
+            <w:r/>
+            <w:r>
+              <w:rPr>
+                <w:b w:val="0"/>
+                <w:sz w:val="20"/>
+              </w:rPr>
+              <w:t>0.6</w:t>
+            </w:r>
+          </w:p>
+        </w:tc>
+        <w:tc>
+          <w:tcPr>
+            <w:tcW w:type="dxa" w:w="2268"/>
+          </w:tcPr>
+          <w:p>
+            <w:r/>
+            <w:r>
+              <w:rPr>
+                <w:b w:val="0"/>
+                <w:sz w:val="20"/>
+              </w:rPr>
+              <w:t>2026-10-19</w:t>
+            </w:r>
+          </w:p>
+        </w:tc>
+        <w:tc>
+          <w:tcPr>
+            <w:tcW w:type="dxa" w:w="2268"/>
+          </w:tcPr>
+          <w:p>
+            <w:r/>
+            <w:r>
+              <w:rPr>
+                <w:b w:val="0"/>
+                <w:sz w:val="20"/>
+              </w:rPr>
+              <w:t>[Author]</w:t>
+            </w:r>
+          </w:p>
+        </w:tc>
+        <w:tc>
+          <w:tcPr>
+            <w:tcW w:type="dxa" w:w="2268"/>
+          </w:tcPr>
+          <w:p>
+            <w:r/>
+            <w:r>
+              <w:rPr>
+                <w:b w:val="0"/>
+                <w:sz w:val="20"/>
+              </w:rPr>
+              <w:t>Spec table split into Definitions (4.1) and Results (4.2); R_L ±20%</w:t>
             </w:r>
           </w:p>
         </w:tc>
@@ -1408,7 +1470,12 @@
         <w:pStyle w:val="Heading2"/>
       </w:pPr>
       <w:r>
-        <w:t>4.1 Key Performance Parameters</w:t>
+        <w:t>4.1 Definitions (Operating Conditions)</w:t>
+      </w:r>
+    </w:p>
+    <w:p>
+      <w:r>
+        <w:t>Given conditions and design inputs the DAC must work with.</w:t>
       </w:r>
     </w:p>
     <w:tbl>
@@ -1767,7 +1834,7 @@
                 <w:b w:val="0"/>
                 <w:sz w:val="20"/>
               </w:rPr>
-              <w:t>Full-scale output (diff)</w:t>
+              <w:t>Supply voltage (high)</w:t>
             </w:r>
           </w:p>
         </w:tc>
@@ -1782,7 +1849,7 @@
                 <w:b w:val="0"/>
                 <w:sz w:val="20"/>
               </w:rPr>
-              <w:t>V_FS</w:t>
+              <w:t>VDD_1V2</w:t>
             </w:r>
           </w:p>
         </w:tc>
@@ -1797,6 +1864,7 @@
                 <w:b w:val="0"/>
                 <w:sz w:val="20"/>
               </w:rPr>
+              <w:t>1.14</w:t>
             </w:r>
           </w:p>
         </w:tc>
@@ -1811,7 +1879,7 @@
                 <w:b w:val="0"/>
                 <w:sz w:val="20"/>
               </w:rPr>
-              <w:t>1000</w:t>
+              <w:t>1.20</w:t>
             </w:r>
           </w:p>
         </w:tc>
@@ -1826,6 +1894,7 @@
                 <w:b w:val="0"/>
                 <w:sz w:val="20"/>
               </w:rPr>
+              <w:t>1.26</w:t>
             </w:r>
           </w:p>
         </w:tc>
@@ -1840,7 +1909,7 @@
                 <w:b w:val="0"/>
                 <w:sz w:val="20"/>
               </w:rPr>
-              <w:t>mVpp</w:t>
+              <w:t>V</w:t>
             </w:r>
           </w:p>
         </w:tc>
@@ -1855,7 +1924,6 @@
                 <w:b w:val="0"/>
                 <w:sz w:val="20"/>
               </w:rPr>
-              <w:t>Differential peak-to-peak (±500 mV)</w:t>
             </w:r>
           </w:p>
         </w:tc>
@@ -1872,7 +1940,7 @@
                 <w:b w:val="0"/>
                 <w:sz w:val="20"/>
               </w:rPr>
-              <w:t>LSB voltage (diff)</w:t>
+              <w:t>Supply voltage (low)</w:t>
             </w:r>
           </w:p>
         </w:tc>
@@ -1887,7 +1955,7 @@
                 <w:b w:val="0"/>
                 <w:sz w:val="20"/>
               </w:rPr>
-              <w:t>V_LSB</w:t>
+              <w:t>VDD_0V9</w:t>
             </w:r>
           </w:p>
         </w:tc>
@@ -1902,6 +1970,7 @@
                 <w:b w:val="0"/>
                 <w:sz w:val="20"/>
               </w:rPr>
+              <w:t>0.85</w:t>
             </w:r>
           </w:p>
         </w:tc>
@@ -1916,7 +1985,7 @@
                 <w:b w:val="0"/>
                 <w:sz w:val="20"/>
               </w:rPr>
-              <w:t>3.922</w:t>
+              <w:t>0.90</w:t>
             </w:r>
           </w:p>
         </w:tc>
@@ -1931,6 +2000,7 @@
                 <w:b w:val="0"/>
                 <w:sz w:val="20"/>
               </w:rPr>
+              <w:t>0.95</w:t>
             </w:r>
           </w:p>
         </w:tc>
@@ -1945,7 +2015,7 @@
                 <w:b w:val="0"/>
                 <w:sz w:val="20"/>
               </w:rPr>
-              <w:t>mV</w:t>
+              <w:t>V</w:t>
             </w:r>
           </w:p>
         </w:tc>
@@ -1960,7 +2030,6 @@
                 <w:b w:val="0"/>
                 <w:sz w:val="20"/>
               </w:rPr>
-              <w:t>V_FS / 255</w:t>
             </w:r>
           </w:p>
         </w:tc>
@@ -1977,7 +2046,7 @@
                 <w:b w:val="0"/>
                 <w:sz w:val="20"/>
               </w:rPr>
-              <w:t>Output common-mode</w:t>
+              <w:t>Temperature</w:t>
             </w:r>
           </w:p>
         </w:tc>
@@ -1992,7 +2061,7 @@
                 <w:b w:val="0"/>
                 <w:sz w:val="20"/>
               </w:rPr>
-              <w:t>V_CM</w:t>
+              <w:t>T</w:t>
             </w:r>
           </w:p>
         </w:tc>
@@ -2007,7 +2076,7 @@
                 <w:b w:val="0"/>
                 <w:sz w:val="20"/>
               </w:rPr>
-              <w:t>332.5</w:t>
+              <w:t>-10</w:t>
             </w:r>
           </w:p>
         </w:tc>
@@ -2022,7 +2091,7 @@
                 <w:b w:val="0"/>
                 <w:sz w:val="20"/>
               </w:rPr>
-              <w:t>350</w:t>
+              <w:t>50 / 85</w:t>
             </w:r>
           </w:p>
         </w:tc>
@@ -2037,7 +2106,7 @@
                 <w:b w:val="0"/>
                 <w:sz w:val="20"/>
               </w:rPr>
-              <w:t>367.5</w:t>
+              <w:t>110</w:t>
             </w:r>
           </w:p>
         </w:tc>
@@ -2052,7 +2121,7 @@
                 <w:b w:val="0"/>
                 <w:sz w:val="20"/>
               </w:rPr>
-              <w:t>mV</w:t>
+              <w:t>°C</w:t>
             </w:r>
           </w:p>
         </w:tc>
@@ -2067,7 +2136,7 @@
                 <w:b w:val="0"/>
                 <w:sz w:val="20"/>
               </w:rPr>
-              <w:t>±5% – self spec</w:t>
+              <w:t>Typ: 50 and 85 (most likely both)</w:t>
             </w:r>
           </w:p>
         </w:tc>
@@ -2114,6 +2183,7 @@
                 <w:b w:val="0"/>
                 <w:sz w:val="20"/>
               </w:rPr>
+              <w:t>40</w:t>
             </w:r>
           </w:p>
         </w:tc>
@@ -2143,6 +2213,7 @@
                 <w:b w:val="0"/>
                 <w:sz w:val="20"/>
               </w:rPr>
+              <w:t>60</w:t>
             </w:r>
           </w:p>
         </w:tc>
@@ -2172,7 +2243,7 @@
                 <w:b w:val="0"/>
                 <w:sz w:val="20"/>
               </w:rPr>
-              <w:t>Per side</w:t>
+              <w:t>Per side; ±20% variation</w:t>
             </w:r>
           </w:p>
         </w:tc>
@@ -2189,7 +2260,7 @@
                 <w:b w:val="0"/>
                 <w:sz w:val="20"/>
               </w:rPr>
-              <w:t>Full-scale current</w:t>
+              <w:t>Load capacitance</w:t>
             </w:r>
           </w:p>
         </w:tc>
@@ -2204,7 +2275,7 @@
                 <w:b w:val="0"/>
                 <w:sz w:val="20"/>
               </w:rPr>
-              <w:t>I_FS</w:t>
+              <w:t>C_L</w:t>
             </w:r>
           </w:p>
         </w:tc>
@@ -2233,7 +2304,7 @@
                 <w:b w:val="0"/>
                 <w:sz w:val="20"/>
               </w:rPr>
-              <w:t>10</w:t>
+              <w:t>TBD</w:t>
             </w:r>
           </w:p>
         </w:tc>
@@ -2262,7 +2333,7 @@
                 <w:b w:val="0"/>
                 <w:sz w:val="20"/>
               </w:rPr>
-              <w:t>mA</w:t>
+              <w:t>fF</w:t>
             </w:r>
           </w:p>
         </w:tc>
@@ -2277,7 +2348,7 @@
                 <w:b w:val="0"/>
                 <w:sz w:val="20"/>
               </w:rPr>
-              <w:t>Internal spec; V_FS = 2·I_FS·R_L</w:t>
+              <w:t>VCO input – to be completed</w:t>
             </w:r>
           </w:p>
         </w:tc>
@@ -2294,7 +2365,7 @@
                 <w:b w:val="0"/>
                 <w:sz w:val="20"/>
               </w:rPr>
-              <w:t>LSB (unit) current</w:t>
+              <w:t>Full-scale current</w:t>
             </w:r>
           </w:p>
         </w:tc>
@@ -2309,7 +2380,7 @@
                 <w:b w:val="0"/>
                 <w:sz w:val="20"/>
               </w:rPr>
-              <w:t>I_LSB</w:t>
+              <w:t>I_FS</w:t>
             </w:r>
           </w:p>
         </w:tc>
@@ -2338,7 +2409,7 @@
                 <w:b w:val="0"/>
                 <w:sz w:val="20"/>
               </w:rPr>
-              <w:t>39.2</w:t>
+              <w:t>10</w:t>
             </w:r>
           </w:p>
         </w:tc>
@@ -2367,7 +2438,7 @@
                 <w:b w:val="0"/>
                 <w:sz w:val="20"/>
               </w:rPr>
-              <w:t>µA</w:t>
+              <w:t>mA</w:t>
             </w:r>
           </w:p>
         </w:tc>
@@ -2382,7 +2453,7 @@
                 <w:b w:val="0"/>
                 <w:sz w:val="20"/>
               </w:rPr>
-              <w:t>Internal spec; I_FS / 255</w:t>
+              <w:t>Internal spec; V_FS = 2·I_FS·R_L</w:t>
             </w:r>
           </w:p>
         </w:tc>
@@ -2399,7 +2470,7 @@
                 <w:b w:val="0"/>
                 <w:sz w:val="20"/>
               </w:rPr>
-              <w:t>Full-scale (gain) error</w:t>
+              <w:t>LSB (unit) current</w:t>
             </w:r>
           </w:p>
         </w:tc>
@@ -2414,7 +2485,7 @@
                 <w:b w:val="0"/>
                 <w:sz w:val="20"/>
               </w:rPr>
-              <w:t>GE</w:t>
+              <w:t>I_LSB</w:t>
             </w:r>
           </w:p>
         </w:tc>
@@ -2429,7 +2500,6 @@
                 <w:b w:val="0"/>
                 <w:sz w:val="20"/>
               </w:rPr>
-              <w:t>-5</w:t>
             </w:r>
           </w:p>
         </w:tc>
@@ -2444,6 +2514,7 @@
                 <w:b w:val="0"/>
                 <w:sz w:val="20"/>
               </w:rPr>
+              <w:t>39.2</w:t>
             </w:r>
           </w:p>
         </w:tc>
@@ -2458,7 +2529,6 @@
                 <w:b w:val="0"/>
                 <w:sz w:val="20"/>
               </w:rPr>
-              <w:t>+5</w:t>
             </w:r>
           </w:p>
         </w:tc>
@@ -2473,7 +2543,7 @@
                 <w:b w:val="0"/>
                 <w:sz w:val="20"/>
               </w:rPr>
-              <w:t>%</w:t>
+              <w:t>µA</w:t>
             </w:r>
           </w:p>
         </w:tc>
@@ -2488,1585 +2558,7 @@
                 <w:b w:val="0"/>
                 <w:sz w:val="20"/>
               </w:rPr>
-              <w:t>Self spec</w:t>
-            </w:r>
-          </w:p>
-        </w:tc>
-      </w:tr>
-      <w:tr>
-        <w:tc>
-          <w:tcPr>
-            <w:tcW w:type="dxa" w:w="1296"/>
-          </w:tcPr>
-          <w:p>
-            <w:r/>
-            <w:r>
-              <w:rPr>
-                <w:b w:val="0"/>
-                <w:sz w:val="20"/>
-              </w:rPr>
-              <w:t>DNL</w:t>
-            </w:r>
-          </w:p>
-        </w:tc>
-        <w:tc>
-          <w:tcPr>
-            <w:tcW w:type="dxa" w:w="1296"/>
-          </w:tcPr>
-          <w:p>
-            <w:r/>
-            <w:r>
-              <w:rPr>
-                <w:b w:val="0"/>
-                <w:sz w:val="20"/>
-              </w:rPr>
-              <w:t>DNL</w:t>
-            </w:r>
-          </w:p>
-        </w:tc>
-        <w:tc>
-          <w:tcPr>
-            <w:tcW w:type="dxa" w:w="1296"/>
-          </w:tcPr>
-          <w:p>
-            <w:r/>
-            <w:r>
-              <w:rPr>
-                <w:b w:val="0"/>
-                <w:sz w:val="20"/>
-              </w:rPr>
-              <w:t>-0.3</w:t>
-            </w:r>
-          </w:p>
-        </w:tc>
-        <w:tc>
-          <w:tcPr>
-            <w:tcW w:type="dxa" w:w="1296"/>
-          </w:tcPr>
-          <w:p>
-            <w:r/>
-            <w:r>
-              <w:rPr>
-                <w:b w:val="0"/>
-                <w:sz w:val="20"/>
-              </w:rPr>
-            </w:r>
-          </w:p>
-        </w:tc>
-        <w:tc>
-          <w:tcPr>
-            <w:tcW w:type="dxa" w:w="1296"/>
-          </w:tcPr>
-          <w:p>
-            <w:r/>
-            <w:r>
-              <w:rPr>
-                <w:b w:val="0"/>
-                <w:sz w:val="20"/>
-              </w:rPr>
-              <w:t>+0.3</w:t>
-            </w:r>
-          </w:p>
-        </w:tc>
-        <w:tc>
-          <w:tcPr>
-            <w:tcW w:type="dxa" w:w="1296"/>
-          </w:tcPr>
-          <w:p>
-            <w:r/>
-            <w:r>
-              <w:rPr>
-                <w:b w:val="0"/>
-                <w:sz w:val="20"/>
-              </w:rPr>
-              <w:t>LSB</w:t>
-            </w:r>
-          </w:p>
-        </w:tc>
-        <w:tc>
-          <w:tcPr>
-            <w:tcW w:type="dxa" w:w="1296"/>
-          </w:tcPr>
-          <w:p>
-            <w:r/>
-            <w:r>
-              <w:rPr>
-                <w:b w:val="0"/>
-                <w:sz w:val="20"/>
-              </w:rPr>
-              <w:t>Including VCO error</w:t>
-            </w:r>
-          </w:p>
-        </w:tc>
-      </w:tr>
-      <w:tr>
-        <w:tc>
-          <w:tcPr>
-            <w:tcW w:type="dxa" w:w="1296"/>
-          </w:tcPr>
-          <w:p>
-            <w:r/>
-            <w:r>
-              <w:rPr>
-                <w:b w:val="0"/>
-                <w:sz w:val="20"/>
-              </w:rPr>
-              <w:t>DNL budget – VCO share</w:t>
-            </w:r>
-          </w:p>
-        </w:tc>
-        <w:tc>
-          <w:tcPr>
-            <w:tcW w:type="dxa" w:w="1296"/>
-          </w:tcPr>
-          <w:p>
-            <w:r/>
-            <w:r>
-              <w:rPr>
-                <w:b w:val="0"/>
-                <w:sz w:val="20"/>
-              </w:rPr>
-              <w:t>DNL_VCO</w:t>
-            </w:r>
-          </w:p>
-        </w:tc>
-        <w:tc>
-          <w:tcPr>
-            <w:tcW w:type="dxa" w:w="1296"/>
-          </w:tcPr>
-          <w:p>
-            <w:r/>
-            <w:r>
-              <w:rPr>
-                <w:b w:val="0"/>
-                <w:sz w:val="20"/>
-              </w:rPr>
-            </w:r>
-          </w:p>
-        </w:tc>
-        <w:tc>
-          <w:tcPr>
-            <w:tcW w:type="dxa" w:w="1296"/>
-          </w:tcPr>
-          <w:p>
-            <w:r/>
-            <w:r>
-              <w:rPr>
-                <w:b w:val="0"/>
-                <w:sz w:val="20"/>
-              </w:rPr>
-              <w:t>TBD</w:t>
-            </w:r>
-          </w:p>
-        </w:tc>
-        <w:tc>
-          <w:tcPr>
-            <w:tcW w:type="dxa" w:w="1296"/>
-          </w:tcPr>
-          <w:p>
-            <w:r/>
-            <w:r>
-              <w:rPr>
-                <w:b w:val="0"/>
-                <w:sz w:val="20"/>
-              </w:rPr>
-            </w:r>
-          </w:p>
-        </w:tc>
-        <w:tc>
-          <w:tcPr>
-            <w:tcW w:type="dxa" w:w="1296"/>
-          </w:tcPr>
-          <w:p>
-            <w:r/>
-            <w:r>
-              <w:rPr>
-                <w:b w:val="0"/>
-                <w:sz w:val="20"/>
-              </w:rPr>
-              <w:t>LSB</w:t>
-            </w:r>
-          </w:p>
-        </w:tc>
-        <w:tc>
-          <w:tcPr>
-            <w:tcW w:type="dxa" w:w="1296"/>
-          </w:tcPr>
-          <w:p>
-            <w:r/>
-            <w:r>
-              <w:rPr>
-                <w:b w:val="0"/>
-                <w:sz w:val="20"/>
-              </w:rPr>
-              <w:t>OPEN – part of the ±0.3 LSB, not known yet</w:t>
-            </w:r>
-          </w:p>
-        </w:tc>
-      </w:tr>
-      <w:tr>
-        <w:tc>
-          <w:tcPr>
-            <w:tcW w:type="dxa" w:w="1296"/>
-          </w:tcPr>
-          <w:p>
-            <w:r/>
-            <w:r>
-              <w:rPr>
-                <w:b w:val="0"/>
-                <w:sz w:val="20"/>
-              </w:rPr>
-              <w:t>INL</w:t>
-            </w:r>
-          </w:p>
-        </w:tc>
-        <w:tc>
-          <w:tcPr>
-            <w:tcW w:type="dxa" w:w="1296"/>
-          </w:tcPr>
-          <w:p>
-            <w:r/>
-            <w:r>
-              <w:rPr>
-                <w:b w:val="0"/>
-                <w:sz w:val="20"/>
-              </w:rPr>
-              <w:t>INL</w:t>
-            </w:r>
-          </w:p>
-        </w:tc>
-        <w:tc>
-          <w:tcPr>
-            <w:tcW w:type="dxa" w:w="1296"/>
-          </w:tcPr>
-          <w:p>
-            <w:r/>
-            <w:r>
-              <w:rPr>
-                <w:b w:val="0"/>
-                <w:sz w:val="20"/>
-              </w:rPr>
-            </w:r>
-          </w:p>
-        </w:tc>
-        <w:tc>
-          <w:tcPr>
-            <w:tcW w:type="dxa" w:w="1296"/>
-          </w:tcPr>
-          <w:p>
-            <w:r/>
-            <w:r>
-              <w:rPr>
-                <w:b w:val="0"/>
-                <w:sz w:val="20"/>
-              </w:rPr>
-              <w:t>TBD</w:t>
-            </w:r>
-          </w:p>
-        </w:tc>
-        <w:tc>
-          <w:tcPr>
-            <w:tcW w:type="dxa" w:w="1296"/>
-          </w:tcPr>
-          <w:p>
-            <w:r/>
-            <w:r>
-              <w:rPr>
-                <w:b w:val="0"/>
-                <w:sz w:val="20"/>
-              </w:rPr>
-            </w:r>
-          </w:p>
-        </w:tc>
-        <w:tc>
-          <w:tcPr>
-            <w:tcW w:type="dxa" w:w="1296"/>
-          </w:tcPr>
-          <w:p>
-            <w:r/>
-            <w:r>
-              <w:rPr>
-                <w:b w:val="0"/>
-                <w:sz w:val="20"/>
-              </w:rPr>
-              <w:t>LSB</w:t>
-            </w:r>
-          </w:p>
-        </w:tc>
-        <w:tc>
-          <w:tcPr>
-            <w:tcW w:type="dxa" w:w="1296"/>
-          </w:tcPr>
-          <w:p>
-            <w:r/>
-            <w:r>
-              <w:rPr>
-                <w:b w:val="0"/>
-                <w:sz w:val="20"/>
-              </w:rPr>
-              <w:t>Report only</w:t>
-            </w:r>
-          </w:p>
-        </w:tc>
-      </w:tr>
-      <w:tr>
-        <w:tc>
-          <w:tcPr>
-            <w:tcW w:type="dxa" w:w="1296"/>
-          </w:tcPr>
-          <w:p>
-            <w:r/>
-            <w:r>
-              <w:rPr>
-                <w:b w:val="0"/>
-                <w:sz w:val="20"/>
-              </w:rPr>
-              <w:t>Supply voltage (high)</w:t>
-            </w:r>
-          </w:p>
-        </w:tc>
-        <w:tc>
-          <w:tcPr>
-            <w:tcW w:type="dxa" w:w="1296"/>
-          </w:tcPr>
-          <w:p>
-            <w:r/>
-            <w:r>
-              <w:rPr>
-                <w:b w:val="0"/>
-                <w:sz w:val="20"/>
-              </w:rPr>
-              <w:t>VDD_1V2</w:t>
-            </w:r>
-          </w:p>
-        </w:tc>
-        <w:tc>
-          <w:tcPr>
-            <w:tcW w:type="dxa" w:w="1296"/>
-          </w:tcPr>
-          <w:p>
-            <w:r/>
-            <w:r>
-              <w:rPr>
-                <w:b w:val="0"/>
-                <w:sz w:val="20"/>
-              </w:rPr>
-              <w:t>1.14</w:t>
-            </w:r>
-          </w:p>
-        </w:tc>
-        <w:tc>
-          <w:tcPr>
-            <w:tcW w:type="dxa" w:w="1296"/>
-          </w:tcPr>
-          <w:p>
-            <w:r/>
-            <w:r>
-              <w:rPr>
-                <w:b w:val="0"/>
-                <w:sz w:val="20"/>
-              </w:rPr>
-              <w:t>1.20</w:t>
-            </w:r>
-          </w:p>
-        </w:tc>
-        <w:tc>
-          <w:tcPr>
-            <w:tcW w:type="dxa" w:w="1296"/>
-          </w:tcPr>
-          <w:p>
-            <w:r/>
-            <w:r>
-              <w:rPr>
-                <w:b w:val="0"/>
-                <w:sz w:val="20"/>
-              </w:rPr>
-              <w:t>1.26</w:t>
-            </w:r>
-          </w:p>
-        </w:tc>
-        <w:tc>
-          <w:tcPr>
-            <w:tcW w:type="dxa" w:w="1296"/>
-          </w:tcPr>
-          <w:p>
-            <w:r/>
-            <w:r>
-              <w:rPr>
-                <w:b w:val="0"/>
-                <w:sz w:val="20"/>
-              </w:rPr>
-              <w:t>V</w:t>
-            </w:r>
-          </w:p>
-        </w:tc>
-        <w:tc>
-          <w:tcPr>
-            <w:tcW w:type="dxa" w:w="1296"/>
-          </w:tcPr>
-          <w:p>
-            <w:r/>
-            <w:r>
-              <w:rPr>
-                <w:b w:val="0"/>
-                <w:sz w:val="20"/>
-              </w:rPr>
-            </w:r>
-          </w:p>
-        </w:tc>
-      </w:tr>
-      <w:tr>
-        <w:tc>
-          <w:tcPr>
-            <w:tcW w:type="dxa" w:w="1296"/>
-          </w:tcPr>
-          <w:p>
-            <w:r/>
-            <w:r>
-              <w:rPr>
-                <w:b w:val="0"/>
-                <w:sz w:val="20"/>
-              </w:rPr>
-              <w:t>Supply voltage (low)</w:t>
-            </w:r>
-          </w:p>
-        </w:tc>
-        <w:tc>
-          <w:tcPr>
-            <w:tcW w:type="dxa" w:w="1296"/>
-          </w:tcPr>
-          <w:p>
-            <w:r/>
-            <w:r>
-              <w:rPr>
-                <w:b w:val="0"/>
-                <w:sz w:val="20"/>
-              </w:rPr>
-              <w:t>VDD_0V9</w:t>
-            </w:r>
-          </w:p>
-        </w:tc>
-        <w:tc>
-          <w:tcPr>
-            <w:tcW w:type="dxa" w:w="1296"/>
-          </w:tcPr>
-          <w:p>
-            <w:r/>
-            <w:r>
-              <w:rPr>
-                <w:b w:val="0"/>
-                <w:sz w:val="20"/>
-              </w:rPr>
-              <w:t>0.85</w:t>
-            </w:r>
-          </w:p>
-        </w:tc>
-        <w:tc>
-          <w:tcPr>
-            <w:tcW w:type="dxa" w:w="1296"/>
-          </w:tcPr>
-          <w:p>
-            <w:r/>
-            <w:r>
-              <w:rPr>
-                <w:b w:val="0"/>
-                <w:sz w:val="20"/>
-              </w:rPr>
-              <w:t>0.90</w:t>
-            </w:r>
-          </w:p>
-        </w:tc>
-        <w:tc>
-          <w:tcPr>
-            <w:tcW w:type="dxa" w:w="1296"/>
-          </w:tcPr>
-          <w:p>
-            <w:r/>
-            <w:r>
-              <w:rPr>
-                <w:b w:val="0"/>
-                <w:sz w:val="20"/>
-              </w:rPr>
-              <w:t>0.95</w:t>
-            </w:r>
-          </w:p>
-        </w:tc>
-        <w:tc>
-          <w:tcPr>
-            <w:tcW w:type="dxa" w:w="1296"/>
-          </w:tcPr>
-          <w:p>
-            <w:r/>
-            <w:r>
-              <w:rPr>
-                <w:b w:val="0"/>
-                <w:sz w:val="20"/>
-              </w:rPr>
-              <w:t>V</w:t>
-            </w:r>
-          </w:p>
-        </w:tc>
-        <w:tc>
-          <w:tcPr>
-            <w:tcW w:type="dxa" w:w="1296"/>
-          </w:tcPr>
-          <w:p>
-            <w:r/>
-            <w:r>
-              <w:rPr>
-                <w:b w:val="0"/>
-                <w:sz w:val="20"/>
-              </w:rPr>
-            </w:r>
-          </w:p>
-        </w:tc>
-      </w:tr>
-      <w:tr>
-        <w:tc>
-          <w:tcPr>
-            <w:tcW w:type="dxa" w:w="1296"/>
-          </w:tcPr>
-          <w:p>
-            <w:r/>
-            <w:r>
-              <w:rPr>
-                <w:b w:val="0"/>
-                <w:sz w:val="20"/>
-              </w:rPr>
-              <w:t>Power – 1.2 V supply</w:t>
-            </w:r>
-          </w:p>
-        </w:tc>
-        <w:tc>
-          <w:tcPr>
-            <w:tcW w:type="dxa" w:w="1296"/>
-          </w:tcPr>
-          <w:p>
-            <w:r/>
-            <w:r>
-              <w:rPr>
-                <w:b w:val="0"/>
-                <w:sz w:val="20"/>
-              </w:rPr>
-              <w:t>P_1V2</w:t>
-            </w:r>
-          </w:p>
-        </w:tc>
-        <w:tc>
-          <w:tcPr>
-            <w:tcW w:type="dxa" w:w="1296"/>
-          </w:tcPr>
-          <w:p>
-            <w:r/>
-            <w:r>
-              <w:rPr>
-                <w:b w:val="0"/>
-                <w:sz w:val="20"/>
-              </w:rPr>
-            </w:r>
-          </w:p>
-        </w:tc>
-        <w:tc>
-          <w:tcPr>
-            <w:tcW w:type="dxa" w:w="1296"/>
-          </w:tcPr>
-          <w:p>
-            <w:r/>
-            <w:r>
-              <w:rPr>
-                <w:b w:val="0"/>
-                <w:sz w:val="20"/>
-              </w:rPr>
-              <w:t>TBD</w:t>
-            </w:r>
-          </w:p>
-        </w:tc>
-        <w:tc>
-          <w:tcPr>
-            <w:tcW w:type="dxa" w:w="1296"/>
-          </w:tcPr>
-          <w:p>
-            <w:r/>
-            <w:r>
-              <w:rPr>
-                <w:b w:val="0"/>
-                <w:sz w:val="20"/>
-              </w:rPr>
-            </w:r>
-          </w:p>
-        </w:tc>
-        <w:tc>
-          <w:tcPr>
-            <w:tcW w:type="dxa" w:w="1296"/>
-          </w:tcPr>
-          <w:p>
-            <w:r/>
-            <w:r>
-              <w:rPr>
-                <w:b w:val="0"/>
-                <w:sz w:val="20"/>
-              </w:rPr>
-              <w:t>mW</w:t>
-            </w:r>
-          </w:p>
-        </w:tc>
-        <w:tc>
-          <w:tcPr>
-            <w:tcW w:type="dxa" w:w="1296"/>
-          </w:tcPr>
-          <w:p>
-            <w:r/>
-            <w:r>
-              <w:rPr>
-                <w:b w:val="0"/>
-                <w:sz w:val="20"/>
-              </w:rPr>
-            </w:r>
-          </w:p>
-        </w:tc>
-      </w:tr>
-      <w:tr>
-        <w:tc>
-          <w:tcPr>
-            <w:tcW w:type="dxa" w:w="1296"/>
-          </w:tcPr>
-          <w:p>
-            <w:r/>
-            <w:r>
-              <w:rPr>
-                <w:b w:val="0"/>
-                <w:sz w:val="20"/>
-              </w:rPr>
-              <w:t>Power – 0.9 V supply</w:t>
-            </w:r>
-          </w:p>
-        </w:tc>
-        <w:tc>
-          <w:tcPr>
-            <w:tcW w:type="dxa" w:w="1296"/>
-          </w:tcPr>
-          <w:p>
-            <w:r/>
-            <w:r>
-              <w:rPr>
-                <w:b w:val="0"/>
-                <w:sz w:val="20"/>
-              </w:rPr>
-              <w:t>P_0V9</w:t>
-            </w:r>
-          </w:p>
-        </w:tc>
-        <w:tc>
-          <w:tcPr>
-            <w:tcW w:type="dxa" w:w="1296"/>
-          </w:tcPr>
-          <w:p>
-            <w:r/>
-            <w:r>
-              <w:rPr>
-                <w:b w:val="0"/>
-                <w:sz w:val="20"/>
-              </w:rPr>
-            </w:r>
-          </w:p>
-        </w:tc>
-        <w:tc>
-          <w:tcPr>
-            <w:tcW w:type="dxa" w:w="1296"/>
-          </w:tcPr>
-          <w:p>
-            <w:r/>
-            <w:r>
-              <w:rPr>
-                <w:b w:val="0"/>
-                <w:sz w:val="20"/>
-              </w:rPr>
-              <w:t>TBD</w:t>
-            </w:r>
-          </w:p>
-        </w:tc>
-        <w:tc>
-          <w:tcPr>
-            <w:tcW w:type="dxa" w:w="1296"/>
-          </w:tcPr>
-          <w:p>
-            <w:r/>
-            <w:r>
-              <w:rPr>
-                <w:b w:val="0"/>
-                <w:sz w:val="20"/>
-              </w:rPr>
-            </w:r>
-          </w:p>
-        </w:tc>
-        <w:tc>
-          <w:tcPr>
-            <w:tcW w:type="dxa" w:w="1296"/>
-          </w:tcPr>
-          <w:p>
-            <w:r/>
-            <w:r>
-              <w:rPr>
-                <w:b w:val="0"/>
-                <w:sz w:val="20"/>
-              </w:rPr>
-              <w:t>mW</w:t>
-            </w:r>
-          </w:p>
-        </w:tc>
-        <w:tc>
-          <w:tcPr>
-            <w:tcW w:type="dxa" w:w="1296"/>
-          </w:tcPr>
-          <w:p>
-            <w:r/>
-            <w:r>
-              <w:rPr>
-                <w:b w:val="0"/>
-                <w:sz w:val="20"/>
-              </w:rPr>
-            </w:r>
-          </w:p>
-        </w:tc>
-      </w:tr>
-      <w:tr>
-        <w:tc>
-          <w:tcPr>
-            <w:tcW w:type="dxa" w:w="1296"/>
-          </w:tcPr>
-          <w:p>
-            <w:r/>
-            <w:r>
-              <w:rPr>
-                <w:b w:val="0"/>
-                <w:sz w:val="20"/>
-              </w:rPr>
-              <w:t>Settling time (1 LSB)</w:t>
-            </w:r>
-          </w:p>
-        </w:tc>
-        <w:tc>
-          <w:tcPr>
-            <w:tcW w:type="dxa" w:w="1296"/>
-          </w:tcPr>
-          <w:p>
-            <w:r/>
-            <w:r>
-              <w:rPr>
-                <w:b w:val="0"/>
-                <w:sz w:val="20"/>
-              </w:rPr>
-              <w:t>t_set_LSB</w:t>
-            </w:r>
-          </w:p>
-        </w:tc>
-        <w:tc>
-          <w:tcPr>
-            <w:tcW w:type="dxa" w:w="1296"/>
-          </w:tcPr>
-          <w:p>
-            <w:r/>
-            <w:r>
-              <w:rPr>
-                <w:b w:val="0"/>
-                <w:sz w:val="20"/>
-              </w:rPr>
-            </w:r>
-          </w:p>
-        </w:tc>
-        <w:tc>
-          <w:tcPr>
-            <w:tcW w:type="dxa" w:w="1296"/>
-          </w:tcPr>
-          <w:p>
-            <w:r/>
-            <w:r>
-              <w:rPr>
-                <w:b w:val="0"/>
-                <w:sz w:val="20"/>
-              </w:rPr>
-              <w:t>TBD</w:t>
-            </w:r>
-          </w:p>
-        </w:tc>
-        <w:tc>
-          <w:tcPr>
-            <w:tcW w:type="dxa" w:w="1296"/>
-          </w:tcPr>
-          <w:p>
-            <w:r/>
-            <w:r>
-              <w:rPr>
-                <w:b w:val="0"/>
-                <w:sz w:val="20"/>
-              </w:rPr>
-            </w:r>
-          </w:p>
-        </w:tc>
-        <w:tc>
-          <w:tcPr>
-            <w:tcW w:type="dxa" w:w="1296"/>
-          </w:tcPr>
-          <w:p>
-            <w:r/>
-            <w:r>
-              <w:rPr>
-                <w:b w:val="0"/>
-                <w:sz w:val="20"/>
-              </w:rPr>
-              <w:t>ps</w:t>
-            </w:r>
-          </w:p>
-        </w:tc>
-        <w:tc>
-          <w:tcPr>
-            <w:tcW w:type="dxa" w:w="1296"/>
-          </w:tcPr>
-          <w:p>
-            <w:r/>
-            <w:r>
-              <w:rPr>
-                <w:b w:val="0"/>
-                <w:sz w:val="20"/>
-              </w:rPr>
-              <w:t>To 2τ = 86.5% of final value</w:t>
-            </w:r>
-          </w:p>
-        </w:tc>
-      </w:tr>
-      <w:tr>
-        <w:tc>
-          <w:tcPr>
-            <w:tcW w:type="dxa" w:w="1296"/>
-          </w:tcPr>
-          <w:p>
-            <w:r/>
-            <w:r>
-              <w:rPr>
-                <w:b w:val="0"/>
-                <w:sz w:val="20"/>
-              </w:rPr>
-              <w:t>Settling time (full scale)</w:t>
-            </w:r>
-          </w:p>
-        </w:tc>
-        <w:tc>
-          <w:tcPr>
-            <w:tcW w:type="dxa" w:w="1296"/>
-          </w:tcPr>
-          <w:p>
-            <w:r/>
-            <w:r>
-              <w:rPr>
-                <w:b w:val="0"/>
-                <w:sz w:val="20"/>
-              </w:rPr>
-              <w:t>t_set_FS</w:t>
-            </w:r>
-          </w:p>
-        </w:tc>
-        <w:tc>
-          <w:tcPr>
-            <w:tcW w:type="dxa" w:w="1296"/>
-          </w:tcPr>
-          <w:p>
-            <w:r/>
-            <w:r>
-              <w:rPr>
-                <w:b w:val="0"/>
-                <w:sz w:val="20"/>
-              </w:rPr>
-            </w:r>
-          </w:p>
-        </w:tc>
-        <w:tc>
-          <w:tcPr>
-            <w:tcW w:type="dxa" w:w="1296"/>
-          </w:tcPr>
-          <w:p>
-            <w:r/>
-            <w:r>
-              <w:rPr>
-                <w:b w:val="0"/>
-                <w:sz w:val="20"/>
-              </w:rPr>
-              <w:t>TBD</w:t>
-            </w:r>
-          </w:p>
-        </w:tc>
-        <w:tc>
-          <w:tcPr>
-            <w:tcW w:type="dxa" w:w="1296"/>
-          </w:tcPr>
-          <w:p>
-            <w:r/>
-            <w:r>
-              <w:rPr>
-                <w:b w:val="0"/>
-                <w:sz w:val="20"/>
-              </w:rPr>
-            </w:r>
-          </w:p>
-        </w:tc>
-        <w:tc>
-          <w:tcPr>
-            <w:tcW w:type="dxa" w:w="1296"/>
-          </w:tcPr>
-          <w:p>
-            <w:r/>
-            <w:r>
-              <w:rPr>
-                <w:b w:val="0"/>
-                <w:sz w:val="20"/>
-              </w:rPr>
-              <w:t>ns</w:t>
-            </w:r>
-          </w:p>
-        </w:tc>
-        <w:tc>
-          <w:tcPr>
-            <w:tcW w:type="dxa" w:w="1296"/>
-          </w:tcPr>
-          <w:p>
-            <w:r/>
-            <w:r>
-              <w:rPr>
-                <w:b w:val="0"/>
-                <w:sz w:val="20"/>
-              </w:rPr>
-              <w:t>To 2τ = 86.5% of final value</w:t>
-            </w:r>
-          </w:p>
-        </w:tc>
-      </w:tr>
-      <w:tr>
-        <w:tc>
-          <w:tcPr>
-            <w:tcW w:type="dxa" w:w="1296"/>
-          </w:tcPr>
-          <w:p>
-            <w:r/>
-            <w:r>
-              <w:rPr>
-                <w:b w:val="0"/>
-                <w:sz w:val="20"/>
-              </w:rPr>
-              <w:t>Update rate (UP/DN)</w:t>
-            </w:r>
-          </w:p>
-        </w:tc>
-        <w:tc>
-          <w:tcPr>
-            <w:tcW w:type="dxa" w:w="1296"/>
-          </w:tcPr>
-          <w:p>
-            <w:r/>
-            <w:r>
-              <w:rPr>
-                <w:b w:val="0"/>
-                <w:sz w:val="20"/>
-              </w:rPr>
-              <w:t>f_update</w:t>
-            </w:r>
-          </w:p>
-        </w:tc>
-        <w:tc>
-          <w:tcPr>
-            <w:tcW w:type="dxa" w:w="1296"/>
-          </w:tcPr>
-          <w:p>
-            <w:r/>
-            <w:r>
-              <w:rPr>
-                <w:b w:val="0"/>
-                <w:sz w:val="20"/>
-              </w:rPr>
-            </w:r>
-          </w:p>
-        </w:tc>
-        <w:tc>
-          <w:tcPr>
-            <w:tcW w:type="dxa" w:w="1296"/>
-          </w:tcPr>
-          <w:p>
-            <w:r/>
-            <w:r>
-              <w:rPr>
-                <w:b w:val="0"/>
-                <w:sz w:val="20"/>
-              </w:rPr>
-              <w:t>TBD</w:t>
-            </w:r>
-          </w:p>
-        </w:tc>
-        <w:tc>
-          <w:tcPr>
-            <w:tcW w:type="dxa" w:w="1296"/>
-          </w:tcPr>
-          <w:p>
-            <w:r/>
-            <w:r>
-              <w:rPr>
-                <w:b w:val="0"/>
-                <w:sz w:val="20"/>
-              </w:rPr>
-            </w:r>
-          </w:p>
-        </w:tc>
-        <w:tc>
-          <w:tcPr>
-            <w:tcW w:type="dxa" w:w="1296"/>
-          </w:tcPr>
-          <w:p>
-            <w:r/>
-            <w:r>
-              <w:rPr>
-                <w:b w:val="0"/>
-                <w:sz w:val="20"/>
-              </w:rPr>
-              <w:t>GHz</w:t>
-            </w:r>
-          </w:p>
-        </w:tc>
-        <w:tc>
-          <w:tcPr>
-            <w:tcW w:type="dxa" w:w="1296"/>
-          </w:tcPr>
-          <w:p>
-            <w:r/>
-            <w:r>
-              <w:rPr>
-                <w:b w:val="0"/>
-                <w:sz w:val="20"/>
-              </w:rPr>
-              <w:t>How often the code can change. The DAC is fully thermometric: every UP/DN pulse turns exactly one unit on or off, so the output always moves by exactly 1 LSB. There is no binary-to-thermometer decoder, so no decode delay and no multi-bit switching. Max rate = 1 / (UP/DN-to-switch delay + 1-LSB settling to 2τ). A faster pulse arrives before the previous step has settled.</w:t>
-            </w:r>
-          </w:p>
-        </w:tc>
-      </w:tr>
-      <w:tr>
-        <w:tc>
-          <w:tcPr>
-            <w:tcW w:type="dxa" w:w="1296"/>
-          </w:tcPr>
-          <w:p>
-            <w:r/>
-            <w:r>
-              <w:rPr>
-                <w:b w:val="0"/>
-                <w:sz w:val="20"/>
-              </w:rPr>
-              <w:t>Glitch (1-LSB step)</w:t>
-            </w:r>
-          </w:p>
-        </w:tc>
-        <w:tc>
-          <w:tcPr>
-            <w:tcW w:type="dxa" w:w="1296"/>
-          </w:tcPr>
-          <w:p>
-            <w:r/>
-            <w:r>
-              <w:rPr>
-                <w:b w:val="0"/>
-                <w:sz w:val="20"/>
-              </w:rPr>
-              <w:t>G</w:t>
-            </w:r>
-          </w:p>
-        </w:tc>
-        <w:tc>
-          <w:tcPr>
-            <w:tcW w:type="dxa" w:w="1296"/>
-          </w:tcPr>
-          <w:p>
-            <w:r/>
-            <w:r>
-              <w:rPr>
-                <w:b w:val="0"/>
-                <w:sz w:val="20"/>
-              </w:rPr>
-            </w:r>
-          </w:p>
-        </w:tc>
-        <w:tc>
-          <w:tcPr>
-            <w:tcW w:type="dxa" w:w="1296"/>
-          </w:tcPr>
-          <w:p>
-            <w:r/>
-            <w:r>
-              <w:rPr>
-                <w:b w:val="0"/>
-                <w:sz w:val="20"/>
-              </w:rPr>
-              <w:t>TBD</w:t>
-            </w:r>
-          </w:p>
-        </w:tc>
-        <w:tc>
-          <w:tcPr>
-            <w:tcW w:type="dxa" w:w="1296"/>
-          </w:tcPr>
-          <w:p>
-            <w:r/>
-            <w:r>
-              <w:rPr>
-                <w:b w:val="0"/>
-                <w:sz w:val="20"/>
-              </w:rPr>
-            </w:r>
-          </w:p>
-        </w:tc>
-        <w:tc>
-          <w:tcPr>
-            <w:tcW w:type="dxa" w:w="1296"/>
-          </w:tcPr>
-          <w:p>
-            <w:r/>
-            <w:r>
-              <w:rPr>
-                <w:b w:val="0"/>
-                <w:sz w:val="20"/>
-              </w:rPr>
-              <w:t>mV·ps</w:t>
-            </w:r>
-          </w:p>
-        </w:tc>
-        <w:tc>
-          <w:tcPr>
-            <w:tcW w:type="dxa" w:w="1296"/>
-          </w:tcPr>
-          <w:p>
-            <w:r/>
-            <w:r>
-              <w:rPr>
-                <w:b w:val="0"/>
-                <w:sz w:val="20"/>
-              </w:rPr>
-              <w:t>Glitch energy = area (mV × ps) of the output error spike during a code step, caused by switch timing skew and clock/charge feed-through. In a binary DAC the worst glitch is at mid-code (many bits switch at once). Here only one unit switches per step, so the glitch is small and the same for every code. Measured on V_diff.</w:t>
-            </w:r>
-          </w:p>
-        </w:tc>
-      </w:tr>
-      <w:tr>
-        <w:tc>
-          <w:tcPr>
-            <w:tcW w:type="dxa" w:w="1296"/>
-          </w:tcPr>
-          <w:p>
-            <w:r/>
-            <w:r>
-              <w:rPr>
-                <w:b w:val="0"/>
-                <w:sz w:val="20"/>
-              </w:rPr>
-              <w:t>Output noise (integrated, diff)</w:t>
-            </w:r>
-          </w:p>
-        </w:tc>
-        <w:tc>
-          <w:tcPr>
-            <w:tcW w:type="dxa" w:w="1296"/>
-          </w:tcPr>
-          <w:p>
-            <w:r/>
-            <w:r>
-              <w:rPr>
-                <w:b w:val="0"/>
-                <w:sz w:val="20"/>
-              </w:rPr>
-              <w:t>V_n</w:t>
-            </w:r>
-          </w:p>
-        </w:tc>
-        <w:tc>
-          <w:tcPr>
-            <w:tcW w:type="dxa" w:w="1296"/>
-          </w:tcPr>
-          <w:p>
-            <w:r/>
-            <w:r>
-              <w:rPr>
-                <w:b w:val="0"/>
-                <w:sz w:val="20"/>
-              </w:rPr>
-            </w:r>
-          </w:p>
-        </w:tc>
-        <w:tc>
-          <w:tcPr>
-            <w:tcW w:type="dxa" w:w="1296"/>
-          </w:tcPr>
-          <w:p>
-            <w:r/>
-            <w:r>
-              <w:rPr>
-                <w:b w:val="0"/>
-                <w:sz w:val="20"/>
-              </w:rPr>
-              <w:t>TBD</w:t>
-            </w:r>
-          </w:p>
-        </w:tc>
-        <w:tc>
-          <w:tcPr>
-            <w:tcW w:type="dxa" w:w="1296"/>
-          </w:tcPr>
-          <w:p>
-            <w:r/>
-            <w:r>
-              <w:rPr>
-                <w:b w:val="0"/>
-                <w:sz w:val="20"/>
-              </w:rPr>
-            </w:r>
-          </w:p>
-        </w:tc>
-        <w:tc>
-          <w:tcPr>
-            <w:tcW w:type="dxa" w:w="1296"/>
-          </w:tcPr>
-          <w:p>
-            <w:r/>
-            <w:r>
-              <w:rPr>
-                <w:b w:val="0"/>
-                <w:sz w:val="20"/>
-              </w:rPr>
-              <w:t>µV_rms</w:t>
-            </w:r>
-          </w:p>
-        </w:tc>
-        <w:tc>
-          <w:tcPr>
-            <w:tcW w:type="dxa" w:w="1296"/>
-          </w:tcPr>
-          <w:p>
-            <w:r/>
-            <w:r>
-              <w:rPr>
-                <w:b w:val="0"/>
-                <w:sz w:val="20"/>
-              </w:rPr>
-              <w:t>Table to be provided</w:t>
-            </w:r>
-          </w:p>
-        </w:tc>
-      </w:tr>
-      <w:tr>
-        <w:tc>
-          <w:tcPr>
-            <w:tcW w:type="dxa" w:w="1296"/>
-          </w:tcPr>
-          <w:p>
-            <w:r/>
-            <w:r>
-              <w:rPr>
-                <w:b w:val="0"/>
-                <w:sz w:val="20"/>
-              </w:rPr>
-              <w:t>PSRR</w:t>
-            </w:r>
-          </w:p>
-        </w:tc>
-        <w:tc>
-          <w:tcPr>
-            <w:tcW w:type="dxa" w:w="1296"/>
-          </w:tcPr>
-          <w:p>
-            <w:r/>
-            <w:r>
-              <w:rPr>
-                <w:b w:val="0"/>
-                <w:sz w:val="20"/>
-              </w:rPr>
-              <w:t>PSRR</w:t>
-            </w:r>
-          </w:p>
-        </w:tc>
-        <w:tc>
-          <w:tcPr>
-            <w:tcW w:type="dxa" w:w="1296"/>
-          </w:tcPr>
-          <w:p>
-            <w:r/>
-            <w:r>
-              <w:rPr>
-                <w:b w:val="0"/>
-                <w:sz w:val="20"/>
-              </w:rPr>
-            </w:r>
-          </w:p>
-        </w:tc>
-        <w:tc>
-          <w:tcPr>
-            <w:tcW w:type="dxa" w:w="1296"/>
-          </w:tcPr>
-          <w:p>
-            <w:r/>
-            <w:r>
-              <w:rPr>
-                <w:b w:val="0"/>
-                <w:sz w:val="20"/>
-              </w:rPr>
-              <w:t>TBD</w:t>
-            </w:r>
-          </w:p>
-        </w:tc>
-        <w:tc>
-          <w:tcPr>
-            <w:tcW w:type="dxa" w:w="1296"/>
-          </w:tcPr>
-          <w:p>
-            <w:r/>
-            <w:r>
-              <w:rPr>
-                <w:b w:val="0"/>
-                <w:sz w:val="20"/>
-              </w:rPr>
-            </w:r>
-          </w:p>
-        </w:tc>
-        <w:tc>
-          <w:tcPr>
-            <w:tcW w:type="dxa" w:w="1296"/>
-          </w:tcPr>
-          <w:p>
-            <w:r/>
-            <w:r>
-              <w:rPr>
-                <w:b w:val="0"/>
-                <w:sz w:val="20"/>
-              </w:rPr>
-              <w:t>dB</w:t>
-            </w:r>
-          </w:p>
-        </w:tc>
-        <w:tc>
-          <w:tcPr>
-            <w:tcW w:type="dxa" w:w="1296"/>
-          </w:tcPr>
-          <w:p>
-            <w:r/>
-            <w:r>
-              <w:rPr>
-                <w:b w:val="0"/>
-                <w:sz w:val="20"/>
-              </w:rPr>
-              <w:t>Report only</w:t>
-            </w:r>
-          </w:p>
-        </w:tc>
-      </w:tr>
-      <w:tr>
-        <w:tc>
-          <w:tcPr>
-            <w:tcW w:type="dxa" w:w="1296"/>
-          </w:tcPr>
-          <w:p>
-            <w:r/>
-            <w:r>
-              <w:rPr>
-                <w:b w:val="0"/>
-                <w:sz w:val="20"/>
-              </w:rPr>
-              <w:t>Load capacitance</w:t>
-            </w:r>
-          </w:p>
-        </w:tc>
-        <w:tc>
-          <w:tcPr>
-            <w:tcW w:type="dxa" w:w="1296"/>
-          </w:tcPr>
-          <w:p>
-            <w:r/>
-            <w:r>
-              <w:rPr>
-                <w:b w:val="0"/>
-                <w:sz w:val="20"/>
-              </w:rPr>
-              <w:t>C_L</w:t>
-            </w:r>
-          </w:p>
-        </w:tc>
-        <w:tc>
-          <w:tcPr>
-            <w:tcW w:type="dxa" w:w="1296"/>
-          </w:tcPr>
-          <w:p>
-            <w:r/>
-            <w:r>
-              <w:rPr>
-                <w:b w:val="0"/>
-                <w:sz w:val="20"/>
-              </w:rPr>
-            </w:r>
-          </w:p>
-        </w:tc>
-        <w:tc>
-          <w:tcPr>
-            <w:tcW w:type="dxa" w:w="1296"/>
-          </w:tcPr>
-          <w:p>
-            <w:r/>
-            <w:r>
-              <w:rPr>
-                <w:b w:val="0"/>
-                <w:sz w:val="20"/>
-              </w:rPr>
-              <w:t>TBD</w:t>
-            </w:r>
-          </w:p>
-        </w:tc>
-        <w:tc>
-          <w:tcPr>
-            <w:tcW w:type="dxa" w:w="1296"/>
-          </w:tcPr>
-          <w:p>
-            <w:r/>
-            <w:r>
-              <w:rPr>
-                <w:b w:val="0"/>
-                <w:sz w:val="20"/>
-              </w:rPr>
-            </w:r>
-          </w:p>
-        </w:tc>
-        <w:tc>
-          <w:tcPr>
-            <w:tcW w:type="dxa" w:w="1296"/>
-          </w:tcPr>
-          <w:p>
-            <w:r/>
-            <w:r>
-              <w:rPr>
-                <w:b w:val="0"/>
-                <w:sz w:val="20"/>
-              </w:rPr>
-              <w:t>fF</w:t>
-            </w:r>
-          </w:p>
-        </w:tc>
-        <w:tc>
-          <w:tcPr>
-            <w:tcW w:type="dxa" w:w="1296"/>
-          </w:tcPr>
-          <w:p>
-            <w:r/>
-            <w:r>
-              <w:rPr>
-                <w:b w:val="0"/>
-                <w:sz w:val="20"/>
-              </w:rPr>
-              <w:t>VCO input – to be completed</w:t>
-            </w:r>
-          </w:p>
-        </w:tc>
-      </w:tr>
-      <w:tr>
-        <w:tc>
-          <w:tcPr>
-            <w:tcW w:type="dxa" w:w="1296"/>
-          </w:tcPr>
-          <w:p>
-            <w:r/>
-            <w:r>
-              <w:rPr>
-                <w:b w:val="0"/>
-                <w:sz w:val="20"/>
-              </w:rPr>
-              <w:t>Temperature</w:t>
-            </w:r>
-          </w:p>
-        </w:tc>
-        <w:tc>
-          <w:tcPr>
-            <w:tcW w:type="dxa" w:w="1296"/>
-          </w:tcPr>
-          <w:p>
-            <w:r/>
-            <w:r>
-              <w:rPr>
-                <w:b w:val="0"/>
-                <w:sz w:val="20"/>
-              </w:rPr>
-              <w:t>T</w:t>
-            </w:r>
-          </w:p>
-        </w:tc>
-        <w:tc>
-          <w:tcPr>
-            <w:tcW w:type="dxa" w:w="1296"/>
-          </w:tcPr>
-          <w:p>
-            <w:r/>
-            <w:r>
-              <w:rPr>
-                <w:b w:val="0"/>
-                <w:sz w:val="20"/>
-              </w:rPr>
-              <w:t>-10</w:t>
-            </w:r>
-          </w:p>
-        </w:tc>
-        <w:tc>
-          <w:tcPr>
-            <w:tcW w:type="dxa" w:w="1296"/>
-          </w:tcPr>
-          <w:p>
-            <w:r/>
-            <w:r>
-              <w:rPr>
-                <w:b w:val="0"/>
-                <w:sz w:val="20"/>
-              </w:rPr>
-              <w:t>50 / 85</w:t>
-            </w:r>
-          </w:p>
-        </w:tc>
-        <w:tc>
-          <w:tcPr>
-            <w:tcW w:type="dxa" w:w="1296"/>
-          </w:tcPr>
-          <w:p>
-            <w:r/>
-            <w:r>
-              <w:rPr>
-                <w:b w:val="0"/>
-                <w:sz w:val="20"/>
-              </w:rPr>
-              <w:t>110</w:t>
-            </w:r>
-          </w:p>
-        </w:tc>
-        <w:tc>
-          <w:tcPr>
-            <w:tcW w:type="dxa" w:w="1296"/>
-          </w:tcPr>
-          <w:p>
-            <w:r/>
-            <w:r>
-              <w:rPr>
-                <w:b w:val="0"/>
-                <w:sz w:val="20"/>
-              </w:rPr>
-              <w:t>°C</w:t>
-            </w:r>
-          </w:p>
-        </w:tc>
-        <w:tc>
-          <w:tcPr>
-            <w:tcW w:type="dxa" w:w="1296"/>
-          </w:tcPr>
-          <w:p>
-            <w:r/>
-            <w:r>
-              <w:rPr>
-                <w:b w:val="0"/>
-                <w:sz w:val="20"/>
-              </w:rPr>
-              <w:t>Typ: 50 and 85 (most likely both)</w:t>
+              <w:t>Internal spec; I_FS / 255</w:t>
             </w:r>
           </w:p>
         </w:tc>
@@ -4078,7 +2570,1729 @@
         <w:pStyle w:val="Heading2"/>
       </w:pPr>
       <w:r>
-        <w:t>4.2 INL and DNL Definitions</w:t>
+        <w:t>4.2 Results (Performance)</w:t>
+      </w:r>
+    </w:p>
+    <w:p>
+      <w:r>
+        <w:t>Performance the DAC must meet, or report, under the conditions in 4.1.</w:t>
+      </w:r>
+    </w:p>
+    <w:tbl>
+      <w:tblPr>
+        <w:tblStyle w:val="TableGrid"/>
+        <w:tblW w:type="auto" w:w="0"/>
+        <w:jc w:val="center"/>
+        <w:tblLook w:firstColumn="1" w:firstRow="1" w:lastColumn="0" w:lastRow="0" w:noHBand="0" w:noVBand="1" w:val="04A0"/>
+      </w:tblPr>
+      <w:tblGrid>
+        <w:gridCol w:w="1296"/>
+        <w:gridCol w:w="1296"/>
+        <w:gridCol w:w="1296"/>
+        <w:gridCol w:w="1296"/>
+        <w:gridCol w:w="1296"/>
+        <w:gridCol w:w="1296"/>
+        <w:gridCol w:w="1296"/>
+      </w:tblGrid>
+      <w:tr>
+        <w:tc>
+          <w:tcPr>
+            <w:tcW w:type="dxa" w:w="1296"/>
+            <w:shd w:fill="D9E2F3" w:val="clear"/>
+          </w:tcPr>
+          <w:p>
+            <w:r/>
+            <w:r>
+              <w:rPr>
+                <w:b/>
+                <w:sz w:val="20"/>
+              </w:rPr>
+              <w:t>Parameter</w:t>
+            </w:r>
+          </w:p>
+        </w:tc>
+        <w:tc>
+          <w:tcPr>
+            <w:tcW w:type="dxa" w:w="1296"/>
+            <w:shd w:fill="D9E2F3" w:val="clear"/>
+          </w:tcPr>
+          <w:p>
+            <w:r/>
+            <w:r>
+              <w:rPr>
+                <w:b/>
+                <w:sz w:val="20"/>
+              </w:rPr>
+              <w:t>Symbol</w:t>
+            </w:r>
+          </w:p>
+        </w:tc>
+        <w:tc>
+          <w:tcPr>
+            <w:tcW w:type="dxa" w:w="1296"/>
+            <w:shd w:fill="D9E2F3" w:val="clear"/>
+          </w:tcPr>
+          <w:p>
+            <w:r/>
+            <w:r>
+              <w:rPr>
+                <w:b/>
+                <w:sz w:val="20"/>
+              </w:rPr>
+              <w:t>Min</w:t>
+            </w:r>
+          </w:p>
+        </w:tc>
+        <w:tc>
+          <w:tcPr>
+            <w:tcW w:type="dxa" w:w="1296"/>
+            <w:shd w:fill="D9E2F3" w:val="clear"/>
+          </w:tcPr>
+          <w:p>
+            <w:r/>
+            <w:r>
+              <w:rPr>
+                <w:b/>
+                <w:sz w:val="20"/>
+              </w:rPr>
+              <w:t>Typ</w:t>
+            </w:r>
+          </w:p>
+        </w:tc>
+        <w:tc>
+          <w:tcPr>
+            <w:tcW w:type="dxa" w:w="1296"/>
+            <w:shd w:fill="D9E2F3" w:val="clear"/>
+          </w:tcPr>
+          <w:p>
+            <w:r/>
+            <w:r>
+              <w:rPr>
+                <w:b/>
+                <w:sz w:val="20"/>
+              </w:rPr>
+              <w:t>Max</w:t>
+            </w:r>
+          </w:p>
+        </w:tc>
+        <w:tc>
+          <w:tcPr>
+            <w:tcW w:type="dxa" w:w="1296"/>
+            <w:shd w:fill="D9E2F3" w:val="clear"/>
+          </w:tcPr>
+          <w:p>
+            <w:r/>
+            <w:r>
+              <w:rPr>
+                <w:b/>
+                <w:sz w:val="20"/>
+              </w:rPr>
+              <w:t>Unit</w:t>
+            </w:r>
+          </w:p>
+        </w:tc>
+        <w:tc>
+          <w:tcPr>
+            <w:tcW w:type="dxa" w:w="1296"/>
+            <w:shd w:fill="D9E2F3" w:val="clear"/>
+          </w:tcPr>
+          <w:p>
+            <w:r/>
+            <w:r>
+              <w:rPr>
+                <w:b/>
+                <w:sz w:val="20"/>
+              </w:rPr>
+              <w:t>Notes</w:t>
+            </w:r>
+          </w:p>
+        </w:tc>
+      </w:tr>
+      <w:tr>
+        <w:tc>
+          <w:tcPr>
+            <w:tcW w:type="dxa" w:w="1296"/>
+          </w:tcPr>
+          <w:p>
+            <w:r/>
+            <w:r>
+              <w:rPr>
+                <w:b w:val="0"/>
+                <w:sz w:val="20"/>
+              </w:rPr>
+              <w:t>Full-scale output (diff)</w:t>
+            </w:r>
+          </w:p>
+        </w:tc>
+        <w:tc>
+          <w:tcPr>
+            <w:tcW w:type="dxa" w:w="1296"/>
+          </w:tcPr>
+          <w:p>
+            <w:r/>
+            <w:r>
+              <w:rPr>
+                <w:b w:val="0"/>
+                <w:sz w:val="20"/>
+              </w:rPr>
+              <w:t>V_FS</w:t>
+            </w:r>
+          </w:p>
+        </w:tc>
+        <w:tc>
+          <w:tcPr>
+            <w:tcW w:type="dxa" w:w="1296"/>
+          </w:tcPr>
+          <w:p>
+            <w:r/>
+            <w:r>
+              <w:rPr>
+                <w:b w:val="0"/>
+                <w:sz w:val="20"/>
+              </w:rPr>
+            </w:r>
+          </w:p>
+        </w:tc>
+        <w:tc>
+          <w:tcPr>
+            <w:tcW w:type="dxa" w:w="1296"/>
+          </w:tcPr>
+          <w:p>
+            <w:r/>
+            <w:r>
+              <w:rPr>
+                <w:b w:val="0"/>
+                <w:sz w:val="20"/>
+              </w:rPr>
+              <w:t>1000</w:t>
+            </w:r>
+          </w:p>
+        </w:tc>
+        <w:tc>
+          <w:tcPr>
+            <w:tcW w:type="dxa" w:w="1296"/>
+          </w:tcPr>
+          <w:p>
+            <w:r/>
+            <w:r>
+              <w:rPr>
+                <w:b w:val="0"/>
+                <w:sz w:val="20"/>
+              </w:rPr>
+            </w:r>
+          </w:p>
+        </w:tc>
+        <w:tc>
+          <w:tcPr>
+            <w:tcW w:type="dxa" w:w="1296"/>
+          </w:tcPr>
+          <w:p>
+            <w:r/>
+            <w:r>
+              <w:rPr>
+                <w:b w:val="0"/>
+                <w:sz w:val="20"/>
+              </w:rPr>
+              <w:t>mVpp</w:t>
+            </w:r>
+          </w:p>
+        </w:tc>
+        <w:tc>
+          <w:tcPr>
+            <w:tcW w:type="dxa" w:w="1296"/>
+          </w:tcPr>
+          <w:p>
+            <w:r/>
+            <w:r>
+              <w:rPr>
+                <w:b w:val="0"/>
+                <w:sz w:val="20"/>
+              </w:rPr>
+              <w:t>Differential peak-to-peak (±500 mV)</w:t>
+            </w:r>
+          </w:p>
+        </w:tc>
+      </w:tr>
+      <w:tr>
+        <w:tc>
+          <w:tcPr>
+            <w:tcW w:type="dxa" w:w="1296"/>
+          </w:tcPr>
+          <w:p>
+            <w:r/>
+            <w:r>
+              <w:rPr>
+                <w:b w:val="0"/>
+                <w:sz w:val="20"/>
+              </w:rPr>
+              <w:t>LSB voltage (diff)</w:t>
+            </w:r>
+          </w:p>
+        </w:tc>
+        <w:tc>
+          <w:tcPr>
+            <w:tcW w:type="dxa" w:w="1296"/>
+          </w:tcPr>
+          <w:p>
+            <w:r/>
+            <w:r>
+              <w:rPr>
+                <w:b w:val="0"/>
+                <w:sz w:val="20"/>
+              </w:rPr>
+              <w:t>V_LSB</w:t>
+            </w:r>
+          </w:p>
+        </w:tc>
+        <w:tc>
+          <w:tcPr>
+            <w:tcW w:type="dxa" w:w="1296"/>
+          </w:tcPr>
+          <w:p>
+            <w:r/>
+            <w:r>
+              <w:rPr>
+                <w:b w:val="0"/>
+                <w:sz w:val="20"/>
+              </w:rPr>
+            </w:r>
+          </w:p>
+        </w:tc>
+        <w:tc>
+          <w:tcPr>
+            <w:tcW w:type="dxa" w:w="1296"/>
+          </w:tcPr>
+          <w:p>
+            <w:r/>
+            <w:r>
+              <w:rPr>
+                <w:b w:val="0"/>
+                <w:sz w:val="20"/>
+              </w:rPr>
+              <w:t>3.922</w:t>
+            </w:r>
+          </w:p>
+        </w:tc>
+        <w:tc>
+          <w:tcPr>
+            <w:tcW w:type="dxa" w:w="1296"/>
+          </w:tcPr>
+          <w:p>
+            <w:r/>
+            <w:r>
+              <w:rPr>
+                <w:b w:val="0"/>
+                <w:sz w:val="20"/>
+              </w:rPr>
+            </w:r>
+          </w:p>
+        </w:tc>
+        <w:tc>
+          <w:tcPr>
+            <w:tcW w:type="dxa" w:w="1296"/>
+          </w:tcPr>
+          <w:p>
+            <w:r/>
+            <w:r>
+              <w:rPr>
+                <w:b w:val="0"/>
+                <w:sz w:val="20"/>
+              </w:rPr>
+              <w:t>mV</w:t>
+            </w:r>
+          </w:p>
+        </w:tc>
+        <w:tc>
+          <w:tcPr>
+            <w:tcW w:type="dxa" w:w="1296"/>
+          </w:tcPr>
+          <w:p>
+            <w:r/>
+            <w:r>
+              <w:rPr>
+                <w:b w:val="0"/>
+                <w:sz w:val="20"/>
+              </w:rPr>
+              <w:t>V_FS / 255</w:t>
+            </w:r>
+          </w:p>
+        </w:tc>
+      </w:tr>
+      <w:tr>
+        <w:tc>
+          <w:tcPr>
+            <w:tcW w:type="dxa" w:w="1296"/>
+          </w:tcPr>
+          <w:p>
+            <w:r/>
+            <w:r>
+              <w:rPr>
+                <w:b w:val="0"/>
+                <w:sz w:val="20"/>
+              </w:rPr>
+              <w:t>Output common-mode</w:t>
+            </w:r>
+          </w:p>
+        </w:tc>
+        <w:tc>
+          <w:tcPr>
+            <w:tcW w:type="dxa" w:w="1296"/>
+          </w:tcPr>
+          <w:p>
+            <w:r/>
+            <w:r>
+              <w:rPr>
+                <w:b w:val="0"/>
+                <w:sz w:val="20"/>
+              </w:rPr>
+              <w:t>V_CM</w:t>
+            </w:r>
+          </w:p>
+        </w:tc>
+        <w:tc>
+          <w:tcPr>
+            <w:tcW w:type="dxa" w:w="1296"/>
+          </w:tcPr>
+          <w:p>
+            <w:r/>
+            <w:r>
+              <w:rPr>
+                <w:b w:val="0"/>
+                <w:sz w:val="20"/>
+              </w:rPr>
+              <w:t>332.5</w:t>
+            </w:r>
+          </w:p>
+        </w:tc>
+        <w:tc>
+          <w:tcPr>
+            <w:tcW w:type="dxa" w:w="1296"/>
+          </w:tcPr>
+          <w:p>
+            <w:r/>
+            <w:r>
+              <w:rPr>
+                <w:b w:val="0"/>
+                <w:sz w:val="20"/>
+              </w:rPr>
+              <w:t>350</w:t>
+            </w:r>
+          </w:p>
+        </w:tc>
+        <w:tc>
+          <w:tcPr>
+            <w:tcW w:type="dxa" w:w="1296"/>
+          </w:tcPr>
+          <w:p>
+            <w:r/>
+            <w:r>
+              <w:rPr>
+                <w:b w:val="0"/>
+                <w:sz w:val="20"/>
+              </w:rPr>
+              <w:t>367.5</w:t>
+            </w:r>
+          </w:p>
+        </w:tc>
+        <w:tc>
+          <w:tcPr>
+            <w:tcW w:type="dxa" w:w="1296"/>
+          </w:tcPr>
+          <w:p>
+            <w:r/>
+            <w:r>
+              <w:rPr>
+                <w:b w:val="0"/>
+                <w:sz w:val="20"/>
+              </w:rPr>
+              <w:t>mV</w:t>
+            </w:r>
+          </w:p>
+        </w:tc>
+        <w:tc>
+          <w:tcPr>
+            <w:tcW w:type="dxa" w:w="1296"/>
+          </w:tcPr>
+          <w:p>
+            <w:r/>
+            <w:r>
+              <w:rPr>
+                <w:b w:val="0"/>
+                <w:sz w:val="20"/>
+              </w:rPr>
+              <w:t>±5% – self spec</w:t>
+            </w:r>
+          </w:p>
+        </w:tc>
+      </w:tr>
+      <w:tr>
+        <w:tc>
+          <w:tcPr>
+            <w:tcW w:type="dxa" w:w="1296"/>
+          </w:tcPr>
+          <w:p>
+            <w:r/>
+            <w:r>
+              <w:rPr>
+                <w:b w:val="0"/>
+                <w:sz w:val="20"/>
+              </w:rPr>
+              <w:t>Full-scale (gain) error</w:t>
+            </w:r>
+          </w:p>
+        </w:tc>
+        <w:tc>
+          <w:tcPr>
+            <w:tcW w:type="dxa" w:w="1296"/>
+          </w:tcPr>
+          <w:p>
+            <w:r/>
+            <w:r>
+              <w:rPr>
+                <w:b w:val="0"/>
+                <w:sz w:val="20"/>
+              </w:rPr>
+              <w:t>GE</w:t>
+            </w:r>
+          </w:p>
+        </w:tc>
+        <w:tc>
+          <w:tcPr>
+            <w:tcW w:type="dxa" w:w="1296"/>
+          </w:tcPr>
+          <w:p>
+            <w:r/>
+            <w:r>
+              <w:rPr>
+                <w:b w:val="0"/>
+                <w:sz w:val="20"/>
+              </w:rPr>
+              <w:t>-5</w:t>
+            </w:r>
+          </w:p>
+        </w:tc>
+        <w:tc>
+          <w:tcPr>
+            <w:tcW w:type="dxa" w:w="1296"/>
+          </w:tcPr>
+          <w:p>
+            <w:r/>
+            <w:r>
+              <w:rPr>
+                <w:b w:val="0"/>
+                <w:sz w:val="20"/>
+              </w:rPr>
+            </w:r>
+          </w:p>
+        </w:tc>
+        <w:tc>
+          <w:tcPr>
+            <w:tcW w:type="dxa" w:w="1296"/>
+          </w:tcPr>
+          <w:p>
+            <w:r/>
+            <w:r>
+              <w:rPr>
+                <w:b w:val="0"/>
+                <w:sz w:val="20"/>
+              </w:rPr>
+              <w:t>+5</w:t>
+            </w:r>
+          </w:p>
+        </w:tc>
+        <w:tc>
+          <w:tcPr>
+            <w:tcW w:type="dxa" w:w="1296"/>
+          </w:tcPr>
+          <w:p>
+            <w:r/>
+            <w:r>
+              <w:rPr>
+                <w:b w:val="0"/>
+                <w:sz w:val="20"/>
+              </w:rPr>
+              <w:t>%</w:t>
+            </w:r>
+          </w:p>
+        </w:tc>
+        <w:tc>
+          <w:tcPr>
+            <w:tcW w:type="dxa" w:w="1296"/>
+          </w:tcPr>
+          <w:p>
+            <w:r/>
+            <w:r>
+              <w:rPr>
+                <w:b w:val="0"/>
+                <w:sz w:val="20"/>
+              </w:rPr>
+              <w:t>Self spec</w:t>
+            </w:r>
+          </w:p>
+        </w:tc>
+      </w:tr>
+      <w:tr>
+        <w:tc>
+          <w:tcPr>
+            <w:tcW w:type="dxa" w:w="1296"/>
+          </w:tcPr>
+          <w:p>
+            <w:r/>
+            <w:r>
+              <w:rPr>
+                <w:b w:val="0"/>
+                <w:sz w:val="20"/>
+              </w:rPr>
+              <w:t>DNL</w:t>
+            </w:r>
+          </w:p>
+        </w:tc>
+        <w:tc>
+          <w:tcPr>
+            <w:tcW w:type="dxa" w:w="1296"/>
+          </w:tcPr>
+          <w:p>
+            <w:r/>
+            <w:r>
+              <w:rPr>
+                <w:b w:val="0"/>
+                <w:sz w:val="20"/>
+              </w:rPr>
+              <w:t>DNL</w:t>
+            </w:r>
+          </w:p>
+        </w:tc>
+        <w:tc>
+          <w:tcPr>
+            <w:tcW w:type="dxa" w:w="1296"/>
+          </w:tcPr>
+          <w:p>
+            <w:r/>
+            <w:r>
+              <w:rPr>
+                <w:b w:val="0"/>
+                <w:sz w:val="20"/>
+              </w:rPr>
+              <w:t>-0.3</w:t>
+            </w:r>
+          </w:p>
+        </w:tc>
+        <w:tc>
+          <w:tcPr>
+            <w:tcW w:type="dxa" w:w="1296"/>
+          </w:tcPr>
+          <w:p>
+            <w:r/>
+            <w:r>
+              <w:rPr>
+                <w:b w:val="0"/>
+                <w:sz w:val="20"/>
+              </w:rPr>
+            </w:r>
+          </w:p>
+        </w:tc>
+        <w:tc>
+          <w:tcPr>
+            <w:tcW w:type="dxa" w:w="1296"/>
+          </w:tcPr>
+          <w:p>
+            <w:r/>
+            <w:r>
+              <w:rPr>
+                <w:b w:val="0"/>
+                <w:sz w:val="20"/>
+              </w:rPr>
+              <w:t>+0.3</w:t>
+            </w:r>
+          </w:p>
+        </w:tc>
+        <w:tc>
+          <w:tcPr>
+            <w:tcW w:type="dxa" w:w="1296"/>
+          </w:tcPr>
+          <w:p>
+            <w:r/>
+            <w:r>
+              <w:rPr>
+                <w:b w:val="0"/>
+                <w:sz w:val="20"/>
+              </w:rPr>
+              <w:t>LSB</w:t>
+            </w:r>
+          </w:p>
+        </w:tc>
+        <w:tc>
+          <w:tcPr>
+            <w:tcW w:type="dxa" w:w="1296"/>
+          </w:tcPr>
+          <w:p>
+            <w:r/>
+            <w:r>
+              <w:rPr>
+                <w:b w:val="0"/>
+                <w:sz w:val="20"/>
+              </w:rPr>
+              <w:t>Including VCO error</w:t>
+            </w:r>
+          </w:p>
+        </w:tc>
+      </w:tr>
+      <w:tr>
+        <w:tc>
+          <w:tcPr>
+            <w:tcW w:type="dxa" w:w="1296"/>
+          </w:tcPr>
+          <w:p>
+            <w:r/>
+            <w:r>
+              <w:rPr>
+                <w:b w:val="0"/>
+                <w:sz w:val="20"/>
+              </w:rPr>
+              <w:t>DNL budget – VCO share</w:t>
+            </w:r>
+          </w:p>
+        </w:tc>
+        <w:tc>
+          <w:tcPr>
+            <w:tcW w:type="dxa" w:w="1296"/>
+          </w:tcPr>
+          <w:p>
+            <w:r/>
+            <w:r>
+              <w:rPr>
+                <w:b w:val="0"/>
+                <w:sz w:val="20"/>
+              </w:rPr>
+              <w:t>DNL_VCO</w:t>
+            </w:r>
+          </w:p>
+        </w:tc>
+        <w:tc>
+          <w:tcPr>
+            <w:tcW w:type="dxa" w:w="1296"/>
+          </w:tcPr>
+          <w:p>
+            <w:r/>
+            <w:r>
+              <w:rPr>
+                <w:b w:val="0"/>
+                <w:sz w:val="20"/>
+              </w:rPr>
+            </w:r>
+          </w:p>
+        </w:tc>
+        <w:tc>
+          <w:tcPr>
+            <w:tcW w:type="dxa" w:w="1296"/>
+          </w:tcPr>
+          <w:p>
+            <w:r/>
+            <w:r>
+              <w:rPr>
+                <w:b w:val="0"/>
+                <w:sz w:val="20"/>
+              </w:rPr>
+              <w:t>TBD</w:t>
+            </w:r>
+          </w:p>
+        </w:tc>
+        <w:tc>
+          <w:tcPr>
+            <w:tcW w:type="dxa" w:w="1296"/>
+          </w:tcPr>
+          <w:p>
+            <w:r/>
+            <w:r>
+              <w:rPr>
+                <w:b w:val="0"/>
+                <w:sz w:val="20"/>
+              </w:rPr>
+            </w:r>
+          </w:p>
+        </w:tc>
+        <w:tc>
+          <w:tcPr>
+            <w:tcW w:type="dxa" w:w="1296"/>
+          </w:tcPr>
+          <w:p>
+            <w:r/>
+            <w:r>
+              <w:rPr>
+                <w:b w:val="0"/>
+                <w:sz w:val="20"/>
+              </w:rPr>
+              <w:t>LSB</w:t>
+            </w:r>
+          </w:p>
+        </w:tc>
+        <w:tc>
+          <w:tcPr>
+            <w:tcW w:type="dxa" w:w="1296"/>
+          </w:tcPr>
+          <w:p>
+            <w:r/>
+            <w:r>
+              <w:rPr>
+                <w:b w:val="0"/>
+                <w:sz w:val="20"/>
+              </w:rPr>
+              <w:t>OPEN – part of the ±0.3 LSB, not known yet</w:t>
+            </w:r>
+          </w:p>
+        </w:tc>
+      </w:tr>
+      <w:tr>
+        <w:tc>
+          <w:tcPr>
+            <w:tcW w:type="dxa" w:w="1296"/>
+          </w:tcPr>
+          <w:p>
+            <w:r/>
+            <w:r>
+              <w:rPr>
+                <w:b w:val="0"/>
+                <w:sz w:val="20"/>
+              </w:rPr>
+              <w:t>INL</w:t>
+            </w:r>
+          </w:p>
+        </w:tc>
+        <w:tc>
+          <w:tcPr>
+            <w:tcW w:type="dxa" w:w="1296"/>
+          </w:tcPr>
+          <w:p>
+            <w:r/>
+            <w:r>
+              <w:rPr>
+                <w:b w:val="0"/>
+                <w:sz w:val="20"/>
+              </w:rPr>
+              <w:t>INL</w:t>
+            </w:r>
+          </w:p>
+        </w:tc>
+        <w:tc>
+          <w:tcPr>
+            <w:tcW w:type="dxa" w:w="1296"/>
+          </w:tcPr>
+          <w:p>
+            <w:r/>
+            <w:r>
+              <w:rPr>
+                <w:b w:val="0"/>
+                <w:sz w:val="20"/>
+              </w:rPr>
+            </w:r>
+          </w:p>
+        </w:tc>
+        <w:tc>
+          <w:tcPr>
+            <w:tcW w:type="dxa" w:w="1296"/>
+          </w:tcPr>
+          <w:p>
+            <w:r/>
+            <w:r>
+              <w:rPr>
+                <w:b w:val="0"/>
+                <w:sz w:val="20"/>
+              </w:rPr>
+              <w:t>TBD</w:t>
+            </w:r>
+          </w:p>
+        </w:tc>
+        <w:tc>
+          <w:tcPr>
+            <w:tcW w:type="dxa" w:w="1296"/>
+          </w:tcPr>
+          <w:p>
+            <w:r/>
+            <w:r>
+              <w:rPr>
+                <w:b w:val="0"/>
+                <w:sz w:val="20"/>
+              </w:rPr>
+            </w:r>
+          </w:p>
+        </w:tc>
+        <w:tc>
+          <w:tcPr>
+            <w:tcW w:type="dxa" w:w="1296"/>
+          </w:tcPr>
+          <w:p>
+            <w:r/>
+            <w:r>
+              <w:rPr>
+                <w:b w:val="0"/>
+                <w:sz w:val="20"/>
+              </w:rPr>
+              <w:t>LSB</w:t>
+            </w:r>
+          </w:p>
+        </w:tc>
+        <w:tc>
+          <w:tcPr>
+            <w:tcW w:type="dxa" w:w="1296"/>
+          </w:tcPr>
+          <w:p>
+            <w:r/>
+            <w:r>
+              <w:rPr>
+                <w:b w:val="0"/>
+                <w:sz w:val="20"/>
+              </w:rPr>
+              <w:t>Report only</w:t>
+            </w:r>
+          </w:p>
+        </w:tc>
+      </w:tr>
+      <w:tr>
+        <w:tc>
+          <w:tcPr>
+            <w:tcW w:type="dxa" w:w="1296"/>
+          </w:tcPr>
+          <w:p>
+            <w:r/>
+            <w:r>
+              <w:rPr>
+                <w:b w:val="0"/>
+                <w:sz w:val="20"/>
+              </w:rPr>
+              <w:t>Power – 1.2 V supply</w:t>
+            </w:r>
+          </w:p>
+        </w:tc>
+        <w:tc>
+          <w:tcPr>
+            <w:tcW w:type="dxa" w:w="1296"/>
+          </w:tcPr>
+          <w:p>
+            <w:r/>
+            <w:r>
+              <w:rPr>
+                <w:b w:val="0"/>
+                <w:sz w:val="20"/>
+              </w:rPr>
+              <w:t>P_1V2</w:t>
+            </w:r>
+          </w:p>
+        </w:tc>
+        <w:tc>
+          <w:tcPr>
+            <w:tcW w:type="dxa" w:w="1296"/>
+          </w:tcPr>
+          <w:p>
+            <w:r/>
+            <w:r>
+              <w:rPr>
+                <w:b w:val="0"/>
+                <w:sz w:val="20"/>
+              </w:rPr>
+            </w:r>
+          </w:p>
+        </w:tc>
+        <w:tc>
+          <w:tcPr>
+            <w:tcW w:type="dxa" w:w="1296"/>
+          </w:tcPr>
+          <w:p>
+            <w:r/>
+            <w:r>
+              <w:rPr>
+                <w:b w:val="0"/>
+                <w:sz w:val="20"/>
+              </w:rPr>
+              <w:t>TBD</w:t>
+            </w:r>
+          </w:p>
+        </w:tc>
+        <w:tc>
+          <w:tcPr>
+            <w:tcW w:type="dxa" w:w="1296"/>
+          </w:tcPr>
+          <w:p>
+            <w:r/>
+            <w:r>
+              <w:rPr>
+                <w:b w:val="0"/>
+                <w:sz w:val="20"/>
+              </w:rPr>
+            </w:r>
+          </w:p>
+        </w:tc>
+        <w:tc>
+          <w:tcPr>
+            <w:tcW w:type="dxa" w:w="1296"/>
+          </w:tcPr>
+          <w:p>
+            <w:r/>
+            <w:r>
+              <w:rPr>
+                <w:b w:val="0"/>
+                <w:sz w:val="20"/>
+              </w:rPr>
+              <w:t>mW</w:t>
+            </w:r>
+          </w:p>
+        </w:tc>
+        <w:tc>
+          <w:tcPr>
+            <w:tcW w:type="dxa" w:w="1296"/>
+          </w:tcPr>
+          <w:p>
+            <w:r/>
+            <w:r>
+              <w:rPr>
+                <w:b w:val="0"/>
+                <w:sz w:val="20"/>
+              </w:rPr>
+            </w:r>
+          </w:p>
+        </w:tc>
+      </w:tr>
+      <w:tr>
+        <w:tc>
+          <w:tcPr>
+            <w:tcW w:type="dxa" w:w="1296"/>
+          </w:tcPr>
+          <w:p>
+            <w:r/>
+            <w:r>
+              <w:rPr>
+                <w:b w:val="0"/>
+                <w:sz w:val="20"/>
+              </w:rPr>
+              <w:t>Power – 0.9 V supply</w:t>
+            </w:r>
+          </w:p>
+        </w:tc>
+        <w:tc>
+          <w:tcPr>
+            <w:tcW w:type="dxa" w:w="1296"/>
+          </w:tcPr>
+          <w:p>
+            <w:r/>
+            <w:r>
+              <w:rPr>
+                <w:b w:val="0"/>
+                <w:sz w:val="20"/>
+              </w:rPr>
+              <w:t>P_0V9</w:t>
+            </w:r>
+          </w:p>
+        </w:tc>
+        <w:tc>
+          <w:tcPr>
+            <w:tcW w:type="dxa" w:w="1296"/>
+          </w:tcPr>
+          <w:p>
+            <w:r/>
+            <w:r>
+              <w:rPr>
+                <w:b w:val="0"/>
+                <w:sz w:val="20"/>
+              </w:rPr>
+            </w:r>
+          </w:p>
+        </w:tc>
+        <w:tc>
+          <w:tcPr>
+            <w:tcW w:type="dxa" w:w="1296"/>
+          </w:tcPr>
+          <w:p>
+            <w:r/>
+            <w:r>
+              <w:rPr>
+                <w:b w:val="0"/>
+                <w:sz w:val="20"/>
+              </w:rPr>
+              <w:t>TBD</w:t>
+            </w:r>
+          </w:p>
+        </w:tc>
+        <w:tc>
+          <w:tcPr>
+            <w:tcW w:type="dxa" w:w="1296"/>
+          </w:tcPr>
+          <w:p>
+            <w:r/>
+            <w:r>
+              <w:rPr>
+                <w:b w:val="0"/>
+                <w:sz w:val="20"/>
+              </w:rPr>
+            </w:r>
+          </w:p>
+        </w:tc>
+        <w:tc>
+          <w:tcPr>
+            <w:tcW w:type="dxa" w:w="1296"/>
+          </w:tcPr>
+          <w:p>
+            <w:r/>
+            <w:r>
+              <w:rPr>
+                <w:b w:val="0"/>
+                <w:sz w:val="20"/>
+              </w:rPr>
+              <w:t>mW</w:t>
+            </w:r>
+          </w:p>
+        </w:tc>
+        <w:tc>
+          <w:tcPr>
+            <w:tcW w:type="dxa" w:w="1296"/>
+          </w:tcPr>
+          <w:p>
+            <w:r/>
+            <w:r>
+              <w:rPr>
+                <w:b w:val="0"/>
+                <w:sz w:val="20"/>
+              </w:rPr>
+            </w:r>
+          </w:p>
+        </w:tc>
+      </w:tr>
+      <w:tr>
+        <w:tc>
+          <w:tcPr>
+            <w:tcW w:type="dxa" w:w="1296"/>
+          </w:tcPr>
+          <w:p>
+            <w:r/>
+            <w:r>
+              <w:rPr>
+                <w:b w:val="0"/>
+                <w:sz w:val="20"/>
+              </w:rPr>
+              <w:t>Settling time (1 LSB)</w:t>
+            </w:r>
+          </w:p>
+        </w:tc>
+        <w:tc>
+          <w:tcPr>
+            <w:tcW w:type="dxa" w:w="1296"/>
+          </w:tcPr>
+          <w:p>
+            <w:r/>
+            <w:r>
+              <w:rPr>
+                <w:b w:val="0"/>
+                <w:sz w:val="20"/>
+              </w:rPr>
+              <w:t>t_set_LSB</w:t>
+            </w:r>
+          </w:p>
+        </w:tc>
+        <w:tc>
+          <w:tcPr>
+            <w:tcW w:type="dxa" w:w="1296"/>
+          </w:tcPr>
+          <w:p>
+            <w:r/>
+            <w:r>
+              <w:rPr>
+                <w:b w:val="0"/>
+                <w:sz w:val="20"/>
+              </w:rPr>
+            </w:r>
+          </w:p>
+        </w:tc>
+        <w:tc>
+          <w:tcPr>
+            <w:tcW w:type="dxa" w:w="1296"/>
+          </w:tcPr>
+          <w:p>
+            <w:r/>
+            <w:r>
+              <w:rPr>
+                <w:b w:val="0"/>
+                <w:sz w:val="20"/>
+              </w:rPr>
+              <w:t>TBD</w:t>
+            </w:r>
+          </w:p>
+        </w:tc>
+        <w:tc>
+          <w:tcPr>
+            <w:tcW w:type="dxa" w:w="1296"/>
+          </w:tcPr>
+          <w:p>
+            <w:r/>
+            <w:r>
+              <w:rPr>
+                <w:b w:val="0"/>
+                <w:sz w:val="20"/>
+              </w:rPr>
+            </w:r>
+          </w:p>
+        </w:tc>
+        <w:tc>
+          <w:tcPr>
+            <w:tcW w:type="dxa" w:w="1296"/>
+          </w:tcPr>
+          <w:p>
+            <w:r/>
+            <w:r>
+              <w:rPr>
+                <w:b w:val="0"/>
+                <w:sz w:val="20"/>
+              </w:rPr>
+              <w:t>ps</w:t>
+            </w:r>
+          </w:p>
+        </w:tc>
+        <w:tc>
+          <w:tcPr>
+            <w:tcW w:type="dxa" w:w="1296"/>
+          </w:tcPr>
+          <w:p>
+            <w:r/>
+            <w:r>
+              <w:rPr>
+                <w:b w:val="0"/>
+                <w:sz w:val="20"/>
+              </w:rPr>
+              <w:t>To 2τ = 86.5% of final value</w:t>
+            </w:r>
+          </w:p>
+        </w:tc>
+      </w:tr>
+      <w:tr>
+        <w:tc>
+          <w:tcPr>
+            <w:tcW w:type="dxa" w:w="1296"/>
+          </w:tcPr>
+          <w:p>
+            <w:r/>
+            <w:r>
+              <w:rPr>
+                <w:b w:val="0"/>
+                <w:sz w:val="20"/>
+              </w:rPr>
+              <w:t>Settling time (full scale)</w:t>
+            </w:r>
+          </w:p>
+        </w:tc>
+        <w:tc>
+          <w:tcPr>
+            <w:tcW w:type="dxa" w:w="1296"/>
+          </w:tcPr>
+          <w:p>
+            <w:r/>
+            <w:r>
+              <w:rPr>
+                <w:b w:val="0"/>
+                <w:sz w:val="20"/>
+              </w:rPr>
+              <w:t>t_set_FS</w:t>
+            </w:r>
+          </w:p>
+        </w:tc>
+        <w:tc>
+          <w:tcPr>
+            <w:tcW w:type="dxa" w:w="1296"/>
+          </w:tcPr>
+          <w:p>
+            <w:r/>
+            <w:r>
+              <w:rPr>
+                <w:b w:val="0"/>
+                <w:sz w:val="20"/>
+              </w:rPr>
+            </w:r>
+          </w:p>
+        </w:tc>
+        <w:tc>
+          <w:tcPr>
+            <w:tcW w:type="dxa" w:w="1296"/>
+          </w:tcPr>
+          <w:p>
+            <w:r/>
+            <w:r>
+              <w:rPr>
+                <w:b w:val="0"/>
+                <w:sz w:val="20"/>
+              </w:rPr>
+              <w:t>TBD</w:t>
+            </w:r>
+          </w:p>
+        </w:tc>
+        <w:tc>
+          <w:tcPr>
+            <w:tcW w:type="dxa" w:w="1296"/>
+          </w:tcPr>
+          <w:p>
+            <w:r/>
+            <w:r>
+              <w:rPr>
+                <w:b w:val="0"/>
+                <w:sz w:val="20"/>
+              </w:rPr>
+            </w:r>
+          </w:p>
+        </w:tc>
+        <w:tc>
+          <w:tcPr>
+            <w:tcW w:type="dxa" w:w="1296"/>
+          </w:tcPr>
+          <w:p>
+            <w:r/>
+            <w:r>
+              <w:rPr>
+                <w:b w:val="0"/>
+                <w:sz w:val="20"/>
+              </w:rPr>
+              <w:t>ns</w:t>
+            </w:r>
+          </w:p>
+        </w:tc>
+        <w:tc>
+          <w:tcPr>
+            <w:tcW w:type="dxa" w:w="1296"/>
+          </w:tcPr>
+          <w:p>
+            <w:r/>
+            <w:r>
+              <w:rPr>
+                <w:b w:val="0"/>
+                <w:sz w:val="20"/>
+              </w:rPr>
+              <w:t>To 2τ = 86.5% of final value</w:t>
+            </w:r>
+          </w:p>
+        </w:tc>
+      </w:tr>
+      <w:tr>
+        <w:tc>
+          <w:tcPr>
+            <w:tcW w:type="dxa" w:w="1296"/>
+          </w:tcPr>
+          <w:p>
+            <w:r/>
+            <w:r>
+              <w:rPr>
+                <w:b w:val="0"/>
+                <w:sz w:val="20"/>
+              </w:rPr>
+              <w:t>Update rate (UP/DN)</w:t>
+            </w:r>
+          </w:p>
+        </w:tc>
+        <w:tc>
+          <w:tcPr>
+            <w:tcW w:type="dxa" w:w="1296"/>
+          </w:tcPr>
+          <w:p>
+            <w:r/>
+            <w:r>
+              <w:rPr>
+                <w:b w:val="0"/>
+                <w:sz w:val="20"/>
+              </w:rPr>
+              <w:t>f_update</w:t>
+            </w:r>
+          </w:p>
+        </w:tc>
+        <w:tc>
+          <w:tcPr>
+            <w:tcW w:type="dxa" w:w="1296"/>
+          </w:tcPr>
+          <w:p>
+            <w:r/>
+            <w:r>
+              <w:rPr>
+                <w:b w:val="0"/>
+                <w:sz w:val="20"/>
+              </w:rPr>
+            </w:r>
+          </w:p>
+        </w:tc>
+        <w:tc>
+          <w:tcPr>
+            <w:tcW w:type="dxa" w:w="1296"/>
+          </w:tcPr>
+          <w:p>
+            <w:r/>
+            <w:r>
+              <w:rPr>
+                <w:b w:val="0"/>
+                <w:sz w:val="20"/>
+              </w:rPr>
+              <w:t>TBD</w:t>
+            </w:r>
+          </w:p>
+        </w:tc>
+        <w:tc>
+          <w:tcPr>
+            <w:tcW w:type="dxa" w:w="1296"/>
+          </w:tcPr>
+          <w:p>
+            <w:r/>
+            <w:r>
+              <w:rPr>
+                <w:b w:val="0"/>
+                <w:sz w:val="20"/>
+              </w:rPr>
+            </w:r>
+          </w:p>
+        </w:tc>
+        <w:tc>
+          <w:tcPr>
+            <w:tcW w:type="dxa" w:w="1296"/>
+          </w:tcPr>
+          <w:p>
+            <w:r/>
+            <w:r>
+              <w:rPr>
+                <w:b w:val="0"/>
+                <w:sz w:val="20"/>
+              </w:rPr>
+              <w:t>GHz</w:t>
+            </w:r>
+          </w:p>
+        </w:tc>
+        <w:tc>
+          <w:tcPr>
+            <w:tcW w:type="dxa" w:w="1296"/>
+          </w:tcPr>
+          <w:p>
+            <w:r/>
+            <w:r>
+              <w:rPr>
+                <w:b w:val="0"/>
+                <w:sz w:val="20"/>
+              </w:rPr>
+              <w:t>How often the code can change. The DAC is fully thermometric: every UP/DN pulse turns exactly one unit on or off, so the output always moves by exactly 1 LSB. There is no binary-to-thermometer decoder, so no decode delay and no multi-bit switching. Max rate = 1 / (UP/DN-to-switch delay + 1-LSB settling to 2τ). A faster pulse arrives before the previous step has settled.</w:t>
+            </w:r>
+          </w:p>
+        </w:tc>
+      </w:tr>
+      <w:tr>
+        <w:tc>
+          <w:tcPr>
+            <w:tcW w:type="dxa" w:w="1296"/>
+          </w:tcPr>
+          <w:p>
+            <w:r/>
+            <w:r>
+              <w:rPr>
+                <w:b w:val="0"/>
+                <w:sz w:val="20"/>
+              </w:rPr>
+              <w:t>Glitch (1-LSB step)</w:t>
+            </w:r>
+          </w:p>
+        </w:tc>
+        <w:tc>
+          <w:tcPr>
+            <w:tcW w:type="dxa" w:w="1296"/>
+          </w:tcPr>
+          <w:p>
+            <w:r/>
+            <w:r>
+              <w:rPr>
+                <w:b w:val="0"/>
+                <w:sz w:val="20"/>
+              </w:rPr>
+              <w:t>G</w:t>
+            </w:r>
+          </w:p>
+        </w:tc>
+        <w:tc>
+          <w:tcPr>
+            <w:tcW w:type="dxa" w:w="1296"/>
+          </w:tcPr>
+          <w:p>
+            <w:r/>
+            <w:r>
+              <w:rPr>
+                <w:b w:val="0"/>
+                <w:sz w:val="20"/>
+              </w:rPr>
+            </w:r>
+          </w:p>
+        </w:tc>
+        <w:tc>
+          <w:tcPr>
+            <w:tcW w:type="dxa" w:w="1296"/>
+          </w:tcPr>
+          <w:p>
+            <w:r/>
+            <w:r>
+              <w:rPr>
+                <w:b w:val="0"/>
+                <w:sz w:val="20"/>
+              </w:rPr>
+              <w:t>TBD</w:t>
+            </w:r>
+          </w:p>
+        </w:tc>
+        <w:tc>
+          <w:tcPr>
+            <w:tcW w:type="dxa" w:w="1296"/>
+          </w:tcPr>
+          <w:p>
+            <w:r/>
+            <w:r>
+              <w:rPr>
+                <w:b w:val="0"/>
+                <w:sz w:val="20"/>
+              </w:rPr>
+            </w:r>
+          </w:p>
+        </w:tc>
+        <w:tc>
+          <w:tcPr>
+            <w:tcW w:type="dxa" w:w="1296"/>
+          </w:tcPr>
+          <w:p>
+            <w:r/>
+            <w:r>
+              <w:rPr>
+                <w:b w:val="0"/>
+                <w:sz w:val="20"/>
+              </w:rPr>
+              <w:t>mV·ps</w:t>
+            </w:r>
+          </w:p>
+        </w:tc>
+        <w:tc>
+          <w:tcPr>
+            <w:tcW w:type="dxa" w:w="1296"/>
+          </w:tcPr>
+          <w:p>
+            <w:r/>
+            <w:r>
+              <w:rPr>
+                <w:b w:val="0"/>
+                <w:sz w:val="20"/>
+              </w:rPr>
+              <w:t>Glitch energy = area (mV × ps) of the output error spike during a code step, caused by switch timing skew and clock/charge feed-through. In a binary DAC the worst glitch is at mid-code (many bits switch at once). Here only one unit switches per step, so the glitch is small and the same for every code. Measured on V_diff.</w:t>
+            </w:r>
+          </w:p>
+        </w:tc>
+      </w:tr>
+      <w:tr>
+        <w:tc>
+          <w:tcPr>
+            <w:tcW w:type="dxa" w:w="1296"/>
+          </w:tcPr>
+          <w:p>
+            <w:r/>
+            <w:r>
+              <w:rPr>
+                <w:b w:val="0"/>
+                <w:sz w:val="20"/>
+              </w:rPr>
+              <w:t>Output noise (integrated, diff)</w:t>
+            </w:r>
+          </w:p>
+        </w:tc>
+        <w:tc>
+          <w:tcPr>
+            <w:tcW w:type="dxa" w:w="1296"/>
+          </w:tcPr>
+          <w:p>
+            <w:r/>
+            <w:r>
+              <w:rPr>
+                <w:b w:val="0"/>
+                <w:sz w:val="20"/>
+              </w:rPr>
+              <w:t>V_n</w:t>
+            </w:r>
+          </w:p>
+        </w:tc>
+        <w:tc>
+          <w:tcPr>
+            <w:tcW w:type="dxa" w:w="1296"/>
+          </w:tcPr>
+          <w:p>
+            <w:r/>
+            <w:r>
+              <w:rPr>
+                <w:b w:val="0"/>
+                <w:sz w:val="20"/>
+              </w:rPr>
+            </w:r>
+          </w:p>
+        </w:tc>
+        <w:tc>
+          <w:tcPr>
+            <w:tcW w:type="dxa" w:w="1296"/>
+          </w:tcPr>
+          <w:p>
+            <w:r/>
+            <w:r>
+              <w:rPr>
+                <w:b w:val="0"/>
+                <w:sz w:val="20"/>
+              </w:rPr>
+              <w:t>TBD</w:t>
+            </w:r>
+          </w:p>
+        </w:tc>
+        <w:tc>
+          <w:tcPr>
+            <w:tcW w:type="dxa" w:w="1296"/>
+          </w:tcPr>
+          <w:p>
+            <w:r/>
+            <w:r>
+              <w:rPr>
+                <w:b w:val="0"/>
+                <w:sz w:val="20"/>
+              </w:rPr>
+            </w:r>
+          </w:p>
+        </w:tc>
+        <w:tc>
+          <w:tcPr>
+            <w:tcW w:type="dxa" w:w="1296"/>
+          </w:tcPr>
+          <w:p>
+            <w:r/>
+            <w:r>
+              <w:rPr>
+                <w:b w:val="0"/>
+                <w:sz w:val="20"/>
+              </w:rPr>
+              <w:t>µV_rms</w:t>
+            </w:r>
+          </w:p>
+        </w:tc>
+        <w:tc>
+          <w:tcPr>
+            <w:tcW w:type="dxa" w:w="1296"/>
+          </w:tcPr>
+          <w:p>
+            <w:r/>
+            <w:r>
+              <w:rPr>
+                <w:b w:val="0"/>
+                <w:sz w:val="20"/>
+              </w:rPr>
+              <w:t>Table to be provided</w:t>
+            </w:r>
+          </w:p>
+        </w:tc>
+      </w:tr>
+      <w:tr>
+        <w:tc>
+          <w:tcPr>
+            <w:tcW w:type="dxa" w:w="1296"/>
+          </w:tcPr>
+          <w:p>
+            <w:r/>
+            <w:r>
+              <w:rPr>
+                <w:b w:val="0"/>
+                <w:sz w:val="20"/>
+              </w:rPr>
+              <w:t>PSRR</w:t>
+            </w:r>
+          </w:p>
+        </w:tc>
+        <w:tc>
+          <w:tcPr>
+            <w:tcW w:type="dxa" w:w="1296"/>
+          </w:tcPr>
+          <w:p>
+            <w:r/>
+            <w:r>
+              <w:rPr>
+                <w:b w:val="0"/>
+                <w:sz w:val="20"/>
+              </w:rPr>
+              <w:t>PSRR</w:t>
+            </w:r>
+          </w:p>
+        </w:tc>
+        <w:tc>
+          <w:tcPr>
+            <w:tcW w:type="dxa" w:w="1296"/>
+          </w:tcPr>
+          <w:p>
+            <w:r/>
+            <w:r>
+              <w:rPr>
+                <w:b w:val="0"/>
+                <w:sz w:val="20"/>
+              </w:rPr>
+            </w:r>
+          </w:p>
+        </w:tc>
+        <w:tc>
+          <w:tcPr>
+            <w:tcW w:type="dxa" w:w="1296"/>
+          </w:tcPr>
+          <w:p>
+            <w:r/>
+            <w:r>
+              <w:rPr>
+                <w:b w:val="0"/>
+                <w:sz w:val="20"/>
+              </w:rPr>
+              <w:t>TBD</w:t>
+            </w:r>
+          </w:p>
+        </w:tc>
+        <w:tc>
+          <w:tcPr>
+            <w:tcW w:type="dxa" w:w="1296"/>
+          </w:tcPr>
+          <w:p>
+            <w:r/>
+            <w:r>
+              <w:rPr>
+                <w:b w:val="0"/>
+                <w:sz w:val="20"/>
+              </w:rPr>
+            </w:r>
+          </w:p>
+        </w:tc>
+        <w:tc>
+          <w:tcPr>
+            <w:tcW w:type="dxa" w:w="1296"/>
+          </w:tcPr>
+          <w:p>
+            <w:r/>
+            <w:r>
+              <w:rPr>
+                <w:b w:val="0"/>
+                <w:sz w:val="20"/>
+              </w:rPr>
+              <w:t>dB</w:t>
+            </w:r>
+          </w:p>
+        </w:tc>
+        <w:tc>
+          <w:tcPr>
+            <w:tcW w:type="dxa" w:w="1296"/>
+          </w:tcPr>
+          <w:p>
+            <w:r/>
+            <w:r>
+              <w:rPr>
+                <w:b w:val="0"/>
+                <w:sz w:val="20"/>
+              </w:rPr>
+              <w:t>Report only</w:t>
+            </w:r>
+          </w:p>
+        </w:tc>
+      </w:tr>
+    </w:tbl>
+    <w:p/>
+    <w:p>
+      <w:pPr>
+        <w:pStyle w:val="Heading2"/>
+      </w:pPr>
+      <w:r>
+        <w:t>4.3 INL and DNL Definitions</w:t>
       </w:r>
     </w:p>
     <w:p>
@@ -4091,7 +4305,7 @@
         <w:pStyle w:val="Heading3"/>
       </w:pPr>
       <w:r>
-        <w:t>4.2.1 DNL (Differential Non-Linearity)</w:t>
+        <w:t>4.3.1 DNL (Differential Non-Linearity)</w:t>
       </w:r>
     </w:p>
     <w:p>
@@ -4127,7 +4341,7 @@
         <w:pStyle w:val="Heading3"/>
       </w:pPr>
       <w:r>
-        <w:t>4.2.2 INL (Integral Non-Linearity)</w:t>
+        <w:t>4.3.2 INL (Integral Non-Linearity)</w:t>
       </w:r>
     </w:p>
     <w:p>
@@ -4152,7 +4366,7 @@
         <w:pStyle w:val="Heading3"/>
       </w:pPr>
       <w:r>
-        <w:t>4.2.3 Differential DAC: Finite Rout Effect</w:t>
+        <w:t>4.3.3 Differential DAC: Finite Rout Effect</w:t>
       </w:r>
     </w:p>
     <w:p>
@@ -4177,7 +4391,7 @@
         <w:pStyle w:val="Heading3"/>
       </w:pPr>
       <w:r>
-        <w:t>4.2.4 Mismatch-Limited DNL (Statistical)</w:t>
+        <w:t>4.3.4 Mismatch-Limited DNL (Statistical)</w:t>
       </w:r>
     </w:p>
     <w:p>
@@ -4202,7 +4416,7 @@
         <w:pStyle w:val="Heading2"/>
       </w:pPr>
       <w:r>
-        <w:t>4.3 Noise Budget</w:t>
+        <w:t>4.4 Noise Budget</w:t>
       </w:r>
     </w:p>
     <w:p>
@@ -4215,7 +4429,7 @@
         <w:pStyle w:val="Heading2"/>
       </w:pPr>
       <w:r>
-        <w:t>4.4 Power Budget</w:t>
+        <w:t>4.5 Power Budget</w:t>
       </w:r>
     </w:p>
     <w:p>

</xml_diff>

<commit_message>
Spec v0.7: regenerate docx
Co-Authored-By: Claude Opus 5.5 <noreply@anthropic.com>
</commit_message>
<xml_diff>
--- a/doc/HYP_Gen1_CDR_DAC_Spec.docx
+++ b/doc/HYP_Gen1_CDR_DAC_Spec.docx
@@ -129,7 +129,7 @@
                 <w:b w:val="0"/>
                 <w:sz w:val="22"/>
               </w:rPr>
-              <w:t>0.6 (Draft)</w:t>
+              <w:t>0.7 (Draft)</w:t>
             </w:r>
           </w:p>
         </w:tc>
@@ -161,7 +161,7 @@
                 <w:b w:val="0"/>
                 <w:sz w:val="22"/>
               </w:rPr>
-              <w:t>2026-10-19</w:t>
+              <w:t>2026-10-21</w:t>
             </w:r>
           </w:p>
         </w:tc>
@@ -691,6 +691,68 @@
                 <w:sz w:val="20"/>
               </w:rPr>
               <w:t>Spec table split into Definitions (4.1) and Results (4.2); R_L ±20%</w:t>
+            </w:r>
+          </w:p>
+        </w:tc>
+      </w:tr>
+      <w:tr>
+        <w:tc>
+          <w:tcPr>
+            <w:tcW w:type="dxa" w:w="2268"/>
+          </w:tcPr>
+          <w:p>
+            <w:r/>
+            <w:r>
+              <w:rPr>
+                <w:b w:val="0"/>
+                <w:sz w:val="20"/>
+              </w:rPr>
+              <w:t>0.7</w:t>
+            </w:r>
+          </w:p>
+        </w:tc>
+        <w:tc>
+          <w:tcPr>
+            <w:tcW w:type="dxa" w:w="2268"/>
+          </w:tcPr>
+          <w:p>
+            <w:r/>
+            <w:r>
+              <w:rPr>
+                <w:b w:val="0"/>
+                <w:sz w:val="20"/>
+              </w:rPr>
+              <w:t>2026-10-21</w:t>
+            </w:r>
+          </w:p>
+        </w:tc>
+        <w:tc>
+          <w:tcPr>
+            <w:tcW w:type="dxa" w:w="2268"/>
+          </w:tcPr>
+          <w:p>
+            <w:r/>
+            <w:r>
+              <w:rPr>
+                <w:b w:val="0"/>
+                <w:sz w:val="20"/>
+              </w:rPr>
+              <w:t>[Author]</w:t>
+            </w:r>
+          </w:p>
+        </w:tc>
+        <w:tc>
+          <w:tcPr>
+            <w:tcW w:type="dxa" w:w="2268"/>
+          </w:tcPr>
+          <w:p>
+            <w:r/>
+            <w:r>
+              <w:rPr>
+                <w:b w:val="0"/>
+                <w:sz w:val="20"/>
+              </w:rPr>
+              <w:t>256 units (4 sub-sources each), 257 levels, LSB 3.906 mV; V_FS ±5%; removed I_FS/I_LSB, gain error, full-scale settling; added input clock 1 GHz max</w:t>
             </w:r>
           </w:p>
         </w:tc>
@@ -1395,9 +1457,9 @@
       <w:r>
         <w:t>Topology: 8-bit fully thermometric, differential current-steering DAC.</w:t>
         <w:br/>
-        <w:t>Number of unit elements: N = 2^8 - 1 = 255 unit current sources.</w:t>
+        <w:t>Number of unit elements: N = 256 unit current sources (each unit = 4 sub-sources).</w:t>
         <w:br/>
-        <w:t>Number of codes: 256 (0 … 255).</w:t>
+        <w:t>Number of levels: 257 (code 0 … 256).</w:t>
       </w:r>
     </w:p>
     <w:p>
@@ -1727,7 +1789,7 @@
                 <w:b w:val="0"/>
                 <w:sz w:val="20"/>
               </w:rPr>
-              <w:t>Number of codes</w:t>
+              <w:t>Unit current sources</w:t>
             </w:r>
           </w:p>
         </w:tc>
@@ -1742,6 +1804,21 @@
                 <w:b w:val="0"/>
                 <w:sz w:val="20"/>
               </w:rPr>
+              <w:t>N</w:t>
+            </w:r>
+          </w:p>
+        </w:tc>
+        <w:tc>
+          <w:tcPr>
+            <w:tcW w:type="dxa" w:w="1296"/>
+          </w:tcPr>
+          <w:p>
+            <w:r/>
+            <w:r>
+              <w:rPr>
+                <w:b w:val="0"/>
+                <w:sz w:val="20"/>
+              </w:rPr>
               <w:t>—</w:t>
             </w:r>
           </w:p>
@@ -1757,6 +1834,21 @@
                 <w:b w:val="0"/>
                 <w:sz w:val="20"/>
               </w:rPr>
+              <w:t>256</w:t>
+            </w:r>
+          </w:p>
+        </w:tc>
+        <w:tc>
+          <w:tcPr>
+            <w:tcW w:type="dxa" w:w="1296"/>
+          </w:tcPr>
+          <w:p>
+            <w:r/>
+            <w:r>
+              <w:rPr>
+                <w:b w:val="0"/>
+                <w:sz w:val="20"/>
+              </w:rPr>
               <w:t>—</w:t>
             </w:r>
           </w:p>
@@ -1772,7 +1864,7 @@
                 <w:b w:val="0"/>
                 <w:sz w:val="20"/>
               </w:rPr>
-              <w:t>256</w:t>
+              <w:t>—</w:t>
             </w:r>
           </w:p>
         </w:tc>
@@ -1787,37 +1879,7 @@
                 <w:b w:val="0"/>
                 <w:sz w:val="20"/>
               </w:rPr>
-              <w:t>—</w:t>
-            </w:r>
-          </w:p>
-        </w:tc>
-        <w:tc>
-          <w:tcPr>
-            <w:tcW w:type="dxa" w:w="1296"/>
-          </w:tcPr>
-          <w:p>
-            <w:r/>
-            <w:r>
-              <w:rPr>
-                <w:b w:val="0"/>
-                <w:sz w:val="20"/>
-              </w:rPr>
-              <w:t>—</w:t>
-            </w:r>
-          </w:p>
-        </w:tc>
-        <w:tc>
-          <w:tcPr>
-            <w:tcW w:type="dxa" w:w="1296"/>
-          </w:tcPr>
-          <w:p>
-            <w:r/>
-            <w:r>
-              <w:rPr>
-                <w:b w:val="0"/>
-                <w:sz w:val="20"/>
-              </w:rPr>
-              <w:t>0 … 255 (255 unit steps)</w:t>
+              <w:t>Each unit = 4 sub-sources</w:t>
             </w:r>
           </w:p>
         </w:tc>
@@ -1834,7 +1896,7 @@
                 <w:b w:val="0"/>
                 <w:sz w:val="20"/>
               </w:rPr>
-              <w:t>Supply voltage (high)</w:t>
+              <w:t>Number of levels</w:t>
             </w:r>
           </w:p>
         </w:tc>
@@ -1849,7 +1911,7 @@
                 <w:b w:val="0"/>
                 <w:sz w:val="20"/>
               </w:rPr>
-              <w:t>VDD_1V2</w:t>
+              <w:t>—</w:t>
             </w:r>
           </w:p>
         </w:tc>
@@ -1864,7 +1926,7 @@
                 <w:b w:val="0"/>
                 <w:sz w:val="20"/>
               </w:rPr>
-              <w:t>1.14</w:t>
+              <w:t>—</w:t>
             </w:r>
           </w:p>
         </w:tc>
@@ -1879,7 +1941,7 @@
                 <w:b w:val="0"/>
                 <w:sz w:val="20"/>
               </w:rPr>
-              <w:t>1.20</w:t>
+              <w:t>257</w:t>
             </w:r>
           </w:p>
         </w:tc>
@@ -1894,7 +1956,7 @@
                 <w:b w:val="0"/>
                 <w:sz w:val="20"/>
               </w:rPr>
-              <w:t>1.26</w:t>
+              <w:t>—</w:t>
             </w:r>
           </w:p>
         </w:tc>
@@ -1909,7 +1971,7 @@
                 <w:b w:val="0"/>
                 <w:sz w:val="20"/>
               </w:rPr>
-              <w:t>V</w:t>
+              <w:t>—</w:t>
             </w:r>
           </w:p>
         </w:tc>
@@ -1924,6 +1986,7 @@
                 <w:b w:val="0"/>
                 <w:sz w:val="20"/>
               </w:rPr>
+              <w:t>Code 0 … 256 (256 unit steps)</w:t>
             </w:r>
           </w:p>
         </w:tc>
@@ -1940,7 +2003,7 @@
                 <w:b w:val="0"/>
                 <w:sz w:val="20"/>
               </w:rPr>
-              <w:t>Supply voltage (low)</w:t>
+              <w:t>Input clock</w:t>
             </w:r>
           </w:p>
         </w:tc>
@@ -1955,7 +2018,7 @@
                 <w:b w:val="0"/>
                 <w:sz w:val="20"/>
               </w:rPr>
-              <w:t>VDD_0V9</w:t>
+              <w:t>f_CLK</w:t>
             </w:r>
           </w:p>
         </w:tc>
@@ -1970,7 +2033,6 @@
                 <w:b w:val="0"/>
                 <w:sz w:val="20"/>
               </w:rPr>
-              <w:t>0.85</w:t>
             </w:r>
           </w:p>
         </w:tc>
@@ -1985,7 +2047,6 @@
                 <w:b w:val="0"/>
                 <w:sz w:val="20"/>
               </w:rPr>
-              <w:t>0.90</w:t>
             </w:r>
           </w:p>
         </w:tc>
@@ -2000,7 +2061,7 @@
                 <w:b w:val="0"/>
                 <w:sz w:val="20"/>
               </w:rPr>
-              <w:t>0.95</w:t>
+              <w:t>1</w:t>
             </w:r>
           </w:p>
         </w:tc>
@@ -2015,7 +2076,7 @@
                 <w:b w:val="0"/>
                 <w:sz w:val="20"/>
               </w:rPr>
-              <w:t>V</w:t>
+              <w:t>GHz</w:t>
             </w:r>
           </w:p>
         </w:tc>
@@ -2046,7 +2107,7 @@
                 <w:b w:val="0"/>
                 <w:sz w:val="20"/>
               </w:rPr>
-              <w:t>Temperature</w:t>
+              <w:t>Supply voltage (high)</w:t>
             </w:r>
           </w:p>
         </w:tc>
@@ -2061,7 +2122,7 @@
                 <w:b w:val="0"/>
                 <w:sz w:val="20"/>
               </w:rPr>
-              <w:t>T</w:t>
+              <w:t>VDD_1V2</w:t>
             </w:r>
           </w:p>
         </w:tc>
@@ -2076,7 +2137,7 @@
                 <w:b w:val="0"/>
                 <w:sz w:val="20"/>
               </w:rPr>
-              <w:t>-10</w:t>
+              <w:t>1.14</w:t>
             </w:r>
           </w:p>
         </w:tc>
@@ -2091,7 +2152,7 @@
                 <w:b w:val="0"/>
                 <w:sz w:val="20"/>
               </w:rPr>
-              <w:t>50 / 85</w:t>
+              <w:t>1.20</w:t>
             </w:r>
           </w:p>
         </w:tc>
@@ -2106,7 +2167,7 @@
                 <w:b w:val="0"/>
                 <w:sz w:val="20"/>
               </w:rPr>
-              <w:t>110</w:t>
+              <w:t>1.26</w:t>
             </w:r>
           </w:p>
         </w:tc>
@@ -2121,7 +2182,7 @@
                 <w:b w:val="0"/>
                 <w:sz w:val="20"/>
               </w:rPr>
-              <w:t>°C</w:t>
+              <w:t>V</w:t>
             </w:r>
           </w:p>
         </w:tc>
@@ -2136,7 +2197,6 @@
                 <w:b w:val="0"/>
                 <w:sz w:val="20"/>
               </w:rPr>
-              <w:t>Typ: 50 and 85 (most likely both)</w:t>
             </w:r>
           </w:p>
         </w:tc>
@@ -2153,7 +2213,7 @@
                 <w:b w:val="0"/>
                 <w:sz w:val="20"/>
               </w:rPr>
-              <w:t>Load resistance</w:t>
+              <w:t>Supply voltage (low)</w:t>
             </w:r>
           </w:p>
         </w:tc>
@@ -2168,7 +2228,7 @@
                 <w:b w:val="0"/>
                 <w:sz w:val="20"/>
               </w:rPr>
-              <w:t>R_L</w:t>
+              <w:t>VDD_0V9</w:t>
             </w:r>
           </w:p>
         </w:tc>
@@ -2183,7 +2243,7 @@
                 <w:b w:val="0"/>
                 <w:sz w:val="20"/>
               </w:rPr>
-              <w:t>40</w:t>
+              <w:t>0.85</w:t>
             </w:r>
           </w:p>
         </w:tc>
@@ -2198,7 +2258,7 @@
                 <w:b w:val="0"/>
                 <w:sz w:val="20"/>
               </w:rPr>
-              <w:t>50</w:t>
+              <w:t>0.90</w:t>
             </w:r>
           </w:p>
         </w:tc>
@@ -2213,7 +2273,7 @@
                 <w:b w:val="0"/>
                 <w:sz w:val="20"/>
               </w:rPr>
-              <w:t>60</w:t>
+              <w:t>0.95</w:t>
             </w:r>
           </w:p>
         </w:tc>
@@ -2228,7 +2288,7 @@
                 <w:b w:val="0"/>
                 <w:sz w:val="20"/>
               </w:rPr>
-              <w:t>Ω</w:t>
+              <w:t>V</w:t>
             </w:r>
           </w:p>
         </w:tc>
@@ -2243,7 +2303,6 @@
                 <w:b w:val="0"/>
                 <w:sz w:val="20"/>
               </w:rPr>
-              <w:t>Per side; ±20% variation</w:t>
             </w:r>
           </w:p>
         </w:tc>
@@ -2260,7 +2319,7 @@
                 <w:b w:val="0"/>
                 <w:sz w:val="20"/>
               </w:rPr>
-              <w:t>Load capacitance</w:t>
+              <w:t>Temperature</w:t>
             </w:r>
           </w:p>
         </w:tc>
@@ -2275,7 +2334,7 @@
                 <w:b w:val="0"/>
                 <w:sz w:val="20"/>
               </w:rPr>
-              <w:t>C_L</w:t>
+              <w:t>T</w:t>
             </w:r>
           </w:p>
         </w:tc>
@@ -2290,6 +2349,7 @@
                 <w:b w:val="0"/>
                 <w:sz w:val="20"/>
               </w:rPr>
+              <w:t>-10</w:t>
             </w:r>
           </w:p>
         </w:tc>
@@ -2304,7 +2364,7 @@
                 <w:b w:val="0"/>
                 <w:sz w:val="20"/>
               </w:rPr>
-              <w:t>TBD</w:t>
+              <w:t>50 / 85</w:t>
             </w:r>
           </w:p>
         </w:tc>
@@ -2319,6 +2379,7 @@
                 <w:b w:val="0"/>
                 <w:sz w:val="20"/>
               </w:rPr>
+              <w:t>110</w:t>
             </w:r>
           </w:p>
         </w:tc>
@@ -2333,7 +2394,7 @@
                 <w:b w:val="0"/>
                 <w:sz w:val="20"/>
               </w:rPr>
-              <w:t>fF</w:t>
+              <w:t>°C</w:t>
             </w:r>
           </w:p>
         </w:tc>
@@ -2348,7 +2409,7 @@
                 <w:b w:val="0"/>
                 <w:sz w:val="20"/>
               </w:rPr>
-              <w:t>VCO input – to be completed</w:t>
+              <w:t>Typ: 50 and 85 (most likely both)</w:t>
             </w:r>
           </w:p>
         </w:tc>
@@ -2365,7 +2426,7 @@
                 <w:b w:val="0"/>
                 <w:sz w:val="20"/>
               </w:rPr>
-              <w:t>Full-scale current</w:t>
+              <w:t>Load resistance</w:t>
             </w:r>
           </w:p>
         </w:tc>
@@ -2380,7 +2441,7 @@
                 <w:b w:val="0"/>
                 <w:sz w:val="20"/>
               </w:rPr>
-              <w:t>I_FS</w:t>
+              <w:t>R_L</w:t>
             </w:r>
           </w:p>
         </w:tc>
@@ -2395,6 +2456,7 @@
                 <w:b w:val="0"/>
                 <w:sz w:val="20"/>
               </w:rPr>
+              <w:t>40</w:t>
             </w:r>
           </w:p>
         </w:tc>
@@ -2409,7 +2471,7 @@
                 <w:b w:val="0"/>
                 <w:sz w:val="20"/>
               </w:rPr>
-              <w:t>10</w:t>
+              <w:t>50</w:t>
             </w:r>
           </w:p>
         </w:tc>
@@ -2424,6 +2486,7 @@
                 <w:b w:val="0"/>
                 <w:sz w:val="20"/>
               </w:rPr>
+              <w:t>60</w:t>
             </w:r>
           </w:p>
         </w:tc>
@@ -2438,7 +2501,7 @@
                 <w:b w:val="0"/>
                 <w:sz w:val="20"/>
               </w:rPr>
-              <w:t>mA</w:t>
+              <w:t>Ω</w:t>
             </w:r>
           </w:p>
         </w:tc>
@@ -2453,7 +2516,7 @@
                 <w:b w:val="0"/>
                 <w:sz w:val="20"/>
               </w:rPr>
-              <w:t>Internal spec; V_FS = 2·I_FS·R_L</w:t>
+              <w:t>Per side; ±20% variation. Current tracks R_L, so V_FS is constant</w:t>
             </w:r>
           </w:p>
         </w:tc>
@@ -2470,7 +2533,7 @@
                 <w:b w:val="0"/>
                 <w:sz w:val="20"/>
               </w:rPr>
-              <w:t>LSB (unit) current</w:t>
+              <w:t>Load capacitance</w:t>
             </w:r>
           </w:p>
         </w:tc>
@@ -2485,7 +2548,7 @@
                 <w:b w:val="0"/>
                 <w:sz w:val="20"/>
               </w:rPr>
-              <w:t>I_LSB</w:t>
+              <w:t>C_L</w:t>
             </w:r>
           </w:p>
         </w:tc>
@@ -2514,7 +2577,7 @@
                 <w:b w:val="0"/>
                 <w:sz w:val="20"/>
               </w:rPr>
-              <w:t>39.2</w:t>
+              <w:t>TBD</w:t>
             </w:r>
           </w:p>
         </w:tc>
@@ -2543,7 +2606,7 @@
                 <w:b w:val="0"/>
                 <w:sz w:val="20"/>
               </w:rPr>
-              <w:t>µA</w:t>
+              <w:t>fF</w:t>
             </w:r>
           </w:p>
         </w:tc>
@@ -2558,7 +2621,7 @@
                 <w:b w:val="0"/>
                 <w:sz w:val="20"/>
               </w:rPr>
-              <w:t>Internal spec; I_FS / 255</w:t>
+              <w:t>VCO input – to be completed</w:t>
             </w:r>
           </w:p>
         </w:tc>
@@ -2750,6 +2813,7 @@
                 <w:b w:val="0"/>
                 <w:sz w:val="20"/>
               </w:rPr>
+              <w:t>950</w:t>
             </w:r>
           </w:p>
         </w:tc>
@@ -2779,6 +2843,7 @@
                 <w:b w:val="0"/>
                 <w:sz w:val="20"/>
               </w:rPr>
+              <w:t>1050</w:t>
             </w:r>
           </w:p>
         </w:tc>
@@ -2808,7 +2873,7 @@
                 <w:b w:val="0"/>
                 <w:sz w:val="20"/>
               </w:rPr>
-              <w:t>Differential peak-to-peak (±500 mV)</w:t>
+              <w:t>±5% – self spec. Differential peak-to-peak</w:t>
             </w:r>
           </w:p>
         </w:tc>
@@ -2869,7 +2934,7 @@
                 <w:b w:val="0"/>
                 <w:sz w:val="20"/>
               </w:rPr>
-              <w:t>3.922</w:t>
+              <w:t>3.906</w:t>
             </w:r>
           </w:p>
         </w:tc>
@@ -2913,7 +2978,7 @@
                 <w:b w:val="0"/>
                 <w:sz w:val="20"/>
               </w:rPr>
-              <w:t>V_FS / 255</w:t>
+              <w:t>V_FS / 256</w:t>
             </w:r>
           </w:p>
         </w:tc>
@@ -3037,7 +3102,7 @@
                 <w:b w:val="0"/>
                 <w:sz w:val="20"/>
               </w:rPr>
-              <w:t>Full-scale (gain) error</w:t>
+              <w:t>DNL</w:t>
             </w:r>
           </w:p>
         </w:tc>
@@ -3052,7 +3117,7 @@
                 <w:b w:val="0"/>
                 <w:sz w:val="20"/>
               </w:rPr>
-              <w:t>GE</w:t>
+              <w:t>DNL</w:t>
             </w:r>
           </w:p>
         </w:tc>
@@ -3067,7 +3132,7 @@
                 <w:b w:val="0"/>
                 <w:sz w:val="20"/>
               </w:rPr>
-              <w:t>-5</w:t>
+              <w:t>-0.3</w:t>
             </w:r>
           </w:p>
         </w:tc>
@@ -3096,7 +3161,7 @@
                 <w:b w:val="0"/>
                 <w:sz w:val="20"/>
               </w:rPr>
-              <w:t>+5</w:t>
+              <w:t>+0.3</w:t>
             </w:r>
           </w:p>
         </w:tc>
@@ -3111,7 +3176,7 @@
                 <w:b w:val="0"/>
                 <w:sz w:val="20"/>
               </w:rPr>
-              <w:t>%</w:t>
+              <w:t>LSB</w:t>
             </w:r>
           </w:p>
         </w:tc>
@@ -3126,7 +3191,7 @@
                 <w:b w:val="0"/>
                 <w:sz w:val="20"/>
               </w:rPr>
-              <w:t>Self spec</w:t>
+              <w:t>Including VCO error</w:t>
             </w:r>
           </w:p>
         </w:tc>
@@ -3143,7 +3208,7 @@
                 <w:b w:val="0"/>
                 <w:sz w:val="20"/>
               </w:rPr>
-              <w:t>DNL</w:t>
+              <w:t>DNL budget – VCO share</w:t>
             </w:r>
           </w:p>
         </w:tc>
@@ -3158,7 +3223,7 @@
                 <w:b w:val="0"/>
                 <w:sz w:val="20"/>
               </w:rPr>
-              <w:t>DNL</w:t>
+              <w:t>DNL_VCO</w:t>
             </w:r>
           </w:p>
         </w:tc>
@@ -3173,7 +3238,6 @@
                 <w:b w:val="0"/>
                 <w:sz w:val="20"/>
               </w:rPr>
-              <w:t>-0.3</w:t>
             </w:r>
           </w:p>
         </w:tc>
@@ -3188,6 +3252,7 @@
                 <w:b w:val="0"/>
                 <w:sz w:val="20"/>
               </w:rPr>
+              <w:t>TBD</w:t>
             </w:r>
           </w:p>
         </w:tc>
@@ -3202,7 +3267,6 @@
                 <w:b w:val="0"/>
                 <w:sz w:val="20"/>
               </w:rPr>
-              <w:t>+0.3</w:t>
             </w:r>
           </w:p>
         </w:tc>
@@ -3232,7 +3296,7 @@
                 <w:b w:val="0"/>
                 <w:sz w:val="20"/>
               </w:rPr>
-              <w:t>Including VCO error</w:t>
+              <w:t>OPEN – part of the ±0.3 LSB, not known yet</w:t>
             </w:r>
           </w:p>
         </w:tc>
@@ -3249,7 +3313,7 @@
                 <w:b w:val="0"/>
                 <w:sz w:val="20"/>
               </w:rPr>
-              <w:t>DNL budget – VCO share</w:t>
+              <w:t>INL</w:t>
             </w:r>
           </w:p>
         </w:tc>
@@ -3264,7 +3328,7 @@
                 <w:b w:val="0"/>
                 <w:sz w:val="20"/>
               </w:rPr>
-              <w:t>DNL_VCO</w:t>
+              <w:t>INL</w:t>
             </w:r>
           </w:p>
         </w:tc>
@@ -3337,7 +3401,7 @@
                 <w:b w:val="0"/>
                 <w:sz w:val="20"/>
               </w:rPr>
-              <w:t>OPEN – part of the ±0.3 LSB, not known yet</w:t>
+              <w:t>Report only</w:t>
             </w:r>
           </w:p>
         </w:tc>
@@ -3354,7 +3418,7 @@
                 <w:b w:val="0"/>
                 <w:sz w:val="20"/>
               </w:rPr>
-              <w:t>INL</w:t>
+              <w:t>Power – 1.2 V supply</w:t>
             </w:r>
           </w:p>
         </w:tc>
@@ -3369,7 +3433,7 @@
                 <w:b w:val="0"/>
                 <w:sz w:val="20"/>
               </w:rPr>
-              <w:t>INL</w:t>
+              <w:t>P_1V2</w:t>
             </w:r>
           </w:p>
         </w:tc>
@@ -3427,7 +3491,7 @@
                 <w:b w:val="0"/>
                 <w:sz w:val="20"/>
               </w:rPr>
-              <w:t>LSB</w:t>
+              <w:t>mW</w:t>
             </w:r>
           </w:p>
         </w:tc>
@@ -3442,7 +3506,6 @@
                 <w:b w:val="0"/>
                 <w:sz w:val="20"/>
               </w:rPr>
-              <w:t>Report only</w:t>
             </w:r>
           </w:p>
         </w:tc>
@@ -3459,7 +3522,7 @@
                 <w:b w:val="0"/>
                 <w:sz w:val="20"/>
               </w:rPr>
-              <w:t>Power – 1.2 V supply</w:t>
+              <w:t>Power – 0.9 V supply</w:t>
             </w:r>
           </w:p>
         </w:tc>
@@ -3474,7 +3537,7 @@
                 <w:b w:val="0"/>
                 <w:sz w:val="20"/>
               </w:rPr>
-              <w:t>P_1V2</w:t>
+              <w:t>P_0V9</w:t>
             </w:r>
           </w:p>
         </w:tc>
@@ -3563,7 +3626,7 @@
                 <w:b w:val="0"/>
                 <w:sz w:val="20"/>
               </w:rPr>
-              <w:t>Power – 0.9 V supply</w:t>
+              <w:t>Settling time (1 LSB)</w:t>
             </w:r>
           </w:p>
         </w:tc>
@@ -3578,7 +3641,7 @@
                 <w:b w:val="0"/>
                 <w:sz w:val="20"/>
               </w:rPr>
-              <w:t>P_0V9</w:t>
+              <w:t>t_set_LSB</w:t>
             </w:r>
           </w:p>
         </w:tc>
@@ -3636,7 +3699,7 @@
                 <w:b w:val="0"/>
                 <w:sz w:val="20"/>
               </w:rPr>
-              <w:t>mW</w:t>
+              <w:t>ps</w:t>
             </w:r>
           </w:p>
         </w:tc>
@@ -3651,216 +3714,7 @@
                 <w:b w:val="0"/>
                 <w:sz w:val="20"/>
               </w:rPr>
-            </w:r>
-          </w:p>
-        </w:tc>
-      </w:tr>
-      <w:tr>
-        <w:tc>
-          <w:tcPr>
-            <w:tcW w:type="dxa" w:w="1296"/>
-          </w:tcPr>
-          <w:p>
-            <w:r/>
-            <w:r>
-              <w:rPr>
-                <w:b w:val="0"/>
-                <w:sz w:val="20"/>
-              </w:rPr>
-              <w:t>Settling time (1 LSB)</w:t>
-            </w:r>
-          </w:p>
-        </w:tc>
-        <w:tc>
-          <w:tcPr>
-            <w:tcW w:type="dxa" w:w="1296"/>
-          </w:tcPr>
-          <w:p>
-            <w:r/>
-            <w:r>
-              <w:rPr>
-                <w:b w:val="0"/>
-                <w:sz w:val="20"/>
-              </w:rPr>
-              <w:t>t_set_LSB</w:t>
-            </w:r>
-          </w:p>
-        </w:tc>
-        <w:tc>
-          <w:tcPr>
-            <w:tcW w:type="dxa" w:w="1296"/>
-          </w:tcPr>
-          <w:p>
-            <w:r/>
-            <w:r>
-              <w:rPr>
-                <w:b w:val="0"/>
-                <w:sz w:val="20"/>
-              </w:rPr>
-            </w:r>
-          </w:p>
-        </w:tc>
-        <w:tc>
-          <w:tcPr>
-            <w:tcW w:type="dxa" w:w="1296"/>
-          </w:tcPr>
-          <w:p>
-            <w:r/>
-            <w:r>
-              <w:rPr>
-                <w:b w:val="0"/>
-                <w:sz w:val="20"/>
-              </w:rPr>
-              <w:t>TBD</w:t>
-            </w:r>
-          </w:p>
-        </w:tc>
-        <w:tc>
-          <w:tcPr>
-            <w:tcW w:type="dxa" w:w="1296"/>
-          </w:tcPr>
-          <w:p>
-            <w:r/>
-            <w:r>
-              <w:rPr>
-                <w:b w:val="0"/>
-                <w:sz w:val="20"/>
-              </w:rPr>
-            </w:r>
-          </w:p>
-        </w:tc>
-        <w:tc>
-          <w:tcPr>
-            <w:tcW w:type="dxa" w:w="1296"/>
-          </w:tcPr>
-          <w:p>
-            <w:r/>
-            <w:r>
-              <w:rPr>
-                <w:b w:val="0"/>
-                <w:sz w:val="20"/>
-              </w:rPr>
-              <w:t>ps</w:t>
-            </w:r>
-          </w:p>
-        </w:tc>
-        <w:tc>
-          <w:tcPr>
-            <w:tcW w:type="dxa" w:w="1296"/>
-          </w:tcPr>
-          <w:p>
-            <w:r/>
-            <w:r>
-              <w:rPr>
-                <w:b w:val="0"/>
-                <w:sz w:val="20"/>
-              </w:rPr>
-              <w:t>To 2τ = 86.5% of final value</w:t>
-            </w:r>
-          </w:p>
-        </w:tc>
-      </w:tr>
-      <w:tr>
-        <w:tc>
-          <w:tcPr>
-            <w:tcW w:type="dxa" w:w="1296"/>
-          </w:tcPr>
-          <w:p>
-            <w:r/>
-            <w:r>
-              <w:rPr>
-                <w:b w:val="0"/>
-                <w:sz w:val="20"/>
-              </w:rPr>
-              <w:t>Settling time (full scale)</w:t>
-            </w:r>
-          </w:p>
-        </w:tc>
-        <w:tc>
-          <w:tcPr>
-            <w:tcW w:type="dxa" w:w="1296"/>
-          </w:tcPr>
-          <w:p>
-            <w:r/>
-            <w:r>
-              <w:rPr>
-                <w:b w:val="0"/>
-                <w:sz w:val="20"/>
-              </w:rPr>
-              <w:t>t_set_FS</w:t>
-            </w:r>
-          </w:p>
-        </w:tc>
-        <w:tc>
-          <w:tcPr>
-            <w:tcW w:type="dxa" w:w="1296"/>
-          </w:tcPr>
-          <w:p>
-            <w:r/>
-            <w:r>
-              <w:rPr>
-                <w:b w:val="0"/>
-                <w:sz w:val="20"/>
-              </w:rPr>
-            </w:r>
-          </w:p>
-        </w:tc>
-        <w:tc>
-          <w:tcPr>
-            <w:tcW w:type="dxa" w:w="1296"/>
-          </w:tcPr>
-          <w:p>
-            <w:r/>
-            <w:r>
-              <w:rPr>
-                <w:b w:val="0"/>
-                <w:sz w:val="20"/>
-              </w:rPr>
-              <w:t>TBD</w:t>
-            </w:r>
-          </w:p>
-        </w:tc>
-        <w:tc>
-          <w:tcPr>
-            <w:tcW w:type="dxa" w:w="1296"/>
-          </w:tcPr>
-          <w:p>
-            <w:r/>
-            <w:r>
-              <w:rPr>
-                <w:b w:val="0"/>
-                <w:sz w:val="20"/>
-              </w:rPr>
-            </w:r>
-          </w:p>
-        </w:tc>
-        <w:tc>
-          <w:tcPr>
-            <w:tcW w:type="dxa" w:w="1296"/>
-          </w:tcPr>
-          <w:p>
-            <w:r/>
-            <w:r>
-              <w:rPr>
-                <w:b w:val="0"/>
-                <w:sz w:val="20"/>
-              </w:rPr>
-              <w:t>ns</w:t>
-            </w:r>
-          </w:p>
-        </w:tc>
-        <w:tc>
-          <w:tcPr>
-            <w:tcW w:type="dxa" w:w="1296"/>
-          </w:tcPr>
-          <w:p>
-            <w:r/>
-            <w:r>
-              <w:rPr>
-                <w:b w:val="0"/>
-                <w:sz w:val="20"/>
-              </w:rPr>
-              <w:t>To 2τ = 86.5% of final value</w:t>
+              <w:t>To 2τ = 86.5% of final value. Only ±1 code steps, so no full-scale settling spec</w:t>
             </w:r>
           </w:p>
         </w:tc>
@@ -4297,7 +4151,7 @@
     </w:p>
     <w:p>
       <w:r>
-        <w:t>For a fully thermometric differential current-steering DAC with N = 2^B - 1 unit elements (B = 8, N = 255). All quantities are differential output voltages: V_diff = V_outp - V_outn, V_FS = 1000 mVpp, V_LSB = V_FS / 255 ≈ 3.922 mV.</w:t>
+        <w:t>For a fully thermometric differential current-steering DAC with N = 256 unit elements (257 levels, code 0 … 256). All quantities are differential output voltages: V_diff = V_outp - V_outn, V_FS = 1000 mVpp, V_LSB = V_FS / 256 ≈ 3.906 mV.</w:t>
       </w:r>
     </w:p>
     <w:p>
@@ -4465,7 +4319,7 @@
         <w:t>Reference system_questions.md Q1–Q9 for open decisions.]</w:t>
         <w:br/>
         <w:br/>
-        <w:t>CODE[7:0]: 8-bit code (256 codes, 0 … 255)</w:t>
+        <w:t>CODE[8:0]: code 0 … 256 (257 levels; 9 bits needed for readback)</w:t>
       </w:r>
     </w:p>
     <w:p>
@@ -4753,7 +4607,7 @@
                 <w:b w:val="0"/>
                 <w:sz w:val="20"/>
               </w:rPr>
-              <w:t>CODE[7:0]</w:t>
+              <w:t>CODE[8:0]</w:t>
             </w:r>
           </w:p>
         </w:tc>
@@ -4783,7 +4637,7 @@
                 <w:b w:val="0"/>
                 <w:sz w:val="20"/>
               </w:rPr>
-              <w:t>8</w:t>
+              <w:t>9</w:t>
             </w:r>
           </w:p>
         </w:tc>
@@ -4798,7 +4652,7 @@
                 <w:b w:val="0"/>
                 <w:sz w:val="20"/>
               </w:rPr>
-              <w:t>Current DAC code (optional readback)</w:t>
+              <w:t>Current DAC code 0 … 256 (optional readback)</w:t>
             </w:r>
           </w:p>
         </w:tc>
@@ -4976,7 +4830,7 @@
     </w:p>
     <w:p>
       <w:r>
-        <w:t>[Define behavior at code 0 and 255: clip, flag, or both.</w:t>
+        <w:t>[Define behavior at code 0 and 256: clip, flag, or both.</w:t>
         <w:br/>
         <w:t>Reference system_questions.md Q5.]</w:t>
       </w:r>
@@ -5152,7 +5006,7 @@
                 <w:b w:val="0"/>
                 <w:sz w:val="20"/>
               </w:rPr>
-              <w:t>Interface + decoder + switch</w:t>
+              <w:t>Interface + switch (no decoder)</w:t>
             </w:r>
           </w:p>
         </w:tc>
@@ -5259,67 +5113,6 @@
                 <w:sz w:val="20"/>
               </w:rPr>
               <w:t>ps</w:t>
-            </w:r>
-          </w:p>
-        </w:tc>
-        <w:tc>
-          <w:tcPr>
-            <w:tcW w:type="dxa" w:w="2268"/>
-          </w:tcPr>
-          <w:p>
-            <w:r/>
-            <w:r>
-              <w:rPr>
-                <w:b w:val="0"/>
-                <w:sz w:val="20"/>
-              </w:rPr>
-              <w:t>To 2τ (86.5%)</w:t>
-            </w:r>
-          </w:p>
-        </w:tc>
-      </w:tr>
-      <w:tr>
-        <w:tc>
-          <w:tcPr>
-            <w:tcW w:type="dxa" w:w="2268"/>
-          </w:tcPr>
-          <w:p>
-            <w:r/>
-            <w:r>
-              <w:rPr>
-                <w:b w:val="0"/>
-                <w:sz w:val="20"/>
-              </w:rPr>
-              <w:t>Full-scale settling (0 → 255)</w:t>
-            </w:r>
-          </w:p>
-        </w:tc>
-        <w:tc>
-          <w:tcPr>
-            <w:tcW w:type="dxa" w:w="2268"/>
-          </w:tcPr>
-          <w:p>
-            <w:r/>
-            <w:r>
-              <w:rPr>
-                <w:b w:val="0"/>
-                <w:sz w:val="20"/>
-              </w:rPr>
-            </w:r>
-          </w:p>
-        </w:tc>
-        <w:tc>
-          <w:tcPr>
-            <w:tcW w:type="dxa" w:w="2268"/>
-          </w:tcPr>
-          <w:p>
-            <w:r/>
-            <w:r>
-              <w:rPr>
-                <w:b w:val="0"/>
-                <w:sz w:val="20"/>
-              </w:rPr>
-              <w:t>ns</w:t>
             </w:r>
           </w:p>
         </w:tc>
@@ -5692,7 +5485,7 @@
                 <w:b w:val="0"/>
                 <w:sz w:val="20"/>
               </w:rPr>
-              <w:t>Codes 0 and 255, measure V_diff</w:t>
+              <w:t>Codes 0 and 256, measure V_diff</w:t>
             </w:r>
           </w:p>
         </w:tc>
@@ -6104,7 +5897,7 @@
                 <w:b w:val="0"/>
                 <w:sz w:val="20"/>
               </w:rPr>
-              <w:t>1 LSB and full-scale step</w:t>
+              <w:t>1 LSB step</w:t>
             </w:r>
           </w:p>
         </w:tc>

</xml_diff>